<commit_message>
Add customer short name for contract templates
Co-authored-by: Cursor <cursoragent@cursor.com>
</commit_message>
<xml_diff>
--- a/templates/customer_contract_template.docx
+++ b/templates/customer_contract_template.docx
@@ -57,7 +57,6 @@
         </w:rPr>
         <w:t xml:space="preserve">» </w:t>
       </w:r>
-      <w:proofErr w:type="gramStart"/>
       <w:r>
         <w:rPr>
           <w:rFonts w:ascii="Times New Roman" w:hAnsi="Times New Roman"/>
@@ -74,14 +73,7 @@
         <w:rPr>
           <w:rFonts w:ascii="Times New Roman" w:hAnsi="Times New Roman"/>
         </w:rPr>
-        <w:t xml:space="preserve">  2026</w:t>
-      </w:r>
-      <w:proofErr w:type="gramEnd"/>
-      <w:r>
-        <w:rPr>
-          <w:rFonts w:ascii="Times New Roman" w:hAnsi="Times New Roman"/>
-        </w:rPr>
-        <w:t xml:space="preserve"> г.</w:t>
+        <w:t xml:space="preserve">  2026 г.</w:t>
       </w:r>
     </w:p>
     <w:p>
@@ -226,13 +218,14 @@
       <w:pPr>
         <w:pStyle w:val="p1"/>
       </w:pPr>
+      <w:proofErr w:type="spellStart"/>
       <w:r>
         <w:rPr>
           <w:b/>
         </w:rPr>
         <w:t>Заказчик</w:t>
       </w:r>
-      <w:proofErr w:type="gramStart"/>
+      <w:proofErr w:type="spellEnd"/>
       <w:r>
         <w:rPr>
           <w:b/>
@@ -252,11 +245,7 @@
         <w:t> </w:t>
       </w:r>
       <w:r>
-        <w:t>{</w:t>
-      </w:r>
-      <w:proofErr w:type="gramEnd"/>
-      <w:r>
-        <w:t>{</w:t>
+        <w:t>{{</w:t>
       </w:r>
       <w:proofErr w:type="spellStart"/>
       <w:r>
@@ -280,10 +269,7 @@
       </w:r>
       <w:proofErr w:type="spellEnd"/>
       <w:r>
-        <w:t>}</w:t>
-      </w:r>
-      <w:r>
-        <w:t>}</w:t>
+        <w:t>}}</w:t>
       </w:r>
     </w:p>
     <w:p>
@@ -316,7 +302,6 @@
         <w:t>{{</w:t>
       </w:r>
       <w:proofErr w:type="spellStart"/>
-      <w:proofErr w:type="gramStart"/>
       <w:r>
         <w:rPr>
           <w:rFonts w:ascii="Times-Roman" w:hAnsi="Times-Roman" w:cs="Times-Roman"/>
@@ -345,7 +330,6 @@
         <w:t>passport</w:t>
       </w:r>
       <w:proofErr w:type="spellEnd"/>
-      <w:proofErr w:type="gramEnd"/>
       <w:r>
         <w:rPr>
           <w:rFonts w:ascii="Times-Roman" w:hAnsi="Times-Roman" w:cs="Times-Roman"/>
@@ -438,16 +422,76 @@
           <w:szCs w:val="24"/>
           <w:lang w:val="en-US"/>
         </w:rPr>
+        <w:t>}},</w:t>
+      </w:r>
+      <w:r>
+        <w:rPr>
+          <w:rFonts w:ascii="Times New Roman" w:hAnsi="Times New Roman"/>
+          <w:lang w:val="en-US"/>
+        </w:rPr>
+        <w:t xml:space="preserve"> </w:t>
+      </w:r>
+      <w:r>
+        <w:rPr>
+          <w:rFonts w:ascii="Times New Roman" w:hAnsi="Times New Roman"/>
+        </w:rPr>
+        <w:t>код</w:t>
+      </w:r>
+      <w:r>
+        <w:rPr>
+          <w:rFonts w:ascii="Times New Roman" w:hAnsi="Times New Roman"/>
+          <w:lang w:val="en-US"/>
+        </w:rPr>
+        <w:t xml:space="preserve"> </w:t>
+      </w:r>
+      <w:r>
+        <w:rPr>
+          <w:rFonts w:ascii="Times New Roman" w:hAnsi="Times New Roman"/>
+        </w:rPr>
+        <w:t>подразделения</w:t>
+      </w:r>
+      <w:r>
+        <w:rPr>
+          <w:rFonts w:ascii="Times New Roman" w:hAnsi="Times New Roman"/>
+          <w:lang w:val="en-US"/>
+        </w:rPr>
+        <w:t xml:space="preserve"> </w:t>
+      </w:r>
+      <w:r>
+        <w:rPr>
+          <w:rFonts w:ascii="Times-Roman" w:hAnsi="Times-Roman" w:cs="Times-Roman"/>
+          <w:color w:val="auto"/>
+          <w:szCs w:val="24"/>
+          <w:lang w:val="en-US"/>
+        </w:rPr>
+        <w:t>{{</w:t>
+      </w:r>
+      <w:proofErr w:type="spellStart"/>
+      <w:r>
+        <w:rPr>
+          <w:rFonts w:ascii="Times-Roman" w:hAnsi="Times-Roman" w:cs="Times-Roman"/>
+          <w:color w:val="auto"/>
+          <w:szCs w:val="24"/>
+          <w:lang w:val="en-US"/>
+        </w:rPr>
+        <w:t>customer.department_code</w:t>
+      </w:r>
+      <w:proofErr w:type="spellEnd"/>
+      <w:r>
+        <w:rPr>
+          <w:rFonts w:ascii="Times-Roman" w:hAnsi="Times-Roman" w:cs="Times-Roman"/>
+          <w:color w:val="auto"/>
+          <w:szCs w:val="24"/>
+          <w:lang w:val="en-US"/>
+        </w:rPr>
         <w:t>}}</w:t>
       </w:r>
       <w:r>
         <w:rPr>
-          <w:rFonts w:ascii="Times-Roman" w:hAnsi="Times-Roman" w:cs="Times-Roman"/>
-          <w:color w:val="auto"/>
-          <w:szCs w:val="24"/>
-          <w:lang w:val="en-US"/>
-        </w:rPr>
-        <w:t>,</w:t>
+          <w:rFonts w:ascii="Times New Roman" w:hAnsi="Times New Roman"/>
+          <w:lang w:val="en-US"/>
+        </w:rPr>
+        <w:t xml:space="preserve">: </w:t>
       </w:r>
       <w:r>
         <w:rPr>
@@ -460,7 +504,7 @@
         <w:rPr>
           <w:rFonts w:ascii="Times New Roman" w:hAnsi="Times New Roman"/>
         </w:rPr>
-        <w:t>код</w:t>
+        <w:t>Адрес</w:t>
       </w:r>
       <w:r>
         <w:rPr>
@@ -472,12 +516,89 @@
       <w:r>
         <w:rPr>
           <w:rFonts w:ascii="Times New Roman" w:hAnsi="Times New Roman"/>
-        </w:rPr>
-        <w:t>подразделения</w:t>
-      </w:r>
-      <w:r>
-        <w:rPr>
-          <w:rFonts w:ascii="Times New Roman" w:hAnsi="Times New Roman"/>
+          <w:color w:val="000000" w:themeColor="text1"/>
+        </w:rPr>
+        <w:t>регистрации</w:t>
+      </w:r>
+      <w:r>
+        <w:rPr>
+          <w:rFonts w:ascii="Times New Roman" w:hAnsi="Times New Roman"/>
+          <w:color w:val="000000" w:themeColor="text1"/>
+          <w:lang w:val="en-US"/>
+        </w:rPr>
+        <w:t xml:space="preserve">: </w:t>
+      </w:r>
+      <w:r>
+        <w:rPr>
+          <w:rFonts w:ascii="Times-Roman" w:hAnsi="Times-Roman" w:cs="Times-Roman"/>
+          <w:color w:val="auto"/>
+          <w:szCs w:val="24"/>
+          <w:lang w:val="en-US"/>
+        </w:rPr>
+        <w:t>{{</w:t>
+      </w:r>
+      <w:proofErr w:type="spellStart"/>
+      <w:r>
+        <w:rPr>
+          <w:rFonts w:ascii="Times-Roman" w:hAnsi="Times-Roman" w:cs="Times-Roman"/>
+          <w:color w:val="auto"/>
+          <w:szCs w:val="24"/>
+          <w:lang w:val="en-US"/>
+        </w:rPr>
+        <w:t>customer.registration_address</w:t>
+      </w:r>
+      <w:proofErr w:type="spellEnd"/>
+      <w:r>
+        <w:rPr>
+          <w:rFonts w:ascii="Times-Roman" w:hAnsi="Times-Roman" w:cs="Times-Roman"/>
+          <w:color w:val="auto"/>
+          <w:szCs w:val="24"/>
+          <w:lang w:val="en-US"/>
+        </w:rPr>
+        <w:t>}}</w:t>
+      </w:r>
+    </w:p>
+    <w:p>
+      <w:pPr>
+        <w:rPr>
+          <w:rFonts w:ascii="Times New Roman" w:hAnsi="Times New Roman"/>
+          <w:lang w:val="en-US"/>
+        </w:rPr>
+      </w:pPr>
+      <w:r>
+        <w:rPr>
+          <w:rFonts w:ascii="Times New Roman" w:hAnsi="Times New Roman"/>
+          <w:color w:val="000000" w:themeColor="text1"/>
+        </w:rPr>
+        <w:t>Контакты</w:t>
+      </w:r>
+      <w:r>
+        <w:rPr>
+          <w:rFonts w:ascii="Times New Roman" w:hAnsi="Times New Roman"/>
+          <w:color w:val="000000" w:themeColor="text1"/>
+          <w:lang w:val="en-US"/>
+        </w:rPr>
+        <w:t xml:space="preserve">: </w:t>
+      </w:r>
+      <w:r>
+        <w:rPr>
+          <w:rFonts w:ascii="Times New Roman" w:hAnsi="Times New Roman"/>
+          <w:color w:val="000000" w:themeColor="text1"/>
+        </w:rPr>
+        <w:t>тел</w:t>
+      </w:r>
+      <w:r>
+        <w:rPr>
+          <w:rFonts w:ascii="Times New Roman" w:hAnsi="Times New Roman"/>
+          <w:color w:val="000000" w:themeColor="text1"/>
+          <w:lang w:val="en-US"/>
+        </w:rPr>
+        <w:t>.</w:t>
+      </w:r>
+      <w:r>
+        <w:rPr>
+          <w:rFonts w:ascii="Times New Roman" w:hAnsi="Times New Roman"/>
+          <w:color w:val="000000" w:themeColor="text1"/>
           <w:lang w:val="en-US"/>
         </w:rPr>
         <w:t xml:space="preserve"> </w:t>
@@ -499,7 +620,7 @@
           <w:szCs w:val="24"/>
           <w:lang w:val="en-US"/>
         </w:rPr>
-        <w:t>customer.department_code</w:t>
+        <w:t>customer.phone</w:t>
       </w:r>
       <w:proofErr w:type="spellEnd"/>
       <w:r>
@@ -514,14 +635,134 @@
       <w:r>
         <w:rPr>
           <w:rFonts w:ascii="Times New Roman" w:hAnsi="Times New Roman"/>
+          <w:color w:val="000000" w:themeColor="text1"/>
+          <w:lang w:val="en-US"/>
+        </w:rPr>
+        <w:t xml:space="preserve">, </w:t>
+      </w:r>
+      <w:r>
+        <w:rPr>
+          <w:rFonts w:ascii="Times New Roman" w:hAnsi="Times New Roman"/>
+          <w:color w:val="000000" w:themeColor="text1"/>
+          <w:lang w:val="en-US"/>
+        </w:rPr>
+        <w:t>e</w:t>
+      </w:r>
+      <w:r>
+        <w:rPr>
+          <w:rFonts w:ascii="Times New Roman" w:hAnsi="Times New Roman"/>
+          <w:color w:val="000000" w:themeColor="text1"/>
+          <w:lang w:val="en-US"/>
+        </w:rPr>
+        <w:t>-</w:t>
+      </w:r>
+      <w:r>
+        <w:rPr>
+          <w:rFonts w:ascii="Times New Roman" w:hAnsi="Times New Roman"/>
+          <w:color w:val="000000" w:themeColor="text1"/>
+          <w:lang w:val="en-US"/>
+        </w:rPr>
+        <w:t>mail</w:t>
+      </w:r>
+      <w:r>
+        <w:rPr>
+          <w:rFonts w:ascii="Times New Roman" w:hAnsi="Times New Roman"/>
+          <w:color w:val="000000" w:themeColor="text1"/>
           <w:lang w:val="en-US"/>
         </w:rPr>
         <w:t xml:space="preserve">: </w:t>
       </w:r>
       <w:r>
         <w:rPr>
-          <w:rFonts w:ascii="Times New Roman" w:hAnsi="Times New Roman"/>
-          <w:lang w:val="en-US"/>
+          <w:rFonts w:ascii="Times-Roman" w:hAnsi="Times-Roman" w:cs="Times-Roman"/>
+          <w:color w:val="auto"/>
+          <w:szCs w:val="24"/>
+          <w:lang w:val="en-US"/>
+        </w:rPr>
+        <w:t>{{</w:t>
+      </w:r>
+      <w:proofErr w:type="spellStart"/>
+      <w:r>
+        <w:rPr>
+          <w:rFonts w:ascii="Times-Roman" w:hAnsi="Times-Roman" w:cs="Times-Roman"/>
+          <w:color w:val="auto"/>
+          <w:szCs w:val="24"/>
+          <w:lang w:val="en-US"/>
+        </w:rPr>
+        <w:t>customer.email</w:t>
+      </w:r>
+      <w:proofErr w:type="spellEnd"/>
+      <w:r>
+        <w:rPr>
+          <w:rFonts w:ascii="Times-Roman" w:hAnsi="Times-Roman" w:cs="Times-Roman"/>
+          <w:color w:val="auto"/>
+          <w:szCs w:val="24"/>
+          <w:lang w:val="en-US"/>
+        </w:rPr>
+        <w:t>}}</w:t>
+      </w:r>
+    </w:p>
+    <w:p>
+      <w:pPr>
+        <w:rPr>
+          <w:rFonts w:ascii="Times New Roman" w:hAnsi="Times New Roman"/>
+          <w:lang w:val="en-US"/>
+        </w:rPr>
+      </w:pPr>
+    </w:p>
+    <w:p>
+      <w:pPr>
+        <w:rPr>
+          <w:rFonts w:ascii="Times New Roman" w:hAnsi="Times New Roman"/>
+        </w:rPr>
+      </w:pPr>
+      <w:r>
+        <w:rPr>
+          <w:rFonts w:ascii="Times New Roman" w:hAnsi="Times New Roman"/>
+          <w:b/>
+        </w:rPr>
+        <w:t>Стороны заключили договор о нижеследующем:</w:t>
+      </w:r>
+    </w:p>
+    <w:p>
+      <w:pPr>
+        <w:rPr>
+          <w:rFonts w:ascii="Times New Roman" w:hAnsi="Times New Roman"/>
+        </w:rPr>
+      </w:pPr>
+    </w:p>
+    <w:p>
+      <w:pPr>
+        <w:rPr>
+          <w:rFonts w:ascii="Times New Roman" w:hAnsi="Times New Roman"/>
+          <w:b/>
+        </w:rPr>
+      </w:pPr>
+      <w:r>
+        <w:rPr>
+          <w:rFonts w:ascii="Times New Roman" w:hAnsi="Times New Roman"/>
+          <w:b/>
+        </w:rPr>
+        <w:t>1. ПРЕДМЕТ ДОГОВОРА</w:t>
+      </w:r>
+    </w:p>
+    <w:p>
+      <w:pPr>
+        <w:rPr>
+          <w:rFonts w:ascii="Times New Roman" w:hAnsi="Times New Roman"/>
+        </w:rPr>
+      </w:pPr>
+      <w:bookmarkStart w:id="0" w:name="OLE_LINK4"/>
+      <w:bookmarkStart w:id="1" w:name="OLE_LINK3"/>
+      <w:r>
+        <w:rPr>
+          <w:rFonts w:ascii="Times New Roman" w:hAnsi="Times New Roman"/>
+        </w:rPr>
+        <w:t>1.1. Исполнитель обязуется оказать услуги по поиску  автомобиля</w:t>
+      </w:r>
+      <w:r>
+        <w:rPr>
+          <w:rFonts w:ascii="Times New Roman" w:hAnsi="Times New Roman"/>
         </w:rPr>
         <w:t xml:space="preserve"> </w:t>
       </w:r>
@@ -529,276 +770,6 @@
         <w:rPr>
           <w:rFonts w:ascii="Times New Roman" w:hAnsi="Times New Roman"/>
         </w:rPr>
-        <w:t>Адрес</w:t>
-      </w:r>
-      <w:r>
-        <w:rPr>
-          <w:rFonts w:ascii="Times New Roman" w:hAnsi="Times New Roman"/>
-          <w:lang w:val="en-US"/>
-        </w:rPr>
-        <w:t xml:space="preserve"> </w:t>
-      </w:r>
-      <w:r>
-        <w:rPr>
-          <w:rFonts w:ascii="Times New Roman" w:hAnsi="Times New Roman"/>
-          <w:color w:val="000000" w:themeColor="text1"/>
-        </w:rPr>
-        <w:t>регистрации</w:t>
-      </w:r>
-      <w:r>
-        <w:rPr>
-          <w:rFonts w:ascii="Times New Roman" w:hAnsi="Times New Roman"/>
-          <w:color w:val="000000" w:themeColor="text1"/>
-          <w:lang w:val="en-US"/>
-        </w:rPr>
-        <w:t xml:space="preserve">: </w:t>
-      </w:r>
-      <w:r>
-        <w:rPr>
-          <w:rFonts w:ascii="Times-Roman" w:hAnsi="Times-Roman" w:cs="Times-Roman"/>
-          <w:color w:val="auto"/>
-          <w:szCs w:val="24"/>
-          <w:lang w:val="en-US"/>
-        </w:rPr>
-        <w:t>{{</w:t>
-      </w:r>
-      <w:proofErr w:type="spellStart"/>
-      <w:r>
-        <w:rPr>
-          <w:rFonts w:ascii="Times-Roman" w:hAnsi="Times-Roman" w:cs="Times-Roman"/>
-          <w:color w:val="auto"/>
-          <w:szCs w:val="24"/>
-          <w:lang w:val="en-US"/>
-        </w:rPr>
-        <w:t>customer.registration_address</w:t>
-      </w:r>
-      <w:proofErr w:type="spellEnd"/>
-      <w:r>
-        <w:rPr>
-          <w:rFonts w:ascii="Times-Roman" w:hAnsi="Times-Roman" w:cs="Times-Roman"/>
-          <w:color w:val="auto"/>
-          <w:szCs w:val="24"/>
-          <w:lang w:val="en-US"/>
-        </w:rPr>
-        <w:t>}}</w:t>
-      </w:r>
-    </w:p>
-    <w:p>
-      <w:pPr>
-        <w:rPr>
-          <w:rFonts w:ascii="Times New Roman" w:hAnsi="Times New Roman"/>
-          <w:lang w:val="en-US"/>
-        </w:rPr>
-      </w:pPr>
-      <w:r>
-        <w:rPr>
-          <w:rFonts w:ascii="Times New Roman" w:hAnsi="Times New Roman"/>
-          <w:color w:val="000000" w:themeColor="text1"/>
-        </w:rPr>
-        <w:t>Контакты: тел.</w:t>
-      </w:r>
-      <w:r>
-        <w:rPr>
-          <w:rFonts w:ascii="Times New Roman" w:hAnsi="Times New Roman"/>
-          <w:color w:val="000000" w:themeColor="text1"/>
-        </w:rPr>
-        <w:t xml:space="preserve"> </w:t>
-      </w:r>
-      <w:r>
-        <w:rPr>
-          <w:rFonts w:ascii="Times-Roman" w:hAnsi="Times-Roman" w:cs="Times-Roman"/>
-          <w:color w:val="auto"/>
-          <w:szCs w:val="24"/>
-          <w:lang w:val="en-US"/>
-        </w:rPr>
-        <w:t>{{</w:t>
-      </w:r>
-      <w:proofErr w:type="spellStart"/>
-      <w:proofErr w:type="gramStart"/>
-      <w:r>
-        <w:rPr>
-          <w:rFonts w:ascii="Times-Roman" w:hAnsi="Times-Roman" w:cs="Times-Roman"/>
-          <w:color w:val="auto"/>
-          <w:szCs w:val="24"/>
-          <w:lang w:val="en-US"/>
-        </w:rPr>
-        <w:t>customer.</w:t>
-      </w:r>
-      <w:r>
-        <w:rPr>
-          <w:rFonts w:ascii="Times-Roman" w:hAnsi="Times-Roman" w:cs="Times-Roman"/>
-          <w:color w:val="auto"/>
-          <w:szCs w:val="24"/>
-          <w:lang w:val="en-US"/>
-        </w:rPr>
-        <w:t>phone</w:t>
-      </w:r>
-      <w:proofErr w:type="spellEnd"/>
-      <w:proofErr w:type="gramEnd"/>
-      <w:r>
-        <w:rPr>
-          <w:rFonts w:ascii="Times-Roman" w:hAnsi="Times-Roman" w:cs="Times-Roman"/>
-          <w:color w:val="auto"/>
-          <w:szCs w:val="24"/>
-          <w:lang w:val="en-US"/>
-        </w:rPr>
-        <w:t>}}</w:t>
-      </w:r>
-      <w:r>
-        <w:rPr>
-          <w:rFonts w:ascii="Times New Roman" w:hAnsi="Times New Roman"/>
-          <w:color w:val="000000" w:themeColor="text1"/>
-          <w:lang w:val="en-US"/>
-        </w:rPr>
-        <w:t xml:space="preserve">, </w:t>
-      </w:r>
-      <w:r>
-        <w:rPr>
-          <w:rFonts w:ascii="Times New Roman" w:hAnsi="Times New Roman"/>
-          <w:color w:val="000000" w:themeColor="text1"/>
-          <w:lang w:val="en-US"/>
-        </w:rPr>
-        <w:t>e</w:t>
-      </w:r>
-      <w:r>
-        <w:rPr>
-          <w:rFonts w:ascii="Times New Roman" w:hAnsi="Times New Roman"/>
-          <w:color w:val="000000" w:themeColor="text1"/>
-          <w:lang w:val="en-US"/>
-        </w:rPr>
-        <w:t>-</w:t>
-      </w:r>
-      <w:r>
-        <w:rPr>
-          <w:rFonts w:ascii="Times New Roman" w:hAnsi="Times New Roman"/>
-          <w:color w:val="000000" w:themeColor="text1"/>
-          <w:lang w:val="en-US"/>
-        </w:rPr>
-        <w:t>mail</w:t>
-      </w:r>
-      <w:r>
-        <w:rPr>
-          <w:rFonts w:ascii="Times New Roman" w:hAnsi="Times New Roman"/>
-          <w:color w:val="000000" w:themeColor="text1"/>
-          <w:lang w:val="en-US"/>
-        </w:rPr>
-        <w:t xml:space="preserve">: </w:t>
-      </w:r>
-      <w:r>
-        <w:rPr>
-          <w:rFonts w:ascii="Times-Roman" w:hAnsi="Times-Roman" w:cs="Times-Roman"/>
-          <w:color w:val="auto"/>
-          <w:szCs w:val="24"/>
-          <w:lang w:val="en-US"/>
-        </w:rPr>
-        <w:t>{{</w:t>
-      </w:r>
-      <w:proofErr w:type="spellStart"/>
-      <w:r>
-        <w:rPr>
-          <w:rFonts w:ascii="Times-Roman" w:hAnsi="Times-Roman" w:cs="Times-Roman"/>
-          <w:color w:val="auto"/>
-          <w:szCs w:val="24"/>
-          <w:lang w:val="en-US"/>
-        </w:rPr>
-        <w:t>customer.</w:t>
-      </w:r>
-      <w:r>
-        <w:rPr>
-          <w:rFonts w:ascii="Times-Roman" w:hAnsi="Times-Roman" w:cs="Times-Roman"/>
-          <w:color w:val="auto"/>
-          <w:szCs w:val="24"/>
-          <w:lang w:val="en-US"/>
-        </w:rPr>
-        <w:t>email</w:t>
-      </w:r>
-      <w:proofErr w:type="spellEnd"/>
-      <w:r>
-        <w:rPr>
-          <w:rFonts w:ascii="Times-Roman" w:hAnsi="Times-Roman" w:cs="Times-Roman"/>
-          <w:color w:val="auto"/>
-          <w:szCs w:val="24"/>
-          <w:lang w:val="en-US"/>
-        </w:rPr>
-        <w:t>}}</w:t>
-      </w:r>
-    </w:p>
-    <w:p>
-      <w:pPr>
-        <w:rPr>
-          <w:rFonts w:ascii="Times New Roman" w:hAnsi="Times New Roman"/>
-          <w:lang w:val="en-US"/>
-        </w:rPr>
-      </w:pPr>
-    </w:p>
-    <w:p>
-      <w:pPr>
-        <w:rPr>
-          <w:rFonts w:ascii="Times New Roman" w:hAnsi="Times New Roman"/>
-        </w:rPr>
-      </w:pPr>
-      <w:r>
-        <w:rPr>
-          <w:rFonts w:ascii="Times New Roman" w:hAnsi="Times New Roman"/>
-          <w:b/>
-        </w:rPr>
-        <w:t>Стороны заключили договор о нижеследующем:</w:t>
-      </w:r>
-    </w:p>
-    <w:p>
-      <w:pPr>
-        <w:rPr>
-          <w:rFonts w:ascii="Times New Roman" w:hAnsi="Times New Roman"/>
-        </w:rPr>
-      </w:pPr>
-    </w:p>
-    <w:p>
-      <w:pPr>
-        <w:rPr>
-          <w:rFonts w:ascii="Times New Roman" w:hAnsi="Times New Roman"/>
-          <w:b/>
-        </w:rPr>
-      </w:pPr>
-      <w:r>
-        <w:rPr>
-          <w:rFonts w:ascii="Times New Roman" w:hAnsi="Times New Roman"/>
-          <w:b/>
-        </w:rPr>
-        <w:t>1. ПРЕДМЕТ ДОГОВОРА</w:t>
-      </w:r>
-    </w:p>
-    <w:p>
-      <w:pPr>
-        <w:rPr>
-          <w:rFonts w:ascii="Times New Roman" w:hAnsi="Times New Roman"/>
-        </w:rPr>
-      </w:pPr>
-      <w:bookmarkStart w:id="0" w:name="OLE_LINK3"/>
-      <w:bookmarkStart w:id="1" w:name="OLE_LINK4"/>
-      <w:r>
-        <w:rPr>
-          <w:rFonts w:ascii="Times New Roman" w:hAnsi="Times New Roman"/>
-        </w:rPr>
-        <w:t xml:space="preserve">1.1. Исполнитель обязуется оказать услуги по </w:t>
-      </w:r>
-      <w:proofErr w:type="gramStart"/>
-      <w:r>
-        <w:rPr>
-          <w:rFonts w:ascii="Times New Roman" w:hAnsi="Times New Roman"/>
-        </w:rPr>
-        <w:t>поиску  автомобиля</w:t>
-      </w:r>
-      <w:proofErr w:type="gramEnd"/>
-      <w:r>
-        <w:rPr>
-          <w:rFonts w:ascii="Times New Roman" w:hAnsi="Times New Roman"/>
-        </w:rPr>
-        <w:t xml:space="preserve"> </w:t>
-      </w:r>
-      <w:r>
-        <w:rPr>
-          <w:rFonts w:ascii="Times New Roman" w:hAnsi="Times New Roman"/>
-        </w:rPr>
         <w:t>на территории КНР в соответствии со </w:t>
       </w:r>
       <w:r>
@@ -814,24 +785,24 @@
         </w:rPr>
         <w:t> (Приложение 1)</w:t>
       </w:r>
+      <w:bookmarkEnd w:id="0"/>
+      <w:r>
+        <w:rPr>
+          <w:rFonts w:ascii="Times New Roman" w:hAnsi="Times New Roman"/>
+        </w:rPr>
+        <w:t>.</w:t>
+      </w:r>
+      <w:r>
+        <w:rPr>
+          <w:rFonts w:ascii="Times New Roman" w:hAnsi="Times New Roman"/>
+        </w:rPr>
+        <w:br/>
+      </w:r>
       <w:bookmarkEnd w:id="1"/>
       <w:r>
         <w:rPr>
           <w:rFonts w:ascii="Times New Roman" w:hAnsi="Times New Roman"/>
         </w:rPr>
-        <w:t>.</w:t>
-      </w:r>
-      <w:r>
-        <w:rPr>
-          <w:rFonts w:ascii="Times New Roman" w:hAnsi="Times New Roman"/>
-        </w:rPr>
-        <w:br/>
-      </w:r>
-      <w:bookmarkEnd w:id="0"/>
-      <w:r>
-        <w:rPr>
-          <w:rFonts w:ascii="Times New Roman" w:hAnsi="Times New Roman"/>
-        </w:rPr>
         <w:t>1.2. Заказчик обязуется оплатить услуги в размере </w:t>
       </w:r>
       <w:r>
@@ -839,14 +810,14 @@
           <w:rFonts w:ascii="Times New Roman" w:hAnsi="Times New Roman"/>
           <w:b/>
         </w:rPr>
-        <w:t>15</w:t>
-      </w:r>
-      <w:r>
-        <w:rPr>
-          <w:rFonts w:ascii="Times New Roman" w:hAnsi="Times New Roman"/>
-          <w:b/>
-        </w:rPr>
-        <w:t>0 000 рублей</w:t>
+        <w:t>200</w:t>
+      </w:r>
+      <w:r>
+        <w:rPr>
+          <w:rFonts w:ascii="Times New Roman" w:hAnsi="Times New Roman"/>
+          <w:b/>
+        </w:rPr>
+        <w:t xml:space="preserve"> 000 рублей</w:t>
       </w:r>
       <w:r>
         <w:rPr>
@@ -1052,21 +1023,7 @@
           <w:rFonts w:ascii="Times New Roman" w:hAnsi="Times New Roman"/>
         </w:rPr>
         <w:lastRenderedPageBreak/>
-        <w:t xml:space="preserve">Исполнитель информирует о прибытии ТС на границу КНР и </w:t>
-      </w:r>
-      <w:proofErr w:type="gramStart"/>
-      <w:r>
-        <w:rPr>
-          <w:rFonts w:ascii="Times New Roman" w:hAnsi="Times New Roman"/>
-        </w:rPr>
-        <w:t>проводит  транзитное</w:t>
-      </w:r>
-      <w:proofErr w:type="gramEnd"/>
-      <w:r>
-        <w:rPr>
-          <w:rFonts w:ascii="Times New Roman" w:hAnsi="Times New Roman"/>
-        </w:rPr>
-        <w:t xml:space="preserve"> оформление и таможенную очистку автомобиля согласно законодательства РФ в том числе с привлечением третьих организаций по отдельному договору. </w:t>
+        <w:t xml:space="preserve">Исполнитель информирует о прибытии ТС на границу КНР и проводит  транзитное оформление и таможенную очистку автомобиля согласно законодательства РФ в том числе с привлечением третьих организаций по отдельному договору. </w:t>
       </w:r>
     </w:p>
     <w:p>
@@ -1083,35 +1040,7 @@
         <w:rPr>
           <w:rFonts w:ascii="Times New Roman" w:hAnsi="Times New Roman"/>
         </w:rPr>
-        <w:t xml:space="preserve">Стоимость данных услуг определяется </w:t>
-      </w:r>
-      <w:proofErr w:type="gramStart"/>
-      <w:r>
-        <w:rPr>
-          <w:rFonts w:ascii="Times New Roman" w:hAnsi="Times New Roman"/>
-        </w:rPr>
-        <w:t>согласно  приложению</w:t>
-      </w:r>
-      <w:proofErr w:type="gramEnd"/>
-      <w:r>
-        <w:rPr>
-          <w:rFonts w:ascii="Times New Roman" w:hAnsi="Times New Roman"/>
-        </w:rPr>
-        <w:t xml:space="preserve"> 2  к данному договору. Заказчик обязуется оплатить данные услуги в момент прибытия автомобиля на определенный условиями </w:t>
-      </w:r>
-      <w:proofErr w:type="gramStart"/>
-      <w:r>
-        <w:rPr>
-          <w:rFonts w:ascii="Times New Roman" w:hAnsi="Times New Roman"/>
-        </w:rPr>
-        <w:t>договора  таможенный</w:t>
-      </w:r>
-      <w:proofErr w:type="gramEnd"/>
-      <w:r>
-        <w:rPr>
-          <w:rFonts w:ascii="Times New Roman" w:hAnsi="Times New Roman"/>
-        </w:rPr>
-        <w:t xml:space="preserve"> пост.</w:t>
+        <w:t>Стоимость данных услуг определяется согласно  приложению 2  к данному договору. Заказчик обязуется оплатить данные услуги в момент прибытия автомобиля на определенный условиями договора  таможенный пост.</w:t>
       </w:r>
     </w:p>
     <w:p>
@@ -1145,21 +1074,7 @@
         <w:rPr>
           <w:rFonts w:ascii="Times New Roman" w:hAnsi="Times New Roman"/>
         </w:rPr>
-        <w:t xml:space="preserve">Забирать и перемещать товар в зону таможенного контроля (в дальнейшем по тексту - ЗТК) перемещать автомобиль на склад временного хранения (в дальнейшем по </w:t>
-      </w:r>
-      <w:proofErr w:type="gramStart"/>
-      <w:r>
-        <w:rPr>
-          <w:rFonts w:ascii="Times New Roman" w:hAnsi="Times New Roman"/>
-        </w:rPr>
-        <w:t>тексту  СВХ</w:t>
-      </w:r>
-      <w:proofErr w:type="gramEnd"/>
-      <w:r>
-        <w:rPr>
-          <w:rFonts w:ascii="Times New Roman" w:hAnsi="Times New Roman"/>
-        </w:rPr>
-        <w:t xml:space="preserve"> ) </w:t>
+        <w:t xml:space="preserve">Забирать и перемещать товар в зону таможенного контроля (в дальнейшем по тексту - ЗТК) перемещать автомобиль на склад временного хранения (в дальнейшем по тексту  СВХ ) </w:t>
       </w:r>
     </w:p>
     <w:p>
@@ -1221,21 +1136,7 @@
         <w:rPr>
           <w:rFonts w:ascii="Times New Roman" w:hAnsi="Times New Roman"/>
         </w:rPr>
-        <w:t xml:space="preserve">Заключать контракт транспортировки </w:t>
-      </w:r>
-      <w:proofErr w:type="gramStart"/>
-      <w:r>
-        <w:rPr>
-          <w:rFonts w:ascii="Times New Roman" w:hAnsi="Times New Roman"/>
-        </w:rPr>
-        <w:t>и  перемещения</w:t>
-      </w:r>
-      <w:proofErr w:type="gramEnd"/>
-      <w:r>
-        <w:rPr>
-          <w:rFonts w:ascii="Times New Roman" w:hAnsi="Times New Roman"/>
-        </w:rPr>
-        <w:t xml:space="preserve"> автомобиля до места передачи с транспортной компанией. В том числе и договор страхования.</w:t>
+        <w:t>Заключать контракт транспортировки и  перемещения автомобиля до места передачи с транспортной компанией. В том числе и договор страхования.</w:t>
       </w:r>
     </w:p>
     <w:p>
@@ -1252,21 +1153,7 @@
         <w:rPr>
           <w:rFonts w:ascii="Times New Roman" w:hAnsi="Times New Roman"/>
         </w:rPr>
-        <w:t xml:space="preserve">Заключать договор с испытательными </w:t>
-      </w:r>
-      <w:proofErr w:type="gramStart"/>
-      <w:r>
-        <w:rPr>
-          <w:rFonts w:ascii="Times New Roman" w:hAnsi="Times New Roman"/>
-        </w:rPr>
-        <w:t>лабораториями  на</w:t>
-      </w:r>
-      <w:proofErr w:type="gramEnd"/>
-      <w:r>
-        <w:rPr>
-          <w:rFonts w:ascii="Times New Roman" w:hAnsi="Times New Roman"/>
-        </w:rPr>
-        <w:t xml:space="preserve">  проведение технической экспертизы транспорта, получать Свидетельство о безопасности колесного транспортного средства (далее по тексту СБКТС) а также выписки из Электронного паспорта транспортного средства (Далее по тексту ЭПТС)</w:t>
+        <w:t>Заключать договор с испытательными лабораториями  на  проведение технической экспертизы транспорта, получать Свидетельство о безопасности колесного транспортного средства (далее по тексту СБКТС) а также выписки из Электронного паспорта транспортного средства (Далее по тексту ЭПТС)</w:t>
       </w:r>
     </w:p>
     <w:p>
@@ -1359,21 +1246,7 @@
           <w:rFonts w:ascii="Times New Roman" w:hAnsi="Times New Roman"/>
         </w:rPr>
         <w:br/>
-        <w:t xml:space="preserve">2.1. Осуществить </w:t>
-      </w:r>
-      <w:proofErr w:type="gramStart"/>
-      <w:r>
-        <w:rPr>
-          <w:rFonts w:ascii="Times New Roman" w:hAnsi="Times New Roman"/>
-        </w:rPr>
-        <w:t>поиск  автомобиля</w:t>
-      </w:r>
-      <w:proofErr w:type="gramEnd"/>
-      <w:r>
-        <w:rPr>
-          <w:rFonts w:ascii="Times New Roman" w:hAnsi="Times New Roman"/>
-        </w:rPr>
-        <w:t xml:space="preserve"> по критериям Заказчика.</w:t>
+        <w:t>2.1. Осуществить поиск  автомобиля по критериям Заказчика.</w:t>
       </w:r>
       <w:r>
         <w:rPr>
@@ -1443,21 +1316,12 @@
         </w:rPr>
         <w:t xml:space="preserve">Дополнительные услуги не отраженные в Приложении </w:t>
       </w:r>
-      <w:proofErr w:type="gramStart"/>
       <w:r>
         <w:rPr>
           <w:rFonts w:ascii="Times New Roman" w:hAnsi="Times New Roman"/>
           <w:highlight w:val="lightGray"/>
         </w:rPr>
-        <w:t>2  подлежат</w:t>
-      </w:r>
-      <w:proofErr w:type="gramEnd"/>
-      <w:r>
-        <w:rPr>
-          <w:rFonts w:ascii="Times New Roman" w:hAnsi="Times New Roman"/>
-          <w:highlight w:val="lightGray"/>
-        </w:rPr>
-        <w:t xml:space="preserve"> оплате только  по предварительному согласованию с заказчиком.</w:t>
+        <w:t>2  подлежат оплате только  по предварительному согласованию с заказчиком.</w:t>
       </w:r>
       <w:r>
         <w:rPr>
@@ -1628,7 +1492,6 @@
         <w:rPr>
           <w:rFonts w:ascii="Times New Roman" w:hAnsi="Times New Roman"/>
           <w:b/>
-          <w:lang w:val="en-US"/>
         </w:rPr>
       </w:pPr>
       <w:r>
@@ -1656,14 +1519,14 @@
           <w:rFonts w:ascii="Times New Roman" w:hAnsi="Times New Roman"/>
           <w:b/>
         </w:rPr>
-        <w:t>15</w:t>
-      </w:r>
-      <w:r>
-        <w:rPr>
-          <w:rFonts w:ascii="Times New Roman" w:hAnsi="Times New Roman"/>
-          <w:b/>
-        </w:rPr>
-        <w:t>0 000 рублей</w:t>
+        <w:t>200</w:t>
+      </w:r>
+      <w:r>
+        <w:rPr>
+          <w:rFonts w:ascii="Times New Roman" w:hAnsi="Times New Roman"/>
+          <w:b/>
+        </w:rPr>
+        <w:t xml:space="preserve"> 000 рублей</w:t>
       </w:r>
       <w:r>
         <w:rPr>
@@ -1732,7 +1595,7 @@
           <w:rFonts w:ascii="Times New Roman" w:hAnsi="Times New Roman"/>
           <w:b/>
         </w:rPr>
-        <w:t>7</w:t>
+        <w:t>12</w:t>
       </w:r>
       <w:r>
         <w:rPr>
@@ -1890,21 +1753,7 @@
         <w:rPr>
           <w:rFonts w:ascii="Times New Roman" w:hAnsi="Times New Roman"/>
         </w:rPr>
-        <w:t xml:space="preserve">4.3. Срок поставки автомобиля до места </w:t>
-      </w:r>
-      <w:proofErr w:type="gramStart"/>
-      <w:r>
-        <w:rPr>
-          <w:rFonts w:ascii="Times New Roman" w:hAnsi="Times New Roman"/>
-        </w:rPr>
-        <w:t>назначения  определяются</w:t>
-      </w:r>
-      <w:proofErr w:type="gramEnd"/>
-      <w:r>
-        <w:rPr>
-          <w:rFonts w:ascii="Times New Roman" w:hAnsi="Times New Roman"/>
-        </w:rPr>
-        <w:t xml:space="preserve"> экспортным контрактом   между заказчиком и продавцом  по сделке. </w:t>
+        <w:t xml:space="preserve">4.3. Срок поставки автомобиля до места назначения  определяются экспортным контрактом   между заказчиком и продавцом  по сделке. </w:t>
       </w:r>
     </w:p>
     <w:p>
@@ -2479,6 +2328,13 @@
       <w:r>
         <w:rPr>
           <w:rFonts w:ascii="Times New Roman" w:hAnsi="Times New Roman"/>
+          <w:lang w:val="en-US"/>
+        </w:rPr>
+        <w:t xml:space="preserve"> </w:t>
+      </w:r>
+      <w:r>
+        <w:rPr>
+          <w:rFonts w:ascii="Times New Roman" w:hAnsi="Times New Roman"/>
         </w:rPr>
         <w:t>/</w:t>
       </w:r>
@@ -2494,9 +2350,9 @@
         <w:rPr>
           <w:rFonts w:ascii="Times New Roman" w:hAnsi="Times New Roman"/>
           <w:b/>
-          <w:lang w:val="en-US"/>
-        </w:rPr>
-      </w:pPr>
+        </w:rPr>
+      </w:pPr>
+      <w:bookmarkStart w:id="2" w:name="OLE_LINK5"/>
       <w:r>
         <w:rPr>
           <w:rFonts w:ascii="Times New Roman" w:hAnsi="Times New Roman"/>
@@ -2508,7 +2364,6 @@
         <w:rPr>
           <w:rFonts w:ascii="Times New Roman" w:hAnsi="Times New Roman"/>
           <w:b/>
-          <w:lang w:val="en-US"/>
         </w:rPr>
         <w:t>:</w:t>
       </w:r>
@@ -2517,18 +2372,29 @@
           <w:rFonts w:ascii="Times New Roman" w:hAnsi="Times New Roman"/>
           <w:lang w:val="en-US"/>
         </w:rPr>
-        <w:t> ________/</w:t>
-      </w:r>
-      <w:r>
-        <w:rPr>
-          <w:rFonts w:ascii="Times-Roman" w:hAnsi="Times-Roman" w:cs="Times-Roman"/>
-          <w:color w:val="auto"/>
-          <w:szCs w:val="24"/>
-          <w:lang w:val="en-US"/>
+        <w:t> </w:t>
+      </w:r>
+      <w:r>
+        <w:rPr>
+          <w:rFonts w:ascii="Times New Roman" w:hAnsi="Times New Roman"/>
+        </w:rPr>
+        <w:t>________/</w:t>
+      </w:r>
+      <w:r>
+        <w:rPr>
+          <w:rFonts w:ascii="Times New Roman" w:hAnsi="Times New Roman"/>
+          <w:lang w:val="en-US"/>
+        </w:rPr>
+        <w:t xml:space="preserve"> </w:t>
+      </w:r>
+      <w:r>
+        <w:rPr>
+          <w:rFonts w:ascii="Times-Roman" w:hAnsi="Times-Roman" w:cs="Times-Roman"/>
+          <w:color w:val="auto"/>
+          <w:szCs w:val="24"/>
         </w:rPr>
         <w:t>{{</w:t>
       </w:r>
-      <w:proofErr w:type="gramStart"/>
       <w:r>
         <w:rPr>
           <w:rFonts w:ascii="Times-Roman" w:hAnsi="Times-Roman" w:cs="Times-Roman"/>
@@ -2543,322 +2409,210 @@
           <w:rFonts w:ascii="Times-Roman" w:hAnsi="Times-Roman" w:cs="Times-Roman"/>
           <w:color w:val="auto"/>
           <w:szCs w:val="24"/>
-          <w:lang w:val="en-US"/>
         </w:rPr>
         <w:t>.</w:t>
       </w:r>
-      <w:r>
-        <w:rPr>
-          <w:rFonts w:ascii="Times-Roman" w:hAnsi="Times-Roman" w:cs="Times-Roman"/>
-          <w:color w:val="auto"/>
-          <w:szCs w:val="24"/>
-          <w:lang w:val="en-US"/>
-        </w:rPr>
-        <w:t>last</w:t>
-      </w:r>
-      <w:proofErr w:type="gramEnd"/>
-      <w:r>
-        <w:rPr>
-          <w:rFonts w:ascii="Times-Roman" w:hAnsi="Times-Roman" w:cs="Times-Roman"/>
-          <w:color w:val="auto"/>
-          <w:szCs w:val="24"/>
-          <w:lang w:val="en-US"/>
-        </w:rPr>
-        <w:t>_</w:t>
-      </w:r>
-      <w:r>
-        <w:rPr>
-          <w:rFonts w:ascii="Times-Roman" w:hAnsi="Times-Roman" w:cs="Times-Roman"/>
-          <w:color w:val="auto"/>
-          <w:szCs w:val="24"/>
-          <w:lang w:val="en-US"/>
-        </w:rPr>
-        <w:t>name</w:t>
-      </w:r>
-      <w:r>
-        <w:rPr>
-          <w:rFonts w:ascii="Times-Roman" w:hAnsi="Times-Roman" w:cs="Times-Roman"/>
-          <w:color w:val="auto"/>
-          <w:szCs w:val="24"/>
-          <w:lang w:val="en-US"/>
-        </w:rPr>
-        <w:t>}}{{</w:t>
-      </w:r>
-      <w:r>
-        <w:rPr>
-          <w:rFonts w:ascii="Times-Roman" w:hAnsi="Times-Roman" w:cs="Times-Roman"/>
-          <w:color w:val="auto"/>
-          <w:szCs w:val="24"/>
-          <w:lang w:val="en-US"/>
-        </w:rPr>
-        <w:t>customer</w:t>
-      </w:r>
-      <w:r>
-        <w:rPr>
-          <w:rFonts w:ascii="Times-Roman" w:hAnsi="Times-Roman" w:cs="Times-Roman"/>
-          <w:color w:val="auto"/>
-          <w:szCs w:val="24"/>
-          <w:lang w:val="en-US"/>
-        </w:rPr>
-        <w:t>.</w:t>
-      </w:r>
-      <w:r>
-        <w:rPr>
-          <w:rFonts w:ascii="Times-Roman" w:hAnsi="Times-Roman" w:cs="Times-Roman"/>
-          <w:color w:val="auto"/>
-          <w:szCs w:val="24"/>
-          <w:lang w:val="en-US"/>
-        </w:rPr>
-        <w:t>first</w:t>
-      </w:r>
-      <w:r>
-        <w:rPr>
-          <w:rFonts w:ascii="Times-Roman" w:hAnsi="Times-Roman" w:cs="Times-Roman"/>
-          <w:color w:val="auto"/>
-          <w:szCs w:val="24"/>
-          <w:lang w:val="en-US"/>
-        </w:rPr>
-        <w:t>_</w:t>
-      </w:r>
-      <w:r>
-        <w:rPr>
-          <w:rFonts w:ascii="Times-Roman" w:hAnsi="Times-Roman" w:cs="Times-Roman"/>
-          <w:color w:val="auto"/>
-          <w:szCs w:val="24"/>
-          <w:lang w:val="en-US"/>
-        </w:rPr>
-        <w:t>name</w:t>
-      </w:r>
-      <w:r>
-        <w:rPr>
-          <w:rFonts w:ascii="Times-Roman" w:hAnsi="Times-Roman" w:cs="Times-Roman"/>
-          <w:color w:val="auto"/>
-          <w:szCs w:val="24"/>
-          <w:lang w:val="en-US"/>
-        </w:rPr>
-        <w:t>}}{{</w:t>
-      </w:r>
-      <w:r>
-        <w:rPr>
-          <w:rFonts w:ascii="Times-Roman" w:hAnsi="Times-Roman" w:cs="Times-Roman"/>
-          <w:color w:val="auto"/>
-          <w:szCs w:val="24"/>
-          <w:lang w:val="en-US"/>
-        </w:rPr>
-        <w:t>customer</w:t>
-      </w:r>
-      <w:r>
-        <w:rPr>
-          <w:rFonts w:ascii="Times-Roman" w:hAnsi="Times-Roman" w:cs="Times-Roman"/>
-          <w:color w:val="auto"/>
-          <w:szCs w:val="24"/>
-          <w:lang w:val="en-US"/>
-        </w:rPr>
-        <w:t>.</w:t>
-      </w:r>
-      <w:r>
-        <w:rPr>
-          <w:rFonts w:ascii="Times-Roman" w:hAnsi="Times-Roman" w:cs="Times-Roman"/>
-          <w:color w:val="auto"/>
-          <w:szCs w:val="24"/>
-          <w:lang w:val="en-US"/>
-        </w:rPr>
-        <w:t>surname</w:t>
-      </w:r>
-      <w:r>
-        <w:rPr>
-          <w:rFonts w:ascii="Times-Roman" w:hAnsi="Times-Roman" w:cs="Times-Roman"/>
-          <w:color w:val="auto"/>
-          <w:szCs w:val="24"/>
-          <w:lang w:val="en-US"/>
+      <w:proofErr w:type="spellStart"/>
+      <w:r>
+        <w:rPr>
+          <w:rFonts w:ascii="Times-Roman" w:hAnsi="Times-Roman" w:cs="Times-Roman"/>
+          <w:color w:val="auto"/>
+          <w:szCs w:val="24"/>
+          <w:lang w:val="en-US"/>
+        </w:rPr>
+        <w:t>short_name</w:t>
+      </w:r>
+      <w:proofErr w:type="spellEnd"/>
+      <w:r>
+        <w:rPr>
+          <w:rFonts w:ascii="Times-Roman" w:hAnsi="Times-Roman" w:cs="Times-Roman"/>
+          <w:color w:val="auto"/>
+          <w:szCs w:val="24"/>
+        </w:rPr>
+        <w:t xml:space="preserve"> </w:t>
+      </w:r>
+      <w:r>
+        <w:rPr>
+          <w:rFonts w:ascii="Times-Roman" w:hAnsi="Times-Roman" w:cs="Times-Roman"/>
+          <w:color w:val="auto"/>
+          <w:szCs w:val="24"/>
         </w:rPr>
         <w:t>}}</w:t>
       </w:r>
       <w:r>
         <w:rPr>
-          <w:rFonts w:ascii="Times New Roman" w:hAnsi="Times New Roman"/>
-          <w:lang w:val="en-US"/>
+          <w:rFonts w:ascii="Times-Roman" w:hAnsi="Times-Roman" w:cs="Times-Roman"/>
+          <w:color w:val="auto"/>
+          <w:szCs w:val="24"/>
+          <w:lang w:val="en-US"/>
+        </w:rPr>
+        <w:t xml:space="preserve"> </w:t>
+      </w:r>
+      <w:r>
+        <w:rPr>
+          <w:rFonts w:ascii="Times New Roman" w:hAnsi="Times New Roman"/>
         </w:rPr>
         <w:t>/</w:t>
       </w:r>
     </w:p>
-    <w:p>
-      <w:pPr>
-        <w:rPr>
-          <w:rFonts w:ascii="Times New Roman" w:hAnsi="Times New Roman"/>
-          <w:b/>
-          <w:lang w:val="en-US"/>
-        </w:rPr>
-      </w:pPr>
-    </w:p>
-    <w:p>
-      <w:pPr>
-        <w:rPr>
-          <w:rFonts w:ascii="Times New Roman" w:hAnsi="Times New Roman"/>
-          <w:b/>
-          <w:lang w:val="en-US"/>
-        </w:rPr>
-      </w:pPr>
-    </w:p>
-    <w:p>
-      <w:pPr>
-        <w:rPr>
-          <w:rFonts w:ascii="Times New Roman" w:hAnsi="Times New Roman"/>
-          <w:b/>
-          <w:lang w:val="en-US"/>
-        </w:rPr>
-      </w:pPr>
-    </w:p>
-    <w:p>
-      <w:pPr>
-        <w:rPr>
-          <w:rFonts w:ascii="Times New Roman" w:hAnsi="Times New Roman"/>
-          <w:b/>
-          <w:lang w:val="en-US"/>
-        </w:rPr>
-      </w:pPr>
-    </w:p>
-    <w:p>
-      <w:pPr>
-        <w:rPr>
-          <w:rFonts w:ascii="Times New Roman" w:hAnsi="Times New Roman"/>
-          <w:b/>
-          <w:lang w:val="en-US"/>
-        </w:rPr>
-      </w:pPr>
-    </w:p>
-    <w:p>
-      <w:pPr>
-        <w:rPr>
-          <w:rFonts w:ascii="Times New Roman" w:hAnsi="Times New Roman"/>
-          <w:b/>
-          <w:lang w:val="en-US"/>
-        </w:rPr>
-      </w:pPr>
-    </w:p>
-    <w:p>
-      <w:pPr>
-        <w:rPr>
-          <w:rFonts w:ascii="Times New Roman" w:hAnsi="Times New Roman"/>
-          <w:b/>
-          <w:lang w:val="en-US"/>
-        </w:rPr>
-      </w:pPr>
-    </w:p>
-    <w:p>
-      <w:pPr>
-        <w:rPr>
-          <w:rFonts w:ascii="Times New Roman" w:hAnsi="Times New Roman"/>
-          <w:b/>
-          <w:lang w:val="en-US"/>
-        </w:rPr>
-      </w:pPr>
-    </w:p>
-    <w:p>
-      <w:pPr>
-        <w:rPr>
-          <w:rFonts w:ascii="Times New Roman" w:hAnsi="Times New Roman"/>
-          <w:b/>
-          <w:lang w:val="en-US"/>
-        </w:rPr>
-      </w:pPr>
-    </w:p>
-    <w:p>
-      <w:pPr>
-        <w:rPr>
-          <w:rFonts w:ascii="Times New Roman" w:hAnsi="Times New Roman"/>
-          <w:b/>
-          <w:lang w:val="en-US"/>
-        </w:rPr>
-      </w:pPr>
-    </w:p>
-    <w:p>
-      <w:pPr>
-        <w:rPr>
-          <w:rFonts w:ascii="Times New Roman" w:hAnsi="Times New Roman"/>
-          <w:b/>
-          <w:lang w:val="en-US"/>
-        </w:rPr>
-      </w:pPr>
-    </w:p>
-    <w:p>
-      <w:pPr>
-        <w:rPr>
-          <w:rFonts w:ascii="Times New Roman" w:hAnsi="Times New Roman"/>
-          <w:b/>
-          <w:lang w:val="en-US"/>
-        </w:rPr>
-      </w:pPr>
-    </w:p>
-    <w:p>
-      <w:pPr>
-        <w:rPr>
-          <w:rFonts w:ascii="Times New Roman" w:hAnsi="Times New Roman"/>
-          <w:b/>
-          <w:lang w:val="en-US"/>
-        </w:rPr>
-      </w:pPr>
-    </w:p>
-    <w:p>
-      <w:pPr>
-        <w:rPr>
-          <w:rFonts w:ascii="Times New Roman" w:hAnsi="Times New Roman"/>
-          <w:b/>
-          <w:lang w:val="en-US"/>
-        </w:rPr>
-      </w:pPr>
-    </w:p>
-    <w:p>
-      <w:pPr>
-        <w:rPr>
-          <w:rFonts w:ascii="Times New Roman" w:hAnsi="Times New Roman"/>
-          <w:b/>
-          <w:lang w:val="en-US"/>
-        </w:rPr>
-      </w:pPr>
-    </w:p>
-    <w:p>
-      <w:pPr>
-        <w:rPr>
-          <w:rFonts w:ascii="Times New Roman" w:hAnsi="Times New Roman"/>
-          <w:b/>
-          <w:lang w:val="en-US"/>
-        </w:rPr>
-      </w:pPr>
-    </w:p>
-    <w:p>
-      <w:pPr>
-        <w:rPr>
-          <w:rFonts w:ascii="Times New Roman" w:hAnsi="Times New Roman"/>
-          <w:b/>
-          <w:lang w:val="en-US"/>
-        </w:rPr>
-      </w:pPr>
-    </w:p>
-    <w:p>
-      <w:pPr>
-        <w:rPr>
-          <w:rFonts w:ascii="Times New Roman" w:hAnsi="Times New Roman"/>
-          <w:b/>
-          <w:lang w:val="en-US"/>
-        </w:rPr>
-      </w:pPr>
-    </w:p>
-    <w:p>
-      <w:pPr>
-        <w:rPr>
-          <w:rFonts w:ascii="Times New Roman" w:hAnsi="Times New Roman"/>
-          <w:b/>
-          <w:lang w:val="en-US"/>
-        </w:rPr>
-      </w:pPr>
-    </w:p>
-    <w:p>
-      <w:pPr>
-        <w:rPr>
-          <w:rFonts w:ascii="Times New Roman" w:hAnsi="Times New Roman"/>
-          <w:b/>
-          <w:lang w:val="en-US"/>
+    <w:bookmarkEnd w:id="2"/>
+    <w:p>
+      <w:pPr>
+        <w:rPr>
+          <w:rFonts w:ascii="Times New Roman" w:hAnsi="Times New Roman"/>
+          <w:b/>
+        </w:rPr>
+      </w:pPr>
+    </w:p>
+    <w:p>
+      <w:pPr>
+        <w:rPr>
+          <w:rFonts w:ascii="Times New Roman" w:hAnsi="Times New Roman"/>
+          <w:b/>
+        </w:rPr>
+      </w:pPr>
+    </w:p>
+    <w:p>
+      <w:pPr>
+        <w:rPr>
+          <w:rFonts w:ascii="Times New Roman" w:hAnsi="Times New Roman"/>
+          <w:b/>
+        </w:rPr>
+      </w:pPr>
+    </w:p>
+    <w:p>
+      <w:pPr>
+        <w:rPr>
+          <w:rFonts w:ascii="Times New Roman" w:hAnsi="Times New Roman"/>
+          <w:b/>
+        </w:rPr>
+      </w:pPr>
+    </w:p>
+    <w:p>
+      <w:pPr>
+        <w:rPr>
+          <w:rFonts w:ascii="Times New Roman" w:hAnsi="Times New Roman"/>
+          <w:b/>
+        </w:rPr>
+      </w:pPr>
+    </w:p>
+    <w:p>
+      <w:pPr>
+        <w:rPr>
+          <w:rFonts w:ascii="Times New Roman" w:hAnsi="Times New Roman"/>
+          <w:b/>
+        </w:rPr>
+      </w:pPr>
+    </w:p>
+    <w:p>
+      <w:pPr>
+        <w:rPr>
+          <w:rFonts w:ascii="Times New Roman" w:hAnsi="Times New Roman"/>
+          <w:b/>
+        </w:rPr>
+      </w:pPr>
+    </w:p>
+    <w:p>
+      <w:pPr>
+        <w:rPr>
+          <w:rFonts w:ascii="Times New Roman" w:hAnsi="Times New Roman"/>
+          <w:b/>
+        </w:rPr>
+      </w:pPr>
+    </w:p>
+    <w:p>
+      <w:pPr>
+        <w:rPr>
+          <w:rFonts w:ascii="Times New Roman" w:hAnsi="Times New Roman"/>
+          <w:b/>
+        </w:rPr>
+      </w:pPr>
+    </w:p>
+    <w:p>
+      <w:pPr>
+        <w:rPr>
+          <w:rFonts w:ascii="Times New Roman" w:hAnsi="Times New Roman"/>
+          <w:b/>
+        </w:rPr>
+      </w:pPr>
+    </w:p>
+    <w:p>
+      <w:pPr>
+        <w:rPr>
+          <w:rFonts w:ascii="Times New Roman" w:hAnsi="Times New Roman"/>
+          <w:b/>
+        </w:rPr>
+      </w:pPr>
+    </w:p>
+    <w:p>
+      <w:pPr>
+        <w:rPr>
+          <w:rFonts w:ascii="Times New Roman" w:hAnsi="Times New Roman"/>
+          <w:b/>
+        </w:rPr>
+      </w:pPr>
+    </w:p>
+    <w:p>
+      <w:pPr>
+        <w:rPr>
+          <w:rFonts w:ascii="Times New Roman" w:hAnsi="Times New Roman"/>
+          <w:b/>
+        </w:rPr>
+      </w:pPr>
+    </w:p>
+    <w:p>
+      <w:pPr>
+        <w:rPr>
+          <w:rFonts w:ascii="Times New Roman" w:hAnsi="Times New Roman"/>
+          <w:b/>
+        </w:rPr>
+      </w:pPr>
+    </w:p>
+    <w:p>
+      <w:pPr>
+        <w:rPr>
+          <w:rFonts w:ascii="Times New Roman" w:hAnsi="Times New Roman"/>
+          <w:b/>
+        </w:rPr>
+      </w:pPr>
+    </w:p>
+    <w:p>
+      <w:pPr>
+        <w:rPr>
+          <w:rFonts w:ascii="Times New Roman" w:hAnsi="Times New Roman"/>
+          <w:b/>
+        </w:rPr>
+      </w:pPr>
+    </w:p>
+    <w:p>
+      <w:pPr>
+        <w:rPr>
+          <w:rFonts w:ascii="Times New Roman" w:hAnsi="Times New Roman"/>
+          <w:b/>
+        </w:rPr>
+      </w:pPr>
+    </w:p>
+    <w:p>
+      <w:pPr>
+        <w:rPr>
+          <w:rFonts w:ascii="Times New Roman" w:hAnsi="Times New Roman"/>
+          <w:b/>
+        </w:rPr>
+      </w:pPr>
+    </w:p>
+    <w:p>
+      <w:pPr>
+        <w:rPr>
+          <w:rFonts w:ascii="Times New Roman" w:hAnsi="Times New Roman"/>
+          <w:b/>
+        </w:rPr>
+      </w:pPr>
+    </w:p>
+    <w:p>
+      <w:pPr>
+        <w:rPr>
+          <w:rFonts w:ascii="Times New Roman" w:hAnsi="Times New Roman"/>
+          <w:b/>
         </w:rPr>
       </w:pPr>
     </w:p>
@@ -2948,7 +2702,6 @@
         <w:t>{{</w:t>
       </w:r>
       <w:proofErr w:type="spellStart"/>
-      <w:proofErr w:type="gramStart"/>
       <w:r>
         <w:rPr>
           <w:rFonts w:ascii="Times-Roman" w:hAnsi="Times-Roman" w:cs="Times-Roman"/>
@@ -2959,7 +2712,6 @@
         <w:t>specification.brand</w:t>
       </w:r>
       <w:proofErr w:type="spellEnd"/>
-      <w:proofErr w:type="gramEnd"/>
       <w:r>
         <w:rPr>
           <w:rFonts w:ascii="Times-Roman" w:hAnsi="Times-Roman" w:cs="Times-Roman"/>
@@ -3025,7 +2777,6 @@
         <w:t>{{</w:t>
       </w:r>
       <w:proofErr w:type="spellStart"/>
-      <w:proofErr w:type="gramStart"/>
       <w:r>
         <w:rPr>
           <w:rFonts w:ascii="Times-Roman" w:hAnsi="Times-Roman" w:cs="Times-Roman"/>
@@ -3036,7 +2787,6 @@
         <w:t>specification.model</w:t>
       </w:r>
       <w:proofErr w:type="spellEnd"/>
-      <w:proofErr w:type="gramEnd"/>
       <w:r>
         <w:rPr>
           <w:rFonts w:ascii="Times-Roman" w:hAnsi="Times-Roman" w:cs="Times-Roman"/>
@@ -3081,7 +2831,6 @@
         <w:t>{{</w:t>
       </w:r>
       <w:proofErr w:type="spellStart"/>
-      <w:proofErr w:type="gramStart"/>
       <w:r>
         <w:rPr>
           <w:rFonts w:ascii="Times-Roman" w:hAnsi="Times-Roman" w:cs="Times-Roman"/>
@@ -3092,7 +2841,6 @@
         <w:t>specification.year</w:t>
       </w:r>
       <w:proofErr w:type="spellEnd"/>
-      <w:proofErr w:type="gramEnd"/>
       <w:r>
         <w:rPr>
           <w:rFonts w:ascii="Times-Roman" w:hAnsi="Times-Roman" w:cs="Times-Roman"/>
@@ -3147,7 +2895,6 @@
         <w:t>specification.eng_capacity</w:t>
       </w:r>
       <w:proofErr w:type="spellEnd"/>
-      <w:proofErr w:type="gramStart"/>
       <w:r>
         <w:rPr>
           <w:rFonts w:ascii="Times-Roman" w:hAnsi="Times-Roman" w:cs="Times-Roman"/>
@@ -3163,7 +2910,6 @@
         </w:rPr>
         <w:t>л</w:t>
       </w:r>
-      <w:proofErr w:type="gramEnd"/>
     </w:p>
     <w:p>
       <w:pPr>
@@ -3258,7 +3004,6 @@
         <w:t>{{</w:t>
       </w:r>
       <w:proofErr w:type="spellStart"/>
-      <w:proofErr w:type="gramStart"/>
       <w:r>
         <w:rPr>
           <w:rFonts w:ascii="Times-Roman" w:hAnsi="Times-Roman" w:cs="Times-Roman"/>
@@ -3269,7 +3014,6 @@
         <w:t>specification.drive</w:t>
       </w:r>
       <w:proofErr w:type="spellEnd"/>
-      <w:proofErr w:type="gramEnd"/>
       <w:r>
         <w:rPr>
           <w:rFonts w:ascii="Times-Roman" w:hAnsi="Times-Roman" w:cs="Times-Roman"/>
@@ -3306,7 +3050,6 @@
         <w:t>{{</w:t>
       </w:r>
       <w:proofErr w:type="spellStart"/>
-      <w:proofErr w:type="gramStart"/>
       <w:r>
         <w:rPr>
           <w:rFonts w:ascii="Times-Roman" w:hAnsi="Times-Roman" w:cs="Times-Roman"/>
@@ -3317,7 +3060,6 @@
         <w:t>specification.transmission</w:t>
       </w:r>
       <w:proofErr w:type="spellEnd"/>
-      <w:proofErr w:type="gramEnd"/>
       <w:r>
         <w:rPr>
           <w:rFonts w:ascii="Times-Roman" w:hAnsi="Times-Roman" w:cs="Times-Roman"/>
@@ -3354,7 +3096,6 @@
         <w:t>{{</w:t>
       </w:r>
       <w:proofErr w:type="spellStart"/>
-      <w:proofErr w:type="gramStart"/>
       <w:r>
         <w:rPr>
           <w:rFonts w:ascii="Times-Roman" w:hAnsi="Times-Roman" w:cs="Times-Roman"/>
@@ -3365,7 +3106,6 @@
         <w:t>specification.color</w:t>
       </w:r>
       <w:proofErr w:type="spellEnd"/>
-      <w:proofErr w:type="gramEnd"/>
       <w:r>
         <w:rPr>
           <w:rFonts w:ascii="Times-Roman" w:hAnsi="Times-Roman" w:cs="Times-Roman"/>
@@ -3417,7 +3157,6 @@
         <w:t>{{</w:t>
       </w:r>
       <w:proofErr w:type="spellStart"/>
-      <w:proofErr w:type="gramStart"/>
       <w:r>
         <w:rPr>
           <w:rFonts w:ascii="Times-Roman" w:hAnsi="Times-Roman" w:cs="Times-Roman"/>
@@ -3428,7 +3167,6 @@
         <w:t>specification.complectation</w:t>
       </w:r>
       <w:proofErr w:type="spellEnd"/>
-      <w:proofErr w:type="gramEnd"/>
       <w:r>
         <w:rPr>
           <w:rFonts w:ascii="Times-Roman" w:hAnsi="Times-Roman" w:cs="Times-Roman"/>
@@ -3471,7 +3209,6 @@
         <w:t>{{</w:t>
       </w:r>
       <w:proofErr w:type="spellStart"/>
-      <w:proofErr w:type="gramStart"/>
       <w:r>
         <w:rPr>
           <w:rFonts w:ascii="Times-Roman" w:hAnsi="Times-Roman" w:cs="Times-Roman"/>
@@ -3482,7 +3219,6 @@
         <w:t>specification.mileage</w:t>
       </w:r>
       <w:proofErr w:type="spellEnd"/>
-      <w:proofErr w:type="gramEnd"/>
       <w:r>
         <w:rPr>
           <w:rFonts w:ascii="Times-Roman" w:hAnsi="Times-Roman" w:cs="Times-Roman"/>
@@ -3541,7 +3277,6 @@
         <w:t>{{</w:t>
       </w:r>
       <w:proofErr w:type="spellStart"/>
-      <w:proofErr w:type="gramStart"/>
       <w:r>
         <w:rPr>
           <w:rFonts w:ascii="Times-Roman" w:hAnsi="Times-Roman" w:cs="Times-Roman"/>
@@ -3552,7 +3287,6 @@
         <w:t>specification.price</w:t>
       </w:r>
       <w:proofErr w:type="spellEnd"/>
-      <w:proofErr w:type="gramEnd"/>
       <w:r>
         <w:rPr>
           <w:rFonts w:ascii="Times-Roman" w:hAnsi="Times-Roman" w:cs="Times-Roman"/>
@@ -3631,7 +3365,20 @@
         <w:rPr>
           <w:rFonts w:ascii="Times New Roman" w:hAnsi="Times New Roman"/>
         </w:rPr>
-        <w:t> ________/ Губайдуллин А.М./</w:t>
+        <w:t> ________/ Губайдуллин А.М.</w:t>
+      </w:r>
+      <w:r>
+        <w:rPr>
+          <w:rFonts w:ascii="Times New Roman" w:hAnsi="Times New Roman"/>
+          <w:lang w:val="en-US"/>
+        </w:rPr>
+        <w:t xml:space="preserve"> </w:t>
+      </w:r>
+      <w:r>
+        <w:rPr>
+          <w:rFonts w:ascii="Times New Roman" w:hAnsi="Times New Roman"/>
+        </w:rPr>
+        <w:t>/</w:t>
       </w:r>
       <w:r>
         <w:rPr>
@@ -3672,14 +3419,19 @@
       </w:r>
       <w:r>
         <w:rPr>
-          <w:rFonts w:ascii="Times-Roman" w:hAnsi="Times-Roman" w:cs="Times-Roman"/>
-          <w:color w:val="auto"/>
-          <w:szCs w:val="24"/>
-          <w:lang w:val="en-US"/>
+          <w:rFonts w:ascii="Times New Roman" w:hAnsi="Times New Roman"/>
+          <w:lang w:val="en-US"/>
+        </w:rPr>
+        <w:t xml:space="preserve"> </w:t>
+      </w:r>
+      <w:r>
+        <w:rPr>
+          <w:rFonts w:ascii="Times-Roman" w:hAnsi="Times-Roman" w:cs="Times-Roman"/>
+          <w:color w:val="auto"/>
+          <w:szCs w:val="24"/>
         </w:rPr>
         <w:t>{{</w:t>
       </w:r>
-      <w:proofErr w:type="gramStart"/>
       <w:r>
         <w:rPr>
           <w:rFonts w:ascii="Times-Roman" w:hAnsi="Times-Roman" w:cs="Times-Roman"/>
@@ -3694,136 +3446,36 @@
           <w:rFonts w:ascii="Times-Roman" w:hAnsi="Times-Roman" w:cs="Times-Roman"/>
           <w:color w:val="auto"/>
           <w:szCs w:val="24"/>
-          <w:lang w:val="en-US"/>
         </w:rPr>
         <w:t>.</w:t>
       </w:r>
-      <w:r>
-        <w:rPr>
-          <w:rFonts w:ascii="Times-Roman" w:hAnsi="Times-Roman" w:cs="Times-Roman"/>
-          <w:color w:val="auto"/>
-          <w:szCs w:val="24"/>
-          <w:lang w:val="en-US"/>
-        </w:rPr>
-        <w:t>last</w:t>
-      </w:r>
-      <w:proofErr w:type="gramEnd"/>
-      <w:r>
-        <w:rPr>
-          <w:rFonts w:ascii="Times-Roman" w:hAnsi="Times-Roman" w:cs="Times-Roman"/>
-          <w:color w:val="auto"/>
-          <w:szCs w:val="24"/>
-          <w:lang w:val="en-US"/>
-        </w:rPr>
-        <w:t>_</w:t>
-      </w:r>
-      <w:r>
-        <w:rPr>
-          <w:rFonts w:ascii="Times-Roman" w:hAnsi="Times-Roman" w:cs="Times-Roman"/>
-          <w:color w:val="auto"/>
-          <w:szCs w:val="24"/>
-          <w:lang w:val="en-US"/>
-        </w:rPr>
-        <w:t>name</w:t>
-      </w:r>
-      <w:r>
-        <w:rPr>
-          <w:rFonts w:ascii="Times-Roman" w:hAnsi="Times-Roman" w:cs="Times-Roman"/>
-          <w:color w:val="auto"/>
-          <w:szCs w:val="24"/>
-          <w:lang w:val="en-US"/>
-        </w:rPr>
-        <w:t>}}{{</w:t>
-      </w:r>
-      <w:r>
-        <w:rPr>
-          <w:rFonts w:ascii="Times-Roman" w:hAnsi="Times-Roman" w:cs="Times-Roman"/>
-          <w:color w:val="auto"/>
-          <w:szCs w:val="24"/>
-          <w:lang w:val="en-US"/>
-        </w:rPr>
-        <w:t>customer</w:t>
-      </w:r>
-      <w:r>
-        <w:rPr>
-          <w:rFonts w:ascii="Times-Roman" w:hAnsi="Times-Roman" w:cs="Times-Roman"/>
-          <w:color w:val="auto"/>
-          <w:szCs w:val="24"/>
-          <w:lang w:val="en-US"/>
-        </w:rPr>
-        <w:t>.</w:t>
-      </w:r>
-      <w:r>
-        <w:rPr>
-          <w:rFonts w:ascii="Times-Roman" w:hAnsi="Times-Roman" w:cs="Times-Roman"/>
-          <w:color w:val="auto"/>
-          <w:szCs w:val="24"/>
-          <w:lang w:val="en-US"/>
-        </w:rPr>
-        <w:t>first</w:t>
-      </w:r>
-      <w:r>
-        <w:rPr>
-          <w:rFonts w:ascii="Times-Roman" w:hAnsi="Times-Roman" w:cs="Times-Roman"/>
-          <w:color w:val="auto"/>
-          <w:szCs w:val="24"/>
-          <w:lang w:val="en-US"/>
-        </w:rPr>
-        <w:t>_</w:t>
-      </w:r>
-      <w:r>
-        <w:rPr>
-          <w:rFonts w:ascii="Times-Roman" w:hAnsi="Times-Roman" w:cs="Times-Roman"/>
-          <w:color w:val="auto"/>
-          <w:szCs w:val="24"/>
-          <w:lang w:val="en-US"/>
-        </w:rPr>
-        <w:t>name</w:t>
-      </w:r>
-      <w:r>
-        <w:rPr>
-          <w:rFonts w:ascii="Times-Roman" w:hAnsi="Times-Roman" w:cs="Times-Roman"/>
-          <w:color w:val="auto"/>
-          <w:szCs w:val="24"/>
-          <w:lang w:val="en-US"/>
-        </w:rPr>
-        <w:t>}}{{</w:t>
-      </w:r>
-      <w:r>
-        <w:rPr>
-          <w:rFonts w:ascii="Times-Roman" w:hAnsi="Times-Roman" w:cs="Times-Roman"/>
-          <w:color w:val="auto"/>
-          <w:szCs w:val="24"/>
-          <w:lang w:val="en-US"/>
-        </w:rPr>
-        <w:t>customer</w:t>
-      </w:r>
-      <w:r>
-        <w:rPr>
-          <w:rFonts w:ascii="Times-Roman" w:hAnsi="Times-Roman" w:cs="Times-Roman"/>
-          <w:color w:val="auto"/>
-          <w:szCs w:val="24"/>
-          <w:lang w:val="en-US"/>
-        </w:rPr>
-        <w:t>.</w:t>
-      </w:r>
-      <w:r>
-        <w:rPr>
-          <w:rFonts w:ascii="Times-Roman" w:hAnsi="Times-Roman" w:cs="Times-Roman"/>
-          <w:color w:val="auto"/>
-          <w:szCs w:val="24"/>
-          <w:lang w:val="en-US"/>
-        </w:rPr>
-        <w:t>surname</w:t>
-      </w:r>
-      <w:r>
-        <w:rPr>
-          <w:rFonts w:ascii="Times-Roman" w:hAnsi="Times-Roman" w:cs="Times-Roman"/>
-          <w:color w:val="auto"/>
-          <w:szCs w:val="24"/>
-          <w:lang w:val="en-US"/>
-        </w:rPr>
-        <w:t>}}</w:t>
+      <w:proofErr w:type="spellStart"/>
+      <w:r>
+        <w:rPr>
+          <w:rFonts w:ascii="Times-Roman" w:hAnsi="Times-Roman" w:cs="Times-Roman"/>
+          <w:color w:val="auto"/>
+          <w:szCs w:val="24"/>
+          <w:lang w:val="en-US"/>
+        </w:rPr>
+        <w:t>short_name</w:t>
+      </w:r>
+      <w:proofErr w:type="spellEnd"/>
+      <w:r>
+        <w:rPr>
+          <w:rFonts w:ascii="Times-Roman" w:hAnsi="Times-Roman" w:cs="Times-Roman"/>
+          <w:color w:val="auto"/>
+          <w:szCs w:val="24"/>
+        </w:rPr>
+        <w:t xml:space="preserve"> }}</w:t>
+      </w:r>
+      <w:r>
+        <w:rPr>
+          <w:rFonts w:ascii="Times-Roman" w:hAnsi="Times-Roman" w:cs="Times-Roman"/>
+          <w:color w:val="auto"/>
+          <w:szCs w:val="24"/>
+          <w:lang w:val="en-US"/>
+        </w:rPr>
+        <w:t xml:space="preserve"> </w:t>
       </w:r>
       <w:r>
         <w:rPr>
@@ -5344,6 +4996,7 @@
       <w:pPr>
         <w:rPr>
           <w:rFonts w:ascii="Times New Roman" w:hAnsi="Times New Roman"/>
+          <w:lang w:val="en-US"/>
         </w:rPr>
       </w:pPr>
       <w:r>
@@ -5370,6 +5023,59 @@
           <w:rFonts w:ascii="Times New Roman" w:hAnsi="Times New Roman"/>
         </w:rPr>
         <w:t xml:space="preserve"> </w:t>
+      </w:r>
+      <w:r>
+        <w:rPr>
+          <w:rFonts w:ascii="Times-Roman" w:hAnsi="Times-Roman" w:cs="Times-Roman"/>
+          <w:color w:val="auto"/>
+          <w:szCs w:val="24"/>
+        </w:rPr>
+        <w:t>{{</w:t>
+      </w:r>
+      <w:r>
+        <w:rPr>
+          <w:rFonts w:ascii="Times-Roman" w:hAnsi="Times-Roman" w:cs="Times-Roman"/>
+          <w:color w:val="auto"/>
+          <w:szCs w:val="24"/>
+          <w:lang w:val="en-US"/>
+        </w:rPr>
+        <w:t>customer</w:t>
+      </w:r>
+      <w:r>
+        <w:rPr>
+          <w:rFonts w:ascii="Times-Roman" w:hAnsi="Times-Roman" w:cs="Times-Roman"/>
+          <w:color w:val="auto"/>
+          <w:szCs w:val="24"/>
+        </w:rPr>
+        <w:t>.</w:t>
+      </w:r>
+      <w:proofErr w:type="spellStart"/>
+      <w:r>
+        <w:rPr>
+          <w:rFonts w:ascii="Times-Roman" w:hAnsi="Times-Roman" w:cs="Times-Roman"/>
+          <w:color w:val="auto"/>
+          <w:szCs w:val="24"/>
+          <w:lang w:val="en-US"/>
+        </w:rPr>
+        <w:t>short_name</w:t>
+      </w:r>
+      <w:proofErr w:type="spellEnd"/>
+      <w:r>
+        <w:rPr>
+          <w:rFonts w:ascii="Times-Roman" w:hAnsi="Times-Roman" w:cs="Times-Roman"/>
+          <w:color w:val="auto"/>
+          <w:szCs w:val="24"/>
+        </w:rPr>
+        <w:t xml:space="preserve"> }}</w:t>
+      </w:r>
+      <w:r>
+        <w:rPr>
+          <w:rFonts w:ascii="Times-Roman" w:hAnsi="Times-Roman" w:cs="Times-Roman"/>
+          <w:color w:val="auto"/>
+          <w:szCs w:val="24"/>
+          <w:lang w:val="en-US"/>
+        </w:rPr>
+        <w:t xml:space="preserve"> /</w:t>
       </w:r>
     </w:p>
     <w:p>
@@ -5436,23 +5142,8 @@
         <w:rPr>
           <w:rFonts w:ascii="Times New Roman" w:hAnsi="Times New Roman"/>
         </w:rPr>
-        <w:t xml:space="preserve">Для оплаты инвойса, выставленного китайской </w:t>
-      </w:r>
-      <w:proofErr w:type="gramStart"/>
-      <w:r>
-        <w:rPr>
-          <w:rFonts w:ascii="Times New Roman" w:hAnsi="Times New Roman"/>
-        </w:rPr>
-        <w:t>стороной  на</w:t>
-      </w:r>
-      <w:proofErr w:type="gramEnd"/>
-      <w:r>
-        <w:rPr>
-          <w:rFonts w:ascii="Times New Roman" w:hAnsi="Times New Roman"/>
-        </w:rPr>
-        <w:t xml:space="preserve"> приобретение автомобиля, Заказчику необходимо открыть дебетовую карту и установить приложение Банка ВТБ (в любом отделении РФ). Пополнить счет на сумму стоимости автомобиля в рублях согласно текущего курса покупки юаней </w:t>
-      </w:r>
-      <w:proofErr w:type="gramStart"/>
+        <w:t xml:space="preserve">Для оплаты инвойса, выставленного китайской стороной  на приобретение автомобиля, Заказчику необходимо открыть дебетовую карту и установить приложение Банка ВТБ (в любом отделении РФ). Пополнить счет на сумму стоимости автомобиля в рублях согласно текущего курса покупки юаней </w:t>
+      </w:r>
       <w:r>
         <w:rPr>
           <w:rFonts w:ascii="Times New Roman" w:hAnsi="Times New Roman"/>
@@ -5465,14 +5156,7 @@
         <w:rPr>
           <w:rFonts w:ascii="Times New Roman" w:hAnsi="Times New Roman"/>
         </w:rPr>
-        <w:t xml:space="preserve">  Банка</w:t>
-      </w:r>
-      <w:proofErr w:type="gramEnd"/>
-      <w:r>
-        <w:rPr>
-          <w:rFonts w:ascii="Times New Roman" w:hAnsi="Times New Roman"/>
-        </w:rPr>
-        <w:t xml:space="preserve"> ВТБ. Через приложение осуществить покупку юаней </w:t>
+        <w:t xml:space="preserve">  Банка ВТБ. Через приложение осуществить покупку юаней </w:t>
       </w:r>
       <w:r>
         <w:rPr>
@@ -5689,622 +5373,588 @@
           <w:rFonts w:ascii="Times New Roman" w:hAnsi="Times New Roman"/>
           <w:sz w:val="22"/>
         </w:rPr>
-        <w:t>Настоящим я</w:t>
-      </w:r>
-      <w:proofErr w:type="gramStart"/>
+        <w:t xml:space="preserve">Настоящим я, </w:t>
+      </w:r>
+      <w:r>
+        <w:rPr>
+          <w:rFonts w:ascii="Times New Roman" w:hAnsi="Times New Roman"/>
+          <w:b/>
+        </w:rPr>
+        <w:t xml:space="preserve">: </w:t>
+      </w:r>
+      <w:r>
+        <w:rPr>
+          <w:rFonts w:ascii="Times-Roman" w:hAnsi="Times-Roman" w:cs="Times-Roman"/>
+          <w:color w:val="auto"/>
+          <w:szCs w:val="24"/>
+        </w:rPr>
+        <w:t>{{</w:t>
+      </w:r>
+      <w:r>
+        <w:rPr>
+          <w:rFonts w:ascii="Times-Roman" w:hAnsi="Times-Roman" w:cs="Times-Roman"/>
+          <w:color w:val="auto"/>
+          <w:szCs w:val="24"/>
+          <w:lang w:val="en-US"/>
+        </w:rPr>
+        <w:t>customer</w:t>
+      </w:r>
+      <w:r>
+        <w:rPr>
+          <w:rFonts w:ascii="Times-Roman" w:hAnsi="Times-Roman" w:cs="Times-Roman"/>
+          <w:color w:val="auto"/>
+          <w:szCs w:val="24"/>
+        </w:rPr>
+        <w:t>.</w:t>
+      </w:r>
+      <w:r>
+        <w:rPr>
+          <w:rFonts w:ascii="Times-Roman" w:hAnsi="Times-Roman" w:cs="Times-Roman"/>
+          <w:color w:val="auto"/>
+          <w:szCs w:val="24"/>
+          <w:lang w:val="en-US"/>
+        </w:rPr>
+        <w:t>last</w:t>
+      </w:r>
+      <w:r>
+        <w:rPr>
+          <w:rFonts w:ascii="Times-Roman" w:hAnsi="Times-Roman" w:cs="Times-Roman"/>
+          <w:color w:val="auto"/>
+          <w:szCs w:val="24"/>
+        </w:rPr>
+        <w:t>_</w:t>
+      </w:r>
+      <w:r>
+        <w:rPr>
+          <w:rFonts w:ascii="Times-Roman" w:hAnsi="Times-Roman" w:cs="Times-Roman"/>
+          <w:color w:val="auto"/>
+          <w:szCs w:val="24"/>
+          <w:lang w:val="en-US"/>
+        </w:rPr>
+        <w:t>name</w:t>
+      </w:r>
+      <w:r>
+        <w:rPr>
+          <w:rFonts w:ascii="Times-Roman" w:hAnsi="Times-Roman" w:cs="Times-Roman"/>
+          <w:color w:val="auto"/>
+          <w:szCs w:val="24"/>
+        </w:rPr>
+        <w:t>}} {{</w:t>
+      </w:r>
+      <w:r>
+        <w:rPr>
+          <w:rFonts w:ascii="Times-Roman" w:hAnsi="Times-Roman" w:cs="Times-Roman"/>
+          <w:color w:val="auto"/>
+          <w:szCs w:val="24"/>
+          <w:lang w:val="en-US"/>
+        </w:rPr>
+        <w:t>customer</w:t>
+      </w:r>
+      <w:r>
+        <w:rPr>
+          <w:rFonts w:ascii="Times-Roman" w:hAnsi="Times-Roman" w:cs="Times-Roman"/>
+          <w:color w:val="auto"/>
+          <w:szCs w:val="24"/>
+        </w:rPr>
+        <w:t>.</w:t>
+      </w:r>
+      <w:r>
+        <w:rPr>
+          <w:rFonts w:ascii="Times-Roman" w:hAnsi="Times-Roman" w:cs="Times-Roman"/>
+          <w:color w:val="auto"/>
+          <w:szCs w:val="24"/>
+          <w:lang w:val="en-US"/>
+        </w:rPr>
+        <w:t>first</w:t>
+      </w:r>
+      <w:r>
+        <w:rPr>
+          <w:rFonts w:ascii="Times-Roman" w:hAnsi="Times-Roman" w:cs="Times-Roman"/>
+          <w:color w:val="auto"/>
+          <w:szCs w:val="24"/>
+        </w:rPr>
+        <w:t>_</w:t>
+      </w:r>
+      <w:r>
+        <w:rPr>
+          <w:rFonts w:ascii="Times-Roman" w:hAnsi="Times-Roman" w:cs="Times-Roman"/>
+          <w:color w:val="auto"/>
+          <w:szCs w:val="24"/>
+          <w:lang w:val="en-US"/>
+        </w:rPr>
+        <w:t>name</w:t>
+      </w:r>
+      <w:r>
+        <w:rPr>
+          <w:rFonts w:ascii="Times-Roman" w:hAnsi="Times-Roman" w:cs="Times-Roman"/>
+          <w:color w:val="auto"/>
+          <w:szCs w:val="24"/>
+        </w:rPr>
+        <w:t>}} {{</w:t>
+      </w:r>
+      <w:r>
+        <w:rPr>
+          <w:rFonts w:ascii="Times-Roman" w:hAnsi="Times-Roman" w:cs="Times-Roman"/>
+          <w:color w:val="auto"/>
+          <w:szCs w:val="24"/>
+          <w:lang w:val="en-US"/>
+        </w:rPr>
+        <w:t>customer</w:t>
+      </w:r>
+      <w:r>
+        <w:rPr>
+          <w:rFonts w:ascii="Times-Roman" w:hAnsi="Times-Roman" w:cs="Times-Roman"/>
+          <w:color w:val="auto"/>
+          <w:szCs w:val="24"/>
+        </w:rPr>
+        <w:t>.</w:t>
+      </w:r>
+      <w:r>
+        <w:rPr>
+          <w:rFonts w:ascii="Times-Roman" w:hAnsi="Times-Roman" w:cs="Times-Roman"/>
+          <w:color w:val="auto"/>
+          <w:szCs w:val="24"/>
+          <w:lang w:val="en-US"/>
+        </w:rPr>
+        <w:t>surname</w:t>
+      </w:r>
+      <w:r>
+        <w:rPr>
+          <w:rFonts w:ascii="Times-Roman" w:hAnsi="Times-Roman" w:cs="Times-Roman"/>
+          <w:color w:val="auto"/>
+          <w:szCs w:val="24"/>
+        </w:rPr>
+        <w:t>}}</w:t>
+      </w:r>
+    </w:p>
+    <w:p>
+      <w:pPr>
+        <w:rPr>
+          <w:rFonts w:ascii="Times New Roman" w:hAnsi="Times New Roman"/>
+        </w:rPr>
+      </w:pPr>
+      <w:r>
+        <w:rPr>
+          <w:rFonts w:ascii="Times New Roman" w:hAnsi="Times New Roman"/>
+        </w:rPr>
+        <w:t>Паспорт</w:t>
+      </w:r>
+      <w:r>
+        <w:rPr>
+          <w:rFonts w:ascii="Times New Roman" w:hAnsi="Times New Roman"/>
+        </w:rPr>
+        <w:t xml:space="preserve">: </w:t>
+      </w:r>
+      <w:r>
+        <w:rPr>
+          <w:rFonts w:ascii="Times-Roman" w:hAnsi="Times-Roman" w:cs="Times-Roman"/>
+          <w:color w:val="auto"/>
+          <w:szCs w:val="24"/>
+        </w:rPr>
+        <w:t>{{</w:t>
+      </w:r>
+      <w:r>
+        <w:rPr>
+          <w:rFonts w:ascii="Times-Roman" w:hAnsi="Times-Roman" w:cs="Times-Roman"/>
+          <w:color w:val="auto"/>
+          <w:szCs w:val="24"/>
+          <w:lang w:val="en-US"/>
+        </w:rPr>
+        <w:t>customer</w:t>
+      </w:r>
+      <w:r>
+        <w:rPr>
+          <w:rFonts w:ascii="Times-Roman" w:hAnsi="Times-Roman" w:cs="Times-Roman"/>
+          <w:color w:val="auto"/>
+          <w:szCs w:val="24"/>
+        </w:rPr>
+        <w:t>.</w:t>
+      </w:r>
+      <w:r>
+        <w:rPr>
+          <w:rFonts w:ascii="Times-Roman" w:hAnsi="Times-Roman" w:cs="Times-Roman"/>
+          <w:color w:val="auto"/>
+          <w:szCs w:val="24"/>
+          <w:lang w:val="en-US"/>
+        </w:rPr>
+        <w:t>passport</w:t>
+      </w:r>
+      <w:r>
+        <w:rPr>
+          <w:rFonts w:ascii="Times-Roman" w:hAnsi="Times-Roman" w:cs="Times-Roman"/>
+          <w:color w:val="auto"/>
+          <w:szCs w:val="24"/>
+        </w:rPr>
+        <w:t>}},</w:t>
+      </w:r>
+      <w:r>
+        <w:rPr>
+          <w:rFonts w:ascii="Times New Roman" w:hAnsi="Times New Roman"/>
+        </w:rPr>
+        <w:t xml:space="preserve">  </w:t>
+      </w:r>
+      <w:r>
+        <w:rPr>
+          <w:rFonts w:ascii="Times New Roman" w:hAnsi="Times New Roman"/>
+        </w:rPr>
+        <w:t>выдан</w:t>
+      </w:r>
+      <w:r>
+        <w:rPr>
+          <w:rFonts w:ascii="Times New Roman" w:hAnsi="Times New Roman"/>
+        </w:rPr>
+        <w:t xml:space="preserve"> </w:t>
+      </w:r>
+      <w:r>
+        <w:rPr>
+          <w:rFonts w:ascii="Times-Roman" w:hAnsi="Times-Roman" w:cs="Times-Roman"/>
+          <w:color w:val="auto"/>
+          <w:szCs w:val="24"/>
+        </w:rPr>
+        <w:t>{{</w:t>
+      </w:r>
+      <w:r>
+        <w:rPr>
+          <w:rFonts w:ascii="Times-Roman" w:hAnsi="Times-Roman" w:cs="Times-Roman"/>
+          <w:color w:val="auto"/>
+          <w:szCs w:val="24"/>
+          <w:lang w:val="en-US"/>
+        </w:rPr>
+        <w:t>customer</w:t>
+      </w:r>
+      <w:r>
+        <w:rPr>
+          <w:rFonts w:ascii="Times-Roman" w:hAnsi="Times-Roman" w:cs="Times-Roman"/>
+          <w:color w:val="auto"/>
+          <w:szCs w:val="24"/>
+        </w:rPr>
+        <w:t>.</w:t>
+      </w:r>
+      <w:r>
+        <w:rPr>
+          <w:rFonts w:ascii="Times-Roman" w:hAnsi="Times-Roman" w:cs="Times-Roman"/>
+          <w:color w:val="auto"/>
+          <w:szCs w:val="24"/>
+          <w:lang w:val="en-US"/>
+        </w:rPr>
+        <w:t>date</w:t>
+      </w:r>
+      <w:r>
+        <w:rPr>
+          <w:rFonts w:ascii="Times-Roman" w:hAnsi="Times-Roman" w:cs="Times-Roman"/>
+          <w:color w:val="auto"/>
+          <w:szCs w:val="24"/>
+        </w:rPr>
+        <w:t>_</w:t>
+      </w:r>
+      <w:r>
+        <w:rPr>
+          <w:rFonts w:ascii="Times-Roman" w:hAnsi="Times-Roman" w:cs="Times-Roman"/>
+          <w:color w:val="auto"/>
+          <w:szCs w:val="24"/>
+          <w:lang w:val="en-US"/>
+        </w:rPr>
+        <w:t>issue</w:t>
+      </w:r>
+      <w:r>
+        <w:rPr>
+          <w:rFonts w:ascii="Times-Roman" w:hAnsi="Times-Roman" w:cs="Times-Roman"/>
+          <w:color w:val="auto"/>
+          <w:szCs w:val="24"/>
+        </w:rPr>
+        <w:t>}}</w:t>
+      </w:r>
+      <w:r>
+        <w:rPr>
+          <w:rFonts w:ascii="Times New Roman" w:hAnsi="Times New Roman"/>
+        </w:rPr>
+        <w:t xml:space="preserve"> </w:t>
+      </w:r>
+      <w:r>
+        <w:rPr>
+          <w:rFonts w:ascii="Times-Roman" w:hAnsi="Times-Roman" w:cs="Times-Roman"/>
+          <w:color w:val="auto"/>
+          <w:szCs w:val="24"/>
+        </w:rPr>
+        <w:t>{{</w:t>
+      </w:r>
+      <w:r>
+        <w:rPr>
+          <w:rFonts w:ascii="Times-Roman" w:hAnsi="Times-Roman" w:cs="Times-Roman"/>
+          <w:color w:val="auto"/>
+          <w:szCs w:val="24"/>
+          <w:lang w:val="en-US"/>
+        </w:rPr>
+        <w:t>customer</w:t>
+      </w:r>
+      <w:r>
+        <w:rPr>
+          <w:rFonts w:ascii="Times-Roman" w:hAnsi="Times-Roman" w:cs="Times-Roman"/>
+          <w:color w:val="auto"/>
+          <w:szCs w:val="24"/>
+        </w:rPr>
+        <w:t>.</w:t>
+      </w:r>
+      <w:r>
+        <w:rPr>
+          <w:rFonts w:ascii="Times-Roman" w:hAnsi="Times-Roman" w:cs="Times-Roman"/>
+          <w:color w:val="auto"/>
+          <w:szCs w:val="24"/>
+          <w:lang w:val="en-US"/>
+        </w:rPr>
+        <w:t>by</w:t>
+      </w:r>
+      <w:r>
+        <w:rPr>
+          <w:rFonts w:ascii="Times-Roman" w:hAnsi="Times-Roman" w:cs="Times-Roman"/>
+          <w:color w:val="auto"/>
+          <w:szCs w:val="24"/>
+        </w:rPr>
+        <w:t>_</w:t>
+      </w:r>
+      <w:r>
+        <w:rPr>
+          <w:rFonts w:ascii="Times-Roman" w:hAnsi="Times-Roman" w:cs="Times-Roman"/>
+          <w:color w:val="auto"/>
+          <w:szCs w:val="24"/>
+          <w:lang w:val="en-US"/>
+        </w:rPr>
+        <w:t>whom</w:t>
+      </w:r>
+      <w:r>
+        <w:rPr>
+          <w:rFonts w:ascii="Times-Roman" w:hAnsi="Times-Roman" w:cs="Times-Roman"/>
+          <w:color w:val="auto"/>
+          <w:szCs w:val="24"/>
+        </w:rPr>
+        <w:t>_</w:t>
+      </w:r>
+      <w:r>
+        <w:rPr>
+          <w:rFonts w:ascii="Times-Roman" w:hAnsi="Times-Roman" w:cs="Times-Roman"/>
+          <w:color w:val="auto"/>
+          <w:szCs w:val="24"/>
+          <w:lang w:val="en-US"/>
+        </w:rPr>
+        <w:t>issued</w:t>
+      </w:r>
+      <w:r>
+        <w:rPr>
+          <w:rFonts w:ascii="Times-Roman" w:hAnsi="Times-Roman" w:cs="Times-Roman"/>
+          <w:color w:val="auto"/>
+          <w:szCs w:val="24"/>
+        </w:rPr>
+        <w:t>}},</w:t>
+      </w:r>
+      <w:r>
+        <w:rPr>
+          <w:rFonts w:ascii="Times New Roman" w:hAnsi="Times New Roman"/>
+        </w:rPr>
+        <w:t xml:space="preserve"> </w:t>
+      </w:r>
+      <w:r>
+        <w:rPr>
+          <w:rFonts w:ascii="Times New Roman" w:hAnsi="Times New Roman"/>
+        </w:rPr>
+        <w:t>код</w:t>
+      </w:r>
+      <w:r>
+        <w:rPr>
+          <w:rFonts w:ascii="Times New Roman" w:hAnsi="Times New Roman"/>
+        </w:rPr>
+        <w:t xml:space="preserve"> </w:t>
+      </w:r>
+      <w:r>
+        <w:rPr>
+          <w:rFonts w:ascii="Times New Roman" w:hAnsi="Times New Roman"/>
+        </w:rPr>
+        <w:t>подразделения</w:t>
+      </w:r>
+      <w:r>
+        <w:rPr>
+          <w:rFonts w:ascii="Times New Roman" w:hAnsi="Times New Roman"/>
+        </w:rPr>
+        <w:t xml:space="preserve"> </w:t>
+      </w:r>
+      <w:r>
+        <w:rPr>
+          <w:rFonts w:ascii="Times-Roman" w:hAnsi="Times-Roman" w:cs="Times-Roman"/>
+          <w:color w:val="auto"/>
+          <w:szCs w:val="24"/>
+        </w:rPr>
+        <w:t>{{</w:t>
+      </w:r>
+      <w:r>
+        <w:rPr>
+          <w:rFonts w:ascii="Times-Roman" w:hAnsi="Times-Roman" w:cs="Times-Roman"/>
+          <w:color w:val="auto"/>
+          <w:szCs w:val="24"/>
+          <w:lang w:val="en-US"/>
+        </w:rPr>
+        <w:t>customer</w:t>
+      </w:r>
+      <w:r>
+        <w:rPr>
+          <w:rFonts w:ascii="Times-Roman" w:hAnsi="Times-Roman" w:cs="Times-Roman"/>
+          <w:color w:val="auto"/>
+          <w:szCs w:val="24"/>
+        </w:rPr>
+        <w:t>.</w:t>
+      </w:r>
+      <w:r>
+        <w:rPr>
+          <w:rFonts w:ascii="Times-Roman" w:hAnsi="Times-Roman" w:cs="Times-Roman"/>
+          <w:color w:val="auto"/>
+          <w:szCs w:val="24"/>
+          <w:lang w:val="en-US"/>
+        </w:rPr>
+        <w:t>department</w:t>
+      </w:r>
+      <w:r>
+        <w:rPr>
+          <w:rFonts w:ascii="Times-Roman" w:hAnsi="Times-Roman" w:cs="Times-Roman"/>
+          <w:color w:val="auto"/>
+          <w:szCs w:val="24"/>
+        </w:rPr>
+        <w:t>_</w:t>
+      </w:r>
+      <w:r>
+        <w:rPr>
+          <w:rFonts w:ascii="Times-Roman" w:hAnsi="Times-Roman" w:cs="Times-Roman"/>
+          <w:color w:val="auto"/>
+          <w:szCs w:val="24"/>
+          <w:lang w:val="en-US"/>
+        </w:rPr>
+        <w:t>code</w:t>
+      </w:r>
+      <w:r>
+        <w:rPr>
+          <w:rFonts w:ascii="Times-Roman" w:hAnsi="Times-Roman" w:cs="Times-Roman"/>
+          <w:color w:val="auto"/>
+          <w:szCs w:val="24"/>
+        </w:rPr>
+        <w:t>}}</w:t>
+      </w:r>
+      <w:r>
+        <w:rPr>
+          <w:rFonts w:ascii="Times New Roman" w:hAnsi="Times New Roman"/>
+        </w:rPr>
+        <w:t xml:space="preserve">:  </w:t>
+      </w:r>
+      <w:r>
+        <w:rPr>
+          <w:rFonts w:ascii="Times New Roman" w:hAnsi="Times New Roman"/>
+        </w:rPr>
+        <w:t>Адрес</w:t>
+      </w:r>
+      <w:r>
+        <w:rPr>
+          <w:rFonts w:ascii="Times New Roman" w:hAnsi="Times New Roman"/>
+        </w:rPr>
+        <w:t xml:space="preserve"> </w:t>
+      </w:r>
+      <w:r>
+        <w:rPr>
+          <w:rFonts w:ascii="Times New Roman" w:hAnsi="Times New Roman"/>
+          <w:color w:val="000000" w:themeColor="text1"/>
+        </w:rPr>
+        <w:t>регистрации</w:t>
+      </w:r>
+      <w:r>
+        <w:rPr>
+          <w:rFonts w:ascii="Times New Roman" w:hAnsi="Times New Roman"/>
+          <w:color w:val="000000" w:themeColor="text1"/>
+        </w:rPr>
+        <w:t xml:space="preserve">: </w:t>
+      </w:r>
+      <w:r>
+        <w:rPr>
+          <w:rFonts w:ascii="Times-Roman" w:hAnsi="Times-Roman" w:cs="Times-Roman"/>
+          <w:color w:val="auto"/>
+          <w:szCs w:val="24"/>
+        </w:rPr>
+        <w:t>{{</w:t>
+      </w:r>
+      <w:r>
+        <w:rPr>
+          <w:rFonts w:ascii="Times-Roman" w:hAnsi="Times-Roman" w:cs="Times-Roman"/>
+          <w:color w:val="auto"/>
+          <w:szCs w:val="24"/>
+          <w:lang w:val="en-US"/>
+        </w:rPr>
+        <w:t>customer</w:t>
+      </w:r>
+      <w:r>
+        <w:rPr>
+          <w:rFonts w:ascii="Times-Roman" w:hAnsi="Times-Roman" w:cs="Times-Roman"/>
+          <w:color w:val="auto"/>
+          <w:szCs w:val="24"/>
+        </w:rPr>
+        <w:t>.</w:t>
+      </w:r>
+      <w:r>
+        <w:rPr>
+          <w:rFonts w:ascii="Times-Roman" w:hAnsi="Times-Roman" w:cs="Times-Roman"/>
+          <w:color w:val="auto"/>
+          <w:szCs w:val="24"/>
+          <w:lang w:val="en-US"/>
+        </w:rPr>
+        <w:t>registration</w:t>
+      </w:r>
+      <w:r>
+        <w:rPr>
+          <w:rFonts w:ascii="Times-Roman" w:hAnsi="Times-Roman" w:cs="Times-Roman"/>
+          <w:color w:val="auto"/>
+          <w:szCs w:val="24"/>
+        </w:rPr>
+        <w:t>_</w:t>
+      </w:r>
+      <w:r>
+        <w:rPr>
+          <w:rFonts w:ascii="Times-Roman" w:hAnsi="Times-Roman" w:cs="Times-Roman"/>
+          <w:color w:val="auto"/>
+          <w:szCs w:val="24"/>
+          <w:lang w:val="en-US"/>
+        </w:rPr>
+        <w:t>address</w:t>
+      </w:r>
+      <w:r>
+        <w:rPr>
+          <w:rFonts w:ascii="Times-Roman" w:hAnsi="Times-Roman" w:cs="Times-Roman"/>
+          <w:color w:val="auto"/>
+          <w:szCs w:val="24"/>
+        </w:rPr>
+        <w:t>}}</w:t>
+      </w:r>
+    </w:p>
+    <w:p>
+      <w:pPr>
+        <w:rPr>
+          <w:rFonts w:ascii="Times New Roman" w:hAnsi="Times New Roman"/>
+        </w:rPr>
+      </w:pPr>
       <w:r>
         <w:rPr>
           <w:rFonts w:ascii="Times New Roman" w:hAnsi="Times New Roman"/>
           <w:sz w:val="22"/>
         </w:rPr>
-        <w:t xml:space="preserve">, </w:t>
-      </w:r>
-      <w:r>
-        <w:rPr>
-          <w:rFonts w:ascii="Times New Roman" w:hAnsi="Times New Roman"/>
-          <w:b/>
-        </w:rPr>
-        <w:t>:</w:t>
-      </w:r>
-      <w:proofErr w:type="gramEnd"/>
-      <w:r>
-        <w:rPr>
-          <w:rFonts w:ascii="Times New Roman" w:hAnsi="Times New Roman"/>
-          <w:b/>
-        </w:rPr>
-        <w:t xml:space="preserve"> </w:t>
-      </w:r>
-      <w:r>
-        <w:rPr>
-          <w:rFonts w:ascii="Times-Roman" w:hAnsi="Times-Roman" w:cs="Times-Roman"/>
-          <w:color w:val="auto"/>
-          <w:szCs w:val="24"/>
-        </w:rPr>
-        <w:t>{{</w:t>
-      </w:r>
-      <w:r>
-        <w:rPr>
-          <w:rFonts w:ascii="Times-Roman" w:hAnsi="Times-Roman" w:cs="Times-Roman"/>
-          <w:color w:val="auto"/>
-          <w:szCs w:val="24"/>
-          <w:lang w:val="en-US"/>
-        </w:rPr>
-        <w:t>customer</w:t>
-      </w:r>
-      <w:r>
-        <w:rPr>
-          <w:rFonts w:ascii="Times-Roman" w:hAnsi="Times-Roman" w:cs="Times-Roman"/>
-          <w:color w:val="auto"/>
-          <w:szCs w:val="24"/>
-        </w:rPr>
-        <w:t>.</w:t>
-      </w:r>
-      <w:r>
-        <w:rPr>
-          <w:rFonts w:ascii="Times-Roman" w:hAnsi="Times-Roman" w:cs="Times-Roman"/>
-          <w:color w:val="auto"/>
-          <w:szCs w:val="24"/>
-          <w:lang w:val="en-US"/>
-        </w:rPr>
-        <w:t>last</w:t>
-      </w:r>
-      <w:r>
-        <w:rPr>
-          <w:rFonts w:ascii="Times-Roman" w:hAnsi="Times-Roman" w:cs="Times-Roman"/>
-          <w:color w:val="auto"/>
-          <w:szCs w:val="24"/>
-        </w:rPr>
-        <w:t>_</w:t>
-      </w:r>
-      <w:r>
-        <w:rPr>
-          <w:rFonts w:ascii="Times-Roman" w:hAnsi="Times-Roman" w:cs="Times-Roman"/>
-          <w:color w:val="auto"/>
-          <w:szCs w:val="24"/>
-          <w:lang w:val="en-US"/>
-        </w:rPr>
-        <w:t>name</w:t>
-      </w:r>
-      <w:r>
-        <w:rPr>
-          <w:rFonts w:ascii="Times-Roman" w:hAnsi="Times-Roman" w:cs="Times-Roman"/>
-          <w:color w:val="auto"/>
-          <w:szCs w:val="24"/>
-        </w:rPr>
-        <w:t>}} {{</w:t>
-      </w:r>
-      <w:r>
-        <w:rPr>
-          <w:rFonts w:ascii="Times-Roman" w:hAnsi="Times-Roman" w:cs="Times-Roman"/>
-          <w:color w:val="auto"/>
-          <w:szCs w:val="24"/>
-          <w:lang w:val="en-US"/>
-        </w:rPr>
-        <w:t>customer</w:t>
-      </w:r>
-      <w:r>
-        <w:rPr>
-          <w:rFonts w:ascii="Times-Roman" w:hAnsi="Times-Roman" w:cs="Times-Roman"/>
-          <w:color w:val="auto"/>
-          <w:szCs w:val="24"/>
-        </w:rPr>
-        <w:t>.</w:t>
-      </w:r>
-      <w:r>
-        <w:rPr>
-          <w:rFonts w:ascii="Times-Roman" w:hAnsi="Times-Roman" w:cs="Times-Roman"/>
-          <w:color w:val="auto"/>
-          <w:szCs w:val="24"/>
-          <w:lang w:val="en-US"/>
-        </w:rPr>
-        <w:t>first</w:t>
-      </w:r>
-      <w:r>
-        <w:rPr>
-          <w:rFonts w:ascii="Times-Roman" w:hAnsi="Times-Roman" w:cs="Times-Roman"/>
-          <w:color w:val="auto"/>
-          <w:szCs w:val="24"/>
-        </w:rPr>
-        <w:t>_</w:t>
-      </w:r>
-      <w:r>
-        <w:rPr>
-          <w:rFonts w:ascii="Times-Roman" w:hAnsi="Times-Roman" w:cs="Times-Roman"/>
-          <w:color w:val="auto"/>
-          <w:szCs w:val="24"/>
-          <w:lang w:val="en-US"/>
-        </w:rPr>
-        <w:t>name</w:t>
-      </w:r>
-      <w:r>
-        <w:rPr>
-          <w:rFonts w:ascii="Times-Roman" w:hAnsi="Times-Roman" w:cs="Times-Roman"/>
-          <w:color w:val="auto"/>
-          <w:szCs w:val="24"/>
-        </w:rPr>
-        <w:t>}} {{</w:t>
-      </w:r>
-      <w:r>
-        <w:rPr>
-          <w:rFonts w:ascii="Times-Roman" w:hAnsi="Times-Roman" w:cs="Times-Roman"/>
-          <w:color w:val="auto"/>
-          <w:szCs w:val="24"/>
-          <w:lang w:val="en-US"/>
-        </w:rPr>
-        <w:t>customer</w:t>
-      </w:r>
-      <w:r>
-        <w:rPr>
-          <w:rFonts w:ascii="Times-Roman" w:hAnsi="Times-Roman" w:cs="Times-Roman"/>
-          <w:color w:val="auto"/>
-          <w:szCs w:val="24"/>
-        </w:rPr>
-        <w:t>.</w:t>
-      </w:r>
-      <w:r>
-        <w:rPr>
-          <w:rFonts w:ascii="Times-Roman" w:hAnsi="Times-Roman" w:cs="Times-Roman"/>
-          <w:color w:val="auto"/>
-          <w:szCs w:val="24"/>
-          <w:lang w:val="en-US"/>
-        </w:rPr>
-        <w:t>surname</w:t>
-      </w:r>
-      <w:r>
-        <w:rPr>
-          <w:rFonts w:ascii="Times-Roman" w:hAnsi="Times-Roman" w:cs="Times-Roman"/>
-          <w:color w:val="auto"/>
-          <w:szCs w:val="24"/>
-        </w:rPr>
-        <w:t>}}</w:t>
-      </w:r>
-    </w:p>
-    <w:p>
-      <w:pPr>
-        <w:rPr>
-          <w:rFonts w:ascii="Times New Roman" w:hAnsi="Times New Roman"/>
-        </w:rPr>
-      </w:pPr>
-      <w:r>
-        <w:rPr>
-          <w:rFonts w:ascii="Times New Roman" w:hAnsi="Times New Roman"/>
-        </w:rPr>
-        <w:t>Паспорт</w:t>
-      </w:r>
-      <w:r>
-        <w:rPr>
-          <w:rFonts w:ascii="Times New Roman" w:hAnsi="Times New Roman"/>
-        </w:rPr>
-        <w:t xml:space="preserve">: </w:t>
-      </w:r>
-      <w:r>
-        <w:rPr>
-          <w:rFonts w:ascii="Times-Roman" w:hAnsi="Times-Roman" w:cs="Times-Roman"/>
-          <w:color w:val="auto"/>
-          <w:szCs w:val="24"/>
-        </w:rPr>
-        <w:t>{{</w:t>
-      </w:r>
-      <w:proofErr w:type="gramStart"/>
-      <w:r>
-        <w:rPr>
-          <w:rFonts w:ascii="Times-Roman" w:hAnsi="Times-Roman" w:cs="Times-Roman"/>
-          <w:color w:val="auto"/>
-          <w:szCs w:val="24"/>
-          <w:lang w:val="en-US"/>
-        </w:rPr>
-        <w:t>customer</w:t>
-      </w:r>
-      <w:r>
-        <w:rPr>
-          <w:rFonts w:ascii="Times-Roman" w:hAnsi="Times-Roman" w:cs="Times-Roman"/>
-          <w:color w:val="auto"/>
-          <w:szCs w:val="24"/>
-        </w:rPr>
-        <w:t>.</w:t>
-      </w:r>
-      <w:r>
-        <w:rPr>
-          <w:rFonts w:ascii="Times-Roman" w:hAnsi="Times-Roman" w:cs="Times-Roman"/>
-          <w:color w:val="auto"/>
-          <w:szCs w:val="24"/>
-          <w:lang w:val="en-US"/>
-        </w:rPr>
-        <w:t>passport</w:t>
-      </w:r>
-      <w:proofErr w:type="gramEnd"/>
-      <w:r>
-        <w:rPr>
-          <w:rFonts w:ascii="Times-Roman" w:hAnsi="Times-Roman" w:cs="Times-Roman"/>
-          <w:color w:val="auto"/>
-          <w:szCs w:val="24"/>
-        </w:rPr>
-        <w:t>}},</w:t>
-      </w:r>
-      <w:r>
-        <w:rPr>
-          <w:rFonts w:ascii="Times New Roman" w:hAnsi="Times New Roman"/>
-        </w:rPr>
-        <w:t xml:space="preserve">  </w:t>
-      </w:r>
-      <w:r>
-        <w:rPr>
-          <w:rFonts w:ascii="Times New Roman" w:hAnsi="Times New Roman"/>
-        </w:rPr>
-        <w:t>выдан</w:t>
-      </w:r>
-      <w:r>
-        <w:rPr>
-          <w:rFonts w:ascii="Times New Roman" w:hAnsi="Times New Roman"/>
-        </w:rPr>
-        <w:t xml:space="preserve"> </w:t>
-      </w:r>
-      <w:r>
-        <w:rPr>
-          <w:rFonts w:ascii="Times-Roman" w:hAnsi="Times-Roman" w:cs="Times-Roman"/>
-          <w:color w:val="auto"/>
-          <w:szCs w:val="24"/>
-        </w:rPr>
-        <w:t>{{</w:t>
-      </w:r>
-      <w:r>
-        <w:rPr>
-          <w:rFonts w:ascii="Times-Roman" w:hAnsi="Times-Roman" w:cs="Times-Roman"/>
-          <w:color w:val="auto"/>
-          <w:szCs w:val="24"/>
-          <w:lang w:val="en-US"/>
-        </w:rPr>
-        <w:t>customer</w:t>
-      </w:r>
-      <w:r>
-        <w:rPr>
-          <w:rFonts w:ascii="Times-Roman" w:hAnsi="Times-Roman" w:cs="Times-Roman"/>
-          <w:color w:val="auto"/>
-          <w:szCs w:val="24"/>
-        </w:rPr>
-        <w:t>.</w:t>
-      </w:r>
-      <w:r>
-        <w:rPr>
-          <w:rFonts w:ascii="Times-Roman" w:hAnsi="Times-Roman" w:cs="Times-Roman"/>
-          <w:color w:val="auto"/>
-          <w:szCs w:val="24"/>
-          <w:lang w:val="en-US"/>
-        </w:rPr>
-        <w:t>date</w:t>
-      </w:r>
-      <w:r>
-        <w:rPr>
-          <w:rFonts w:ascii="Times-Roman" w:hAnsi="Times-Roman" w:cs="Times-Roman"/>
-          <w:color w:val="auto"/>
-          <w:szCs w:val="24"/>
-        </w:rPr>
-        <w:t>_</w:t>
-      </w:r>
-      <w:r>
-        <w:rPr>
-          <w:rFonts w:ascii="Times-Roman" w:hAnsi="Times-Roman" w:cs="Times-Roman"/>
-          <w:color w:val="auto"/>
-          <w:szCs w:val="24"/>
-          <w:lang w:val="en-US"/>
-        </w:rPr>
-        <w:t>issue</w:t>
-      </w:r>
-      <w:r>
-        <w:rPr>
-          <w:rFonts w:ascii="Times-Roman" w:hAnsi="Times-Roman" w:cs="Times-Roman"/>
-          <w:color w:val="auto"/>
-          <w:szCs w:val="24"/>
-        </w:rPr>
-        <w:t>}}</w:t>
-      </w:r>
-      <w:r>
-        <w:rPr>
-          <w:rFonts w:ascii="Times New Roman" w:hAnsi="Times New Roman"/>
-        </w:rPr>
-        <w:t xml:space="preserve"> </w:t>
-      </w:r>
-      <w:r>
-        <w:rPr>
-          <w:rFonts w:ascii="Times-Roman" w:hAnsi="Times-Roman" w:cs="Times-Roman"/>
-          <w:color w:val="auto"/>
-          <w:szCs w:val="24"/>
-        </w:rPr>
-        <w:t>{{</w:t>
-      </w:r>
-      <w:r>
-        <w:rPr>
-          <w:rFonts w:ascii="Times-Roman" w:hAnsi="Times-Roman" w:cs="Times-Roman"/>
-          <w:color w:val="auto"/>
-          <w:szCs w:val="24"/>
-          <w:lang w:val="en-US"/>
-        </w:rPr>
-        <w:t>customer</w:t>
-      </w:r>
-      <w:r>
-        <w:rPr>
-          <w:rFonts w:ascii="Times-Roman" w:hAnsi="Times-Roman" w:cs="Times-Roman"/>
-          <w:color w:val="auto"/>
-          <w:szCs w:val="24"/>
-        </w:rPr>
-        <w:t>.</w:t>
-      </w:r>
-      <w:r>
-        <w:rPr>
-          <w:rFonts w:ascii="Times-Roman" w:hAnsi="Times-Roman" w:cs="Times-Roman"/>
-          <w:color w:val="auto"/>
-          <w:szCs w:val="24"/>
-          <w:lang w:val="en-US"/>
-        </w:rPr>
-        <w:t>by</w:t>
-      </w:r>
-      <w:r>
-        <w:rPr>
-          <w:rFonts w:ascii="Times-Roman" w:hAnsi="Times-Roman" w:cs="Times-Roman"/>
-          <w:color w:val="auto"/>
-          <w:szCs w:val="24"/>
-        </w:rPr>
-        <w:t>_</w:t>
-      </w:r>
-      <w:r>
-        <w:rPr>
-          <w:rFonts w:ascii="Times-Roman" w:hAnsi="Times-Roman" w:cs="Times-Roman"/>
-          <w:color w:val="auto"/>
-          <w:szCs w:val="24"/>
-          <w:lang w:val="en-US"/>
-        </w:rPr>
-        <w:t>whom</w:t>
-      </w:r>
-      <w:r>
-        <w:rPr>
-          <w:rFonts w:ascii="Times-Roman" w:hAnsi="Times-Roman" w:cs="Times-Roman"/>
-          <w:color w:val="auto"/>
-          <w:szCs w:val="24"/>
-        </w:rPr>
-        <w:t>_</w:t>
-      </w:r>
-      <w:r>
-        <w:rPr>
-          <w:rFonts w:ascii="Times-Roman" w:hAnsi="Times-Roman" w:cs="Times-Roman"/>
-          <w:color w:val="auto"/>
-          <w:szCs w:val="24"/>
-          <w:lang w:val="en-US"/>
-        </w:rPr>
-        <w:t>issued</w:t>
-      </w:r>
-      <w:r>
-        <w:rPr>
-          <w:rFonts w:ascii="Times-Roman" w:hAnsi="Times-Roman" w:cs="Times-Roman"/>
-          <w:color w:val="auto"/>
-          <w:szCs w:val="24"/>
-        </w:rPr>
-        <w:t>}},</w:t>
-      </w:r>
-      <w:r>
-        <w:rPr>
-          <w:rFonts w:ascii="Times New Roman" w:hAnsi="Times New Roman"/>
-        </w:rPr>
-        <w:t xml:space="preserve"> </w:t>
-      </w:r>
-      <w:r>
-        <w:rPr>
-          <w:rFonts w:ascii="Times New Roman" w:hAnsi="Times New Roman"/>
-        </w:rPr>
-        <w:t>код</w:t>
-      </w:r>
-      <w:r>
-        <w:rPr>
-          <w:rFonts w:ascii="Times New Roman" w:hAnsi="Times New Roman"/>
-        </w:rPr>
-        <w:t xml:space="preserve"> </w:t>
-      </w:r>
-      <w:r>
-        <w:rPr>
-          <w:rFonts w:ascii="Times New Roman" w:hAnsi="Times New Roman"/>
-        </w:rPr>
-        <w:t>подразделения</w:t>
-      </w:r>
-      <w:r>
-        <w:rPr>
-          <w:rFonts w:ascii="Times New Roman" w:hAnsi="Times New Roman"/>
-        </w:rPr>
-        <w:t xml:space="preserve"> </w:t>
-      </w:r>
-      <w:r>
-        <w:rPr>
-          <w:rFonts w:ascii="Times-Roman" w:hAnsi="Times-Roman" w:cs="Times-Roman"/>
-          <w:color w:val="auto"/>
-          <w:szCs w:val="24"/>
-        </w:rPr>
-        <w:t>{{</w:t>
-      </w:r>
-      <w:r>
-        <w:rPr>
-          <w:rFonts w:ascii="Times-Roman" w:hAnsi="Times-Roman" w:cs="Times-Roman"/>
-          <w:color w:val="auto"/>
-          <w:szCs w:val="24"/>
-          <w:lang w:val="en-US"/>
-        </w:rPr>
-        <w:t>customer</w:t>
-      </w:r>
-      <w:r>
-        <w:rPr>
-          <w:rFonts w:ascii="Times-Roman" w:hAnsi="Times-Roman" w:cs="Times-Roman"/>
-          <w:color w:val="auto"/>
-          <w:szCs w:val="24"/>
-        </w:rPr>
-        <w:t>.</w:t>
-      </w:r>
-      <w:r>
-        <w:rPr>
-          <w:rFonts w:ascii="Times-Roman" w:hAnsi="Times-Roman" w:cs="Times-Roman"/>
-          <w:color w:val="auto"/>
-          <w:szCs w:val="24"/>
-          <w:lang w:val="en-US"/>
-        </w:rPr>
-        <w:t>department</w:t>
-      </w:r>
-      <w:r>
-        <w:rPr>
-          <w:rFonts w:ascii="Times-Roman" w:hAnsi="Times-Roman" w:cs="Times-Roman"/>
-          <w:color w:val="auto"/>
-          <w:szCs w:val="24"/>
-        </w:rPr>
-        <w:t>_</w:t>
-      </w:r>
-      <w:r>
-        <w:rPr>
-          <w:rFonts w:ascii="Times-Roman" w:hAnsi="Times-Roman" w:cs="Times-Roman"/>
-          <w:color w:val="auto"/>
-          <w:szCs w:val="24"/>
-          <w:lang w:val="en-US"/>
-        </w:rPr>
-        <w:t>code</w:t>
-      </w:r>
-      <w:r>
-        <w:rPr>
-          <w:rFonts w:ascii="Times-Roman" w:hAnsi="Times-Roman" w:cs="Times-Roman"/>
-          <w:color w:val="auto"/>
-          <w:szCs w:val="24"/>
-        </w:rPr>
-        <w:t>}}</w:t>
-      </w:r>
-      <w:r>
-        <w:rPr>
-          <w:rFonts w:ascii="Times New Roman" w:hAnsi="Times New Roman"/>
-        </w:rPr>
-        <w:t xml:space="preserve">:  </w:t>
-      </w:r>
-      <w:r>
-        <w:rPr>
-          <w:rFonts w:ascii="Times New Roman" w:hAnsi="Times New Roman"/>
-        </w:rPr>
-        <w:t>Адрес</w:t>
-      </w:r>
-      <w:r>
-        <w:rPr>
-          <w:rFonts w:ascii="Times New Roman" w:hAnsi="Times New Roman"/>
-        </w:rPr>
-        <w:t xml:space="preserve"> </w:t>
-      </w:r>
-      <w:r>
-        <w:rPr>
-          <w:rFonts w:ascii="Times New Roman" w:hAnsi="Times New Roman"/>
-          <w:color w:val="000000" w:themeColor="text1"/>
-        </w:rPr>
-        <w:t>регистрации</w:t>
-      </w:r>
-      <w:r>
-        <w:rPr>
-          <w:rFonts w:ascii="Times New Roman" w:hAnsi="Times New Roman"/>
-          <w:color w:val="000000" w:themeColor="text1"/>
-        </w:rPr>
-        <w:t xml:space="preserve">: </w:t>
-      </w:r>
-      <w:r>
-        <w:rPr>
-          <w:rFonts w:ascii="Times-Roman" w:hAnsi="Times-Roman" w:cs="Times-Roman"/>
-          <w:color w:val="auto"/>
-          <w:szCs w:val="24"/>
-        </w:rPr>
-        <w:t>{{</w:t>
-      </w:r>
-      <w:r>
-        <w:rPr>
-          <w:rFonts w:ascii="Times-Roman" w:hAnsi="Times-Roman" w:cs="Times-Roman"/>
-          <w:color w:val="auto"/>
-          <w:szCs w:val="24"/>
-          <w:lang w:val="en-US"/>
-        </w:rPr>
-        <w:t>customer</w:t>
-      </w:r>
-      <w:r>
-        <w:rPr>
-          <w:rFonts w:ascii="Times-Roman" w:hAnsi="Times-Roman" w:cs="Times-Roman"/>
-          <w:color w:val="auto"/>
-          <w:szCs w:val="24"/>
-        </w:rPr>
-        <w:t>.</w:t>
-      </w:r>
-      <w:r>
-        <w:rPr>
-          <w:rFonts w:ascii="Times-Roman" w:hAnsi="Times-Roman" w:cs="Times-Roman"/>
-          <w:color w:val="auto"/>
-          <w:szCs w:val="24"/>
-          <w:lang w:val="en-US"/>
-        </w:rPr>
-        <w:t>registration</w:t>
-      </w:r>
-      <w:r>
-        <w:rPr>
-          <w:rFonts w:ascii="Times-Roman" w:hAnsi="Times-Roman" w:cs="Times-Roman"/>
-          <w:color w:val="auto"/>
-          <w:szCs w:val="24"/>
-        </w:rPr>
-        <w:t>_</w:t>
-      </w:r>
-      <w:r>
-        <w:rPr>
-          <w:rFonts w:ascii="Times-Roman" w:hAnsi="Times-Roman" w:cs="Times-Roman"/>
-          <w:color w:val="auto"/>
-          <w:szCs w:val="24"/>
-          <w:lang w:val="en-US"/>
-        </w:rPr>
-        <w:t>address</w:t>
-      </w:r>
-      <w:r>
-        <w:rPr>
-          <w:rFonts w:ascii="Times-Roman" w:hAnsi="Times-Roman" w:cs="Times-Roman"/>
-          <w:color w:val="auto"/>
-          <w:szCs w:val="24"/>
-        </w:rPr>
-        <w:t>}}</w:t>
-      </w:r>
-    </w:p>
-    <w:p>
-      <w:pPr>
-        <w:rPr>
-          <w:rFonts w:ascii="Times New Roman" w:hAnsi="Times New Roman"/>
-        </w:rPr>
-      </w:pPr>
-      <w:r>
+        <w:t xml:space="preserve">в соответствии со статьей 9 Федерального закона от 27.07.2006 № 152-ФЗ «О персональных данных», представляю Исполнителю </w:t>
+      </w:r>
+    </w:p>
+    <w:p>
+      <w:pPr>
+        <w:spacing w:line="240" w:lineRule="auto"/>
         <w:rPr>
           <w:rFonts w:ascii="Times New Roman" w:hAnsi="Times New Roman"/>
           <w:sz w:val="22"/>
         </w:rPr>
-        <w:t xml:space="preserve">в соответствии со статьей 9 Федерального закона от 27.07.2006 № 152-ФЗ «О персональных данных», представляю Исполнителю </w:t>
-      </w:r>
-    </w:p>
-    <w:p>
-      <w:pPr>
-        <w:spacing w:line="240" w:lineRule="auto"/>
+      </w:pPr>
+      <w:r>
         <w:rPr>
           <w:rFonts w:ascii="Times New Roman" w:hAnsi="Times New Roman"/>
           <w:sz w:val="22"/>
         </w:rPr>
-      </w:pPr>
-      <w:r>
-        <w:rPr>
-          <w:rFonts w:ascii="Times New Roman" w:hAnsi="Times New Roman"/>
-          <w:sz w:val="22"/>
-        </w:rPr>
-        <w:t xml:space="preserve">Я выражаю свое согласие на осуществление </w:t>
-      </w:r>
-      <w:proofErr w:type="gramStart"/>
-      <w:r>
-        <w:rPr>
-          <w:rFonts w:ascii="Times New Roman" w:hAnsi="Times New Roman"/>
-          <w:sz w:val="22"/>
-        </w:rPr>
-        <w:t>Исполнителем  автоматизированной</w:t>
-      </w:r>
-      <w:proofErr w:type="gramEnd"/>
-      <w:r>
-        <w:rPr>
-          <w:rFonts w:ascii="Times New Roman" w:hAnsi="Times New Roman"/>
-          <w:sz w:val="22"/>
-        </w:rPr>
-        <w:t>, а также без использования средств автоматизации обработки персональных данных, включая сбор, запись, систематизацию, накопление, хранение, уточнение (обновление, изменение), извлечение, использование, блокирование, удаление, уничтожение персональных данных.</w:t>
+        <w:t>Я выражаю свое согласие на осуществление Исполнителем  автоматизированной, а также без использования средств автоматизации обработки персональных данных, включая сбор, запись, систематизацию, накопление, хранение, уточнение (обновление, изменение), извлечение, использование, блокирование, удаление, уничтожение персональных данных.</w:t>
       </w:r>
     </w:p>
     <w:p>
@@ -6669,23 +6319,7 @@
           <w:rFonts w:ascii="Times New Roman" w:hAnsi="Times New Roman"/>
           <w:sz w:val="22"/>
         </w:rPr>
-        <w:t xml:space="preserve"> публикация на официальных </w:t>
-      </w:r>
-      <w:proofErr w:type="gramStart"/>
-      <w:r>
-        <w:rPr>
-          <w:rFonts w:ascii="Times New Roman" w:hAnsi="Times New Roman"/>
-          <w:sz w:val="22"/>
-        </w:rPr>
-        <w:t>каналах  в</w:t>
-      </w:r>
-      <w:proofErr w:type="gramEnd"/>
-      <w:r>
-        <w:rPr>
-          <w:rFonts w:ascii="Times New Roman" w:hAnsi="Times New Roman"/>
-          <w:sz w:val="22"/>
-        </w:rPr>
-        <w:t xml:space="preserve"> сетях</w:t>
+        <w:t> публикация на официальных каналах  в сетях</w:t>
       </w:r>
     </w:p>
     <w:p>
@@ -8280,6 +7914,7 @@
     <w:lsdException w:name="HTML Sample" w:semiHidden="1" w:unhideWhenUsed="1"/>
     <w:lsdException w:name="HTML Typewriter" w:semiHidden="1" w:unhideWhenUsed="1"/>
     <w:lsdException w:name="HTML Variable" w:semiHidden="1" w:unhideWhenUsed="1"/>
+    <w:lsdException w:name="Normal Table" w:semiHidden="1" w:unhideWhenUsed="1"/>
     <w:lsdException w:name="annotation subject" w:semiHidden="1" w:unhideWhenUsed="1"/>
     <w:lsdException w:name="No List" w:semiHidden="1" w:unhideWhenUsed="1"/>
     <w:lsdException w:name="Outline List 1" w:semiHidden="1" w:unhideWhenUsed="1"/>
@@ -8322,8 +7957,11 @@
     <w:lsdException w:name="Table Contemporary" w:semiHidden="1" w:unhideWhenUsed="1"/>
     <w:lsdException w:name="Table Elegant" w:semiHidden="1" w:unhideWhenUsed="1"/>
     <w:lsdException w:name="Table Professional" w:semiHidden="1" w:unhideWhenUsed="1"/>
+    <w:lsdException w:name="Table Subtle 1" w:semiHidden="1" w:unhideWhenUsed="1"/>
     <w:lsdException w:name="Table Subtle 2" w:semiHidden="1" w:unhideWhenUsed="1"/>
     <w:lsdException w:name="Table Web 1" w:semiHidden="1" w:unhideWhenUsed="1"/>
+    <w:lsdException w:name="Table Web 2" w:semiHidden="1" w:unhideWhenUsed="1"/>
+    <w:lsdException w:name="Table Web 3" w:semiHidden="1" w:unhideWhenUsed="1"/>
     <w:lsdException w:name="Balloon Text" w:semiHidden="1" w:unhideWhenUsed="1"/>
     <w:lsdException w:name="Table Grid" w:uiPriority="39"/>
     <w:lsdException w:name="Table Theme" w:semiHidden="1" w:unhideWhenUsed="1"/>

</xml_diff>

<commit_message>
Update contract template with current date placeholders.
Add contract.current_date_text and contract.current_date_numeric to the Word template for manual contract generation.

Co-authored-by: Cursor <cursoragent@cursor.com>
</commit_message>
<xml_diff>
--- a/templates/customer_contract_template.docx
+++ b/templates/customer_contract_template.docx
@@ -7,6 +7,7 @@
         <w:jc w:val="center"/>
         <w:rPr>
           <w:rFonts w:ascii="Times New Roman" w:hAnsi="Times New Roman"/>
+          <w:lang w:val="en-US"/>
         </w:rPr>
       </w:pPr>
       <w:r>
@@ -43,37 +44,56 @@
           <w:rFonts w:ascii="Times New Roman" w:hAnsi="Times New Roman"/>
         </w:rPr>
         <w:br/>
-        <w:t>«</w:t>
-      </w:r>
-      <w:r>
-        <w:rPr>
-          <w:rFonts w:ascii="Times New Roman" w:hAnsi="Times New Roman"/>
-        </w:rPr>
-        <w:t>06</w:t>
-      </w:r>
-      <w:r>
-        <w:rPr>
-          <w:rFonts w:ascii="Times New Roman" w:hAnsi="Times New Roman"/>
-        </w:rPr>
-        <w:t xml:space="preserve">» </w:t>
-      </w:r>
-      <w:r>
-        <w:rPr>
-          <w:rFonts w:ascii="Times New Roman" w:hAnsi="Times New Roman"/>
-        </w:rPr>
-        <w:t>ма</w:t>
-      </w:r>
-      <w:r>
-        <w:rPr>
-          <w:rFonts w:ascii="Times New Roman" w:hAnsi="Times New Roman"/>
-        </w:rPr>
-        <w:t>я</w:t>
-      </w:r>
-      <w:r>
-        <w:rPr>
-          <w:rFonts w:ascii="Times New Roman" w:hAnsi="Times New Roman"/>
-        </w:rPr>
-        <w:t xml:space="preserve">  2026 г.</w:t>
+      </w:r>
+      <w:proofErr w:type="gramStart"/>
+      <w:r>
+        <w:rPr>
+          <w:rFonts w:ascii="Times New Roman" w:hAnsi="Times New Roman"/>
+        </w:rPr>
+        <w:t xml:space="preserve">{{ </w:t>
+      </w:r>
+      <w:r>
+        <w:rPr>
+          <w:rFonts w:ascii="Times New Roman" w:hAnsi="Times New Roman"/>
+          <w:lang w:val="en-US"/>
+        </w:rPr>
+        <w:t>contract</w:t>
+      </w:r>
+      <w:proofErr w:type="gramEnd"/>
+      <w:r>
+        <w:rPr>
+          <w:rFonts w:ascii="Times New Roman" w:hAnsi="Times New Roman"/>
+        </w:rPr>
+        <w:t>.</w:t>
+      </w:r>
+      <w:r>
+        <w:rPr>
+          <w:rFonts w:ascii="Times New Roman" w:hAnsi="Times New Roman"/>
+          <w:lang w:val="en-US"/>
+        </w:rPr>
+        <w:t>current</w:t>
+      </w:r>
+      <w:r>
+        <w:rPr>
+          <w:rFonts w:ascii="Times New Roman" w:hAnsi="Times New Roman"/>
+        </w:rPr>
+        <w:t>_</w:t>
+      </w:r>
+      <w:proofErr w:type="spellStart"/>
+      <w:r>
+        <w:rPr>
+          <w:rFonts w:ascii="Times New Roman" w:hAnsi="Times New Roman"/>
+          <w:lang w:val="en-US"/>
+        </w:rPr>
+        <w:t>date_text</w:t>
+      </w:r>
+      <w:proofErr w:type="spellEnd"/>
+      <w:r>
+        <w:rPr>
+          <w:rFonts w:ascii="Times New Roman" w:hAnsi="Times New Roman"/>
+          <w:lang w:val="en-US"/>
+        </w:rPr>
+        <w:t xml:space="preserve"> }}</w:t>
       </w:r>
     </w:p>
     <w:p>
@@ -239,17 +259,16 @@
         <w:t xml:space="preserve"> </w:t>
       </w:r>
       <w:r>
-        <w:rPr>
-          <w:rStyle w:val="apple-converted-space"/>
-        </w:rPr>
-        <w:t> </w:t>
-      </w:r>
-      <w:r>
         <w:t>{{</w:t>
       </w:r>
       <w:proofErr w:type="spellStart"/>
-      <w:r>
-        <w:t>customer.last_name</w:t>
+      <w:proofErr w:type="gramStart"/>
+      <w:r>
+        <w:t>customer.last</w:t>
+      </w:r>
+      <w:proofErr w:type="gramEnd"/>
+      <w:r>
+        <w:t>_name</w:t>
       </w:r>
       <w:proofErr w:type="spellEnd"/>
       <w:r>
@@ -302,6 +321,7 @@
         <w:t>{{</w:t>
       </w:r>
       <w:proofErr w:type="spellStart"/>
+      <w:proofErr w:type="gramStart"/>
       <w:r>
         <w:rPr>
           <w:rFonts w:ascii="Times-Roman" w:hAnsi="Times-Roman" w:cs="Times-Roman"/>
@@ -330,6 +350,7 @@
         <w:t>passport</w:t>
       </w:r>
       <w:proofErr w:type="spellEnd"/>
+      <w:proofErr w:type="gramEnd"/>
       <w:r>
         <w:rPr>
           <w:rFonts w:ascii="Times-Roman" w:hAnsi="Times-Roman" w:cs="Times-Roman"/>
@@ -613,6 +634,7 @@
         <w:t>{{</w:t>
       </w:r>
       <w:proofErr w:type="spellStart"/>
+      <w:proofErr w:type="gramStart"/>
       <w:r>
         <w:rPr>
           <w:rFonts w:ascii="Times-Roman" w:hAnsi="Times-Roman" w:cs="Times-Roman"/>
@@ -623,6 +645,7 @@
         <w:t>customer.phone</w:t>
       </w:r>
       <w:proofErr w:type="spellEnd"/>
+      <w:proofErr w:type="gramEnd"/>
       <w:r>
         <w:rPr>
           <w:rFonts w:ascii="Times-Roman" w:hAnsi="Times-Roman" w:cs="Times-Roman"/>
@@ -758,7 +781,13 @@
         <w:rPr>
           <w:rFonts w:ascii="Times New Roman" w:hAnsi="Times New Roman"/>
         </w:rPr>
-        <w:t>1.1. Исполнитель обязуется оказать услуги по поиску  автомобиля</w:t>
+        <w:t xml:space="preserve">1.1. Исполнитель обязуется оказать услуги по </w:t>
+      </w:r>
+      <w:r>
+        <w:rPr>
+          <w:rFonts w:ascii="Times New Roman" w:hAnsi="Times New Roman"/>
+        </w:rPr>
+        <w:t>поиску автомобиля</w:t>
       </w:r>
       <w:r>
         <w:rPr>
@@ -777,7 +806,7 @@
           <w:rFonts w:ascii="Times New Roman" w:hAnsi="Times New Roman"/>
           <w:b/>
         </w:rPr>
-        <w:t xml:space="preserve">Спецификацией №1 от </w:t>
+        <w:t>Спецификацией №1 от</w:t>
       </w:r>
       <w:r>
         <w:rPr>
@@ -1023,7 +1052,19 @@
           <w:rFonts w:ascii="Times New Roman" w:hAnsi="Times New Roman"/>
         </w:rPr>
         <w:lastRenderedPageBreak/>
-        <w:t xml:space="preserve">Исполнитель информирует о прибытии ТС на границу КНР и проводит  транзитное оформление и таможенную очистку автомобиля согласно законодательства РФ в том числе с привлечением третьих организаций по отдельному договору. </w:t>
+        <w:t xml:space="preserve">Исполнитель информирует о прибытии ТС на границу КНР и проводит транзитное оформление и таможенную очистку автомобиля </w:t>
+      </w:r>
+      <w:r>
+        <w:rPr>
+          <w:rFonts w:ascii="Times New Roman" w:hAnsi="Times New Roman"/>
+        </w:rPr>
+        <w:t>согласно законодательству</w:t>
+      </w:r>
+      <w:r>
+        <w:rPr>
+          <w:rFonts w:ascii="Times New Roman" w:hAnsi="Times New Roman"/>
+        </w:rPr>
+        <w:t xml:space="preserve"> РФ в том числе с привлечением третьих организаций по отдельному договору. </w:t>
       </w:r>
     </w:p>
     <w:p>
@@ -1040,7 +1081,7 @@
         <w:rPr>
           <w:rFonts w:ascii="Times New Roman" w:hAnsi="Times New Roman"/>
         </w:rPr>
-        <w:t>Стоимость данных услуг определяется согласно  приложению 2  к данному договору. Заказчик обязуется оплатить данные услуги в момент прибытия автомобиля на определенный условиями договора  таможенный пост.</w:t>
+        <w:t>Стоимость данных услуг определяется согласно приложению 2 к данному договору. Заказчик обязуется оплатить данные услуги в момент прибытия автомобиля на определенный условиями договора таможенный пост.</w:t>
       </w:r>
     </w:p>
     <w:p>
@@ -1074,7 +1115,7 @@
         <w:rPr>
           <w:rFonts w:ascii="Times New Roman" w:hAnsi="Times New Roman"/>
         </w:rPr>
-        <w:t xml:space="preserve">Забирать и перемещать товар в зону таможенного контроля (в дальнейшем по тексту - ЗТК) перемещать автомобиль на склад временного хранения (в дальнейшем по тексту  СВХ ) </w:t>
+        <w:t xml:space="preserve">Забирать и перемещать товар в зону таможенного контроля (в дальнейшем по тексту - ЗТК) перемещать автомобиль на склад временного хранения (в дальнейшем по тексту СВХ) </w:t>
       </w:r>
     </w:p>
     <w:p>
@@ -1093,28 +1134,24 @@
         </w:rPr>
         <w:t xml:space="preserve">Получать автомобиль   с зоны </w:t>
       </w:r>
-      <w:proofErr w:type="spellStart"/>
-      <w:r>
-        <w:rPr>
-          <w:rFonts w:ascii="Times New Roman" w:hAnsi="Times New Roman"/>
-        </w:rPr>
-        <w:t>свх</w:t>
-      </w:r>
-      <w:proofErr w:type="spellEnd"/>
+      <w:r>
+        <w:rPr>
+          <w:rFonts w:ascii="Times New Roman" w:hAnsi="Times New Roman"/>
+        </w:rPr>
+        <w:t>СВХ</w:t>
+      </w:r>
       <w:r>
         <w:rPr>
           <w:rFonts w:ascii="Times New Roman" w:hAnsi="Times New Roman"/>
         </w:rPr>
         <w:t xml:space="preserve">, </w:t>
       </w:r>
-      <w:proofErr w:type="spellStart"/>
-      <w:r>
-        <w:rPr>
-          <w:rFonts w:ascii="Times New Roman" w:hAnsi="Times New Roman"/>
-        </w:rPr>
-        <w:t>зтк</w:t>
-      </w:r>
-      <w:proofErr w:type="spellEnd"/>
+      <w:r>
+        <w:rPr>
+          <w:rFonts w:ascii="Times New Roman" w:hAnsi="Times New Roman"/>
+        </w:rPr>
+        <w:t>ЗТК</w:t>
+      </w:r>
       <w:r>
         <w:rPr>
           <w:rFonts w:ascii="Times New Roman" w:hAnsi="Times New Roman"/>
@@ -1136,7 +1173,7 @@
         <w:rPr>
           <w:rFonts w:ascii="Times New Roman" w:hAnsi="Times New Roman"/>
         </w:rPr>
-        <w:t>Заключать контракт транспортировки и  перемещения автомобиля до места передачи с транспортной компанией. В том числе и договор страхования.</w:t>
+        <w:t>Заключать контракт транспортировки и перемещения автомобиля до места передачи с транспортной компанией. В том числе и договор страхования.</w:t>
       </w:r>
     </w:p>
     <w:p>
@@ -1153,7 +1190,19 @@
         <w:rPr>
           <w:rFonts w:ascii="Times New Roman" w:hAnsi="Times New Roman"/>
         </w:rPr>
-        <w:t>Заключать договор с испытательными лабораториями  на  проведение технической экспертизы транспорта, получать Свидетельство о безопасности колесного транспортного средства (далее по тексту СБКТС) а также выписки из Электронного паспорта транспортного средства (Далее по тексту ЭПТС)</w:t>
+        <w:t xml:space="preserve">Заключать договор с испытательными лабораториями </w:t>
+      </w:r>
+      <w:r>
+        <w:rPr>
+          <w:rFonts w:ascii="Times New Roman" w:hAnsi="Times New Roman"/>
+        </w:rPr>
+        <w:t>на проведение</w:t>
+      </w:r>
+      <w:r>
+        <w:rPr>
+          <w:rFonts w:ascii="Times New Roman" w:hAnsi="Times New Roman"/>
+        </w:rPr>
+        <w:t xml:space="preserve"> технической экспертизы транспорта, получать Свидетельство о безопасности колесного транспортного средства (далее по тексту СБКТС) а также выписки из Электронного паспорта транспортного средства (Далее по тексту ЭПТС)</w:t>
       </w:r>
     </w:p>
     <w:p>
@@ -1246,7 +1295,19 @@
           <w:rFonts w:ascii="Times New Roman" w:hAnsi="Times New Roman"/>
         </w:rPr>
         <w:br/>
-        <w:t>2.1. Осуществить поиск  автомобиля по критериям Заказчика.</w:t>
+        <w:t xml:space="preserve">2.1. Осуществить </w:t>
+      </w:r>
+      <w:r>
+        <w:rPr>
+          <w:rFonts w:ascii="Times New Roman" w:hAnsi="Times New Roman"/>
+        </w:rPr>
+        <w:t>поиск автомобиля</w:t>
+      </w:r>
+      <w:r>
+        <w:rPr>
+          <w:rFonts w:ascii="Times New Roman" w:hAnsi="Times New Roman"/>
+        </w:rPr>
+        <w:t xml:space="preserve"> по критериям Заказчика.</w:t>
       </w:r>
       <w:r>
         <w:rPr>
@@ -1321,7 +1382,30 @@
           <w:rFonts w:ascii="Times New Roman" w:hAnsi="Times New Roman"/>
           <w:highlight w:val="lightGray"/>
         </w:rPr>
-        <w:t>2  подлежат оплате только  по предварительному согласованию с заказчиком.</w:t>
+        <w:t>2 подлежат</w:t>
+      </w:r>
+      <w:r>
+        <w:rPr>
+          <w:rFonts w:ascii="Times New Roman" w:hAnsi="Times New Roman"/>
+          <w:highlight w:val="lightGray"/>
+        </w:rPr>
+        <w:t xml:space="preserve"> оплате </w:t>
+      </w:r>
+      <w:proofErr w:type="gramStart"/>
+      <w:r>
+        <w:rPr>
+          <w:rFonts w:ascii="Times New Roman" w:hAnsi="Times New Roman"/>
+          <w:highlight w:val="lightGray"/>
+        </w:rPr>
+        <w:t>только  по</w:t>
+      </w:r>
+      <w:proofErr w:type="gramEnd"/>
+      <w:r>
+        <w:rPr>
+          <w:rFonts w:ascii="Times New Roman" w:hAnsi="Times New Roman"/>
+          <w:highlight w:val="lightGray"/>
+        </w:rPr>
+        <w:t xml:space="preserve"> предварительному согласованию с заказчиком.</w:t>
       </w:r>
       <w:r>
         <w:rPr>
@@ -1753,7 +1837,31 @@
         <w:rPr>
           <w:rFonts w:ascii="Times New Roman" w:hAnsi="Times New Roman"/>
         </w:rPr>
-        <w:t xml:space="preserve">4.3. Срок поставки автомобиля до места назначения  определяются экспортным контрактом   между заказчиком и продавцом  по сделке. </w:t>
+        <w:t xml:space="preserve">4.3. Срок поставки автомобиля до места </w:t>
+      </w:r>
+      <w:r>
+        <w:rPr>
+          <w:rFonts w:ascii="Times New Roman" w:hAnsi="Times New Roman"/>
+        </w:rPr>
+        <w:t>назначения определяются</w:t>
+      </w:r>
+      <w:r>
+        <w:rPr>
+          <w:rFonts w:ascii="Times New Roman" w:hAnsi="Times New Roman"/>
+        </w:rPr>
+        <w:t xml:space="preserve"> экспортным контрактом   между заказчиком и </w:t>
+      </w:r>
+      <w:r>
+        <w:rPr>
+          <w:rFonts w:ascii="Times New Roman" w:hAnsi="Times New Roman"/>
+        </w:rPr>
+        <w:t>продавцом по</w:t>
+      </w:r>
+      <w:r>
+        <w:rPr>
+          <w:rFonts w:ascii="Times New Roman" w:hAnsi="Times New Roman"/>
+        </w:rPr>
+        <w:t xml:space="preserve"> сделке. </w:t>
       </w:r>
     </w:p>
     <w:p>
@@ -2328,7 +2436,6 @@
       <w:r>
         <w:rPr>
           <w:rFonts w:ascii="Times New Roman" w:hAnsi="Times New Roman"/>
-          <w:lang w:val="en-US"/>
         </w:rPr>
         <w:t xml:space="preserve"> </w:t>
       </w:r>
@@ -2383,7 +2490,6 @@
       <w:r>
         <w:rPr>
           <w:rFonts w:ascii="Times New Roman" w:hAnsi="Times New Roman"/>
-          <w:lang w:val="en-US"/>
         </w:rPr>
         <w:t xml:space="preserve"> </w:t>
       </w:r>
@@ -2395,6 +2501,7 @@
         </w:rPr>
         <w:t>{{</w:t>
       </w:r>
+      <w:proofErr w:type="gramStart"/>
       <w:r>
         <w:rPr>
           <w:rFonts w:ascii="Times-Roman" w:hAnsi="Times-Roman" w:cs="Times-Roman"/>
@@ -2412,243 +2519,301 @@
         </w:rPr>
         <w:t>.</w:t>
       </w:r>
+      <w:r>
+        <w:rPr>
+          <w:rFonts w:ascii="Times-Roman" w:hAnsi="Times-Roman" w:cs="Times-Roman"/>
+          <w:color w:val="auto"/>
+          <w:szCs w:val="24"/>
+          <w:lang w:val="en-US"/>
+        </w:rPr>
+        <w:t>short</w:t>
+      </w:r>
+      <w:proofErr w:type="gramEnd"/>
+      <w:r>
+        <w:rPr>
+          <w:rFonts w:ascii="Times-Roman" w:hAnsi="Times-Roman" w:cs="Times-Roman"/>
+          <w:color w:val="auto"/>
+          <w:szCs w:val="24"/>
+        </w:rPr>
+        <w:t>_</w:t>
+      </w:r>
+      <w:r>
+        <w:rPr>
+          <w:rFonts w:ascii="Times-Roman" w:hAnsi="Times-Roman" w:cs="Times-Roman"/>
+          <w:color w:val="auto"/>
+          <w:szCs w:val="24"/>
+          <w:lang w:val="en-US"/>
+        </w:rPr>
+        <w:t>name</w:t>
+      </w:r>
+      <w:r>
+        <w:rPr>
+          <w:rFonts w:ascii="Times-Roman" w:hAnsi="Times-Roman" w:cs="Times-Roman"/>
+          <w:color w:val="auto"/>
+          <w:szCs w:val="24"/>
+        </w:rPr>
+        <w:t xml:space="preserve"> </w:t>
+      </w:r>
+      <w:r>
+        <w:rPr>
+          <w:rFonts w:ascii="Times-Roman" w:hAnsi="Times-Roman" w:cs="Times-Roman"/>
+          <w:color w:val="auto"/>
+          <w:szCs w:val="24"/>
+        </w:rPr>
+        <w:t>}}</w:t>
+      </w:r>
+      <w:r>
+        <w:rPr>
+          <w:rFonts w:ascii="Times-Roman" w:hAnsi="Times-Roman" w:cs="Times-Roman"/>
+          <w:color w:val="auto"/>
+          <w:szCs w:val="24"/>
+        </w:rPr>
+        <w:t xml:space="preserve"> </w:t>
+      </w:r>
+      <w:r>
+        <w:rPr>
+          <w:rFonts w:ascii="Times New Roman" w:hAnsi="Times New Roman"/>
+        </w:rPr>
+        <w:t>/</w:t>
+      </w:r>
+    </w:p>
+    <w:bookmarkEnd w:id="2"/>
+    <w:p>
+      <w:pPr>
+        <w:rPr>
+          <w:rFonts w:ascii="Times New Roman" w:hAnsi="Times New Roman"/>
+          <w:b/>
+        </w:rPr>
+      </w:pPr>
+    </w:p>
+    <w:p>
+      <w:pPr>
+        <w:rPr>
+          <w:rFonts w:ascii="Times New Roman" w:hAnsi="Times New Roman"/>
+          <w:b/>
+        </w:rPr>
+      </w:pPr>
+    </w:p>
+    <w:p>
+      <w:pPr>
+        <w:rPr>
+          <w:rFonts w:ascii="Times New Roman" w:hAnsi="Times New Roman"/>
+          <w:b/>
+        </w:rPr>
+      </w:pPr>
+    </w:p>
+    <w:p>
+      <w:pPr>
+        <w:rPr>
+          <w:rFonts w:ascii="Times New Roman" w:hAnsi="Times New Roman"/>
+          <w:b/>
+        </w:rPr>
+      </w:pPr>
+    </w:p>
+    <w:p>
+      <w:pPr>
+        <w:rPr>
+          <w:rFonts w:ascii="Times New Roman" w:hAnsi="Times New Roman"/>
+          <w:b/>
+        </w:rPr>
+      </w:pPr>
+    </w:p>
+    <w:p>
+      <w:pPr>
+        <w:rPr>
+          <w:rFonts w:ascii="Times New Roman" w:hAnsi="Times New Roman"/>
+          <w:b/>
+        </w:rPr>
+      </w:pPr>
+    </w:p>
+    <w:p>
+      <w:pPr>
+        <w:rPr>
+          <w:rFonts w:ascii="Times New Roman" w:hAnsi="Times New Roman"/>
+          <w:b/>
+        </w:rPr>
+      </w:pPr>
+    </w:p>
+    <w:p>
+      <w:pPr>
+        <w:rPr>
+          <w:rFonts w:ascii="Times New Roman" w:hAnsi="Times New Roman"/>
+          <w:b/>
+        </w:rPr>
+      </w:pPr>
+    </w:p>
+    <w:p>
+      <w:pPr>
+        <w:rPr>
+          <w:rFonts w:ascii="Times New Roman" w:hAnsi="Times New Roman"/>
+          <w:b/>
+        </w:rPr>
+      </w:pPr>
+    </w:p>
+    <w:p>
+      <w:pPr>
+        <w:rPr>
+          <w:rFonts w:ascii="Times New Roman" w:hAnsi="Times New Roman"/>
+          <w:b/>
+        </w:rPr>
+      </w:pPr>
+    </w:p>
+    <w:p>
+      <w:pPr>
+        <w:rPr>
+          <w:rFonts w:ascii="Times New Roman" w:hAnsi="Times New Roman"/>
+          <w:b/>
+        </w:rPr>
+      </w:pPr>
+    </w:p>
+    <w:p>
+      <w:pPr>
+        <w:rPr>
+          <w:rFonts w:ascii="Times New Roman" w:hAnsi="Times New Roman"/>
+          <w:b/>
+        </w:rPr>
+      </w:pPr>
+    </w:p>
+    <w:p>
+      <w:pPr>
+        <w:rPr>
+          <w:rFonts w:ascii="Times New Roman" w:hAnsi="Times New Roman"/>
+          <w:b/>
+        </w:rPr>
+      </w:pPr>
+    </w:p>
+    <w:p>
+      <w:pPr>
+        <w:rPr>
+          <w:rFonts w:ascii="Times New Roman" w:hAnsi="Times New Roman"/>
+          <w:b/>
+        </w:rPr>
+      </w:pPr>
+    </w:p>
+    <w:p>
+      <w:pPr>
+        <w:rPr>
+          <w:rFonts w:ascii="Times New Roman" w:hAnsi="Times New Roman"/>
+          <w:b/>
+        </w:rPr>
+      </w:pPr>
+    </w:p>
+    <w:p>
+      <w:pPr>
+        <w:rPr>
+          <w:rFonts w:ascii="Times New Roman" w:hAnsi="Times New Roman"/>
+          <w:b/>
+        </w:rPr>
+      </w:pPr>
+    </w:p>
+    <w:p>
+      <w:pPr>
+        <w:rPr>
+          <w:rFonts w:ascii="Times New Roman" w:hAnsi="Times New Roman"/>
+          <w:b/>
+        </w:rPr>
+      </w:pPr>
+    </w:p>
+    <w:p>
+      <w:pPr>
+        <w:rPr>
+          <w:rFonts w:ascii="Times New Roman" w:hAnsi="Times New Roman"/>
+          <w:b/>
+        </w:rPr>
+      </w:pPr>
+    </w:p>
+    <w:p>
+      <w:pPr>
+        <w:rPr>
+          <w:rFonts w:ascii="Times New Roman" w:hAnsi="Times New Roman"/>
+          <w:b/>
+        </w:rPr>
+      </w:pPr>
+    </w:p>
+    <w:p>
+      <w:pPr>
+        <w:rPr>
+          <w:rFonts w:ascii="Times New Roman" w:hAnsi="Times New Roman"/>
+          <w:b/>
+        </w:rPr>
+      </w:pPr>
+    </w:p>
+    <w:p>
+      <w:pPr>
+        <w:rPr>
+          <w:rFonts w:ascii="Times New Roman" w:hAnsi="Times New Roman"/>
+          <w:b/>
+        </w:rPr>
+      </w:pPr>
+      <w:r>
+        <w:rPr>
+          <w:rFonts w:ascii="Times New Roman" w:hAnsi="Times New Roman"/>
+          <w:b/>
+        </w:rPr>
+        <w:t>Приложение 1. СПЕЦИФИКАЦИЯ №1 от</w:t>
+      </w:r>
+      <w:r>
+        <w:rPr>
+          <w:rFonts w:ascii="Times New Roman" w:hAnsi="Times New Roman"/>
+        </w:rPr>
+        <w:t xml:space="preserve"> </w:t>
+      </w:r>
+      <w:proofErr w:type="gramStart"/>
+      <w:r>
+        <w:rPr>
+          <w:rFonts w:ascii="Times New Roman" w:hAnsi="Times New Roman"/>
+        </w:rPr>
+        <w:t xml:space="preserve">{{ </w:t>
+      </w:r>
+      <w:r>
+        <w:rPr>
+          <w:rFonts w:ascii="Times New Roman" w:hAnsi="Times New Roman"/>
+          <w:lang w:val="en-US"/>
+        </w:rPr>
+        <w:t>contract</w:t>
+      </w:r>
+      <w:proofErr w:type="gramEnd"/>
+      <w:r>
+        <w:rPr>
+          <w:rFonts w:ascii="Times New Roman" w:hAnsi="Times New Roman"/>
+        </w:rPr>
+        <w:t>.</w:t>
+      </w:r>
+      <w:r>
+        <w:rPr>
+          <w:rFonts w:ascii="Times New Roman" w:hAnsi="Times New Roman"/>
+          <w:lang w:val="en-US"/>
+        </w:rPr>
+        <w:t>current</w:t>
+      </w:r>
+      <w:r>
+        <w:rPr>
+          <w:rFonts w:ascii="Times New Roman" w:hAnsi="Times New Roman"/>
+        </w:rPr>
+        <w:t>_</w:t>
+      </w:r>
       <w:proofErr w:type="spellStart"/>
       <w:r>
         <w:rPr>
-          <w:rFonts w:ascii="Times-Roman" w:hAnsi="Times-Roman" w:cs="Times-Roman"/>
-          <w:color w:val="auto"/>
-          <w:szCs w:val="24"/>
-          <w:lang w:val="en-US"/>
-        </w:rPr>
-        <w:t>short_name</w:t>
+          <w:rFonts w:ascii="Times New Roman" w:hAnsi="Times New Roman"/>
+          <w:lang w:val="en-US"/>
+        </w:rPr>
+        <w:t>date_</w:t>
+      </w:r>
+      <w:r>
+        <w:rPr>
+          <w:rFonts w:ascii="Times New Roman" w:hAnsi="Times New Roman"/>
+          <w:lang w:val="en-US"/>
+        </w:rPr>
+        <w:t>numeric</w:t>
       </w:r>
       <w:proofErr w:type="spellEnd"/>
       <w:r>
         <w:rPr>
-          <w:rFonts w:ascii="Times-Roman" w:hAnsi="Times-Roman" w:cs="Times-Roman"/>
-          <w:color w:val="auto"/>
-          <w:szCs w:val="24"/>
-        </w:rPr>
-        <w:t xml:space="preserve"> </w:t>
-      </w:r>
-      <w:r>
-        <w:rPr>
-          <w:rFonts w:ascii="Times-Roman" w:hAnsi="Times-Roman" w:cs="Times-Roman"/>
-          <w:color w:val="auto"/>
-          <w:szCs w:val="24"/>
-        </w:rPr>
-        <w:t>}}</w:t>
-      </w:r>
-      <w:r>
-        <w:rPr>
-          <w:rFonts w:ascii="Times-Roman" w:hAnsi="Times-Roman" w:cs="Times-Roman"/>
-          <w:color w:val="auto"/>
-          <w:szCs w:val="24"/>
-          <w:lang w:val="en-US"/>
-        </w:rPr>
-        <w:t xml:space="preserve"> </w:t>
-      </w:r>
-      <w:r>
-        <w:rPr>
-          <w:rFonts w:ascii="Times New Roman" w:hAnsi="Times New Roman"/>
-        </w:rPr>
-        <w:t>/</w:t>
-      </w:r>
-    </w:p>
-    <w:bookmarkEnd w:id="2"/>
-    <w:p>
-      <w:pPr>
-        <w:rPr>
-          <w:rFonts w:ascii="Times New Roman" w:hAnsi="Times New Roman"/>
-          <w:b/>
-        </w:rPr>
-      </w:pPr>
-    </w:p>
-    <w:p>
-      <w:pPr>
-        <w:rPr>
-          <w:rFonts w:ascii="Times New Roman" w:hAnsi="Times New Roman"/>
-          <w:b/>
-        </w:rPr>
-      </w:pPr>
-    </w:p>
-    <w:p>
-      <w:pPr>
-        <w:rPr>
-          <w:rFonts w:ascii="Times New Roman" w:hAnsi="Times New Roman"/>
-          <w:b/>
-        </w:rPr>
-      </w:pPr>
-    </w:p>
-    <w:p>
-      <w:pPr>
-        <w:rPr>
-          <w:rFonts w:ascii="Times New Roman" w:hAnsi="Times New Roman"/>
-          <w:b/>
-        </w:rPr>
-      </w:pPr>
-    </w:p>
-    <w:p>
-      <w:pPr>
-        <w:rPr>
-          <w:rFonts w:ascii="Times New Roman" w:hAnsi="Times New Roman"/>
-          <w:b/>
-        </w:rPr>
-      </w:pPr>
-    </w:p>
-    <w:p>
-      <w:pPr>
-        <w:rPr>
-          <w:rFonts w:ascii="Times New Roman" w:hAnsi="Times New Roman"/>
-          <w:b/>
-        </w:rPr>
-      </w:pPr>
-    </w:p>
-    <w:p>
-      <w:pPr>
-        <w:rPr>
-          <w:rFonts w:ascii="Times New Roman" w:hAnsi="Times New Roman"/>
-          <w:b/>
-        </w:rPr>
-      </w:pPr>
-    </w:p>
-    <w:p>
-      <w:pPr>
-        <w:rPr>
-          <w:rFonts w:ascii="Times New Roman" w:hAnsi="Times New Roman"/>
-          <w:b/>
-        </w:rPr>
-      </w:pPr>
-    </w:p>
-    <w:p>
-      <w:pPr>
-        <w:rPr>
-          <w:rFonts w:ascii="Times New Roman" w:hAnsi="Times New Roman"/>
-          <w:b/>
-        </w:rPr>
-      </w:pPr>
-    </w:p>
-    <w:p>
-      <w:pPr>
-        <w:rPr>
-          <w:rFonts w:ascii="Times New Roman" w:hAnsi="Times New Roman"/>
-          <w:b/>
-        </w:rPr>
-      </w:pPr>
-    </w:p>
-    <w:p>
-      <w:pPr>
-        <w:rPr>
-          <w:rFonts w:ascii="Times New Roman" w:hAnsi="Times New Roman"/>
-          <w:b/>
-        </w:rPr>
-      </w:pPr>
-    </w:p>
-    <w:p>
-      <w:pPr>
-        <w:rPr>
-          <w:rFonts w:ascii="Times New Roman" w:hAnsi="Times New Roman"/>
-          <w:b/>
-        </w:rPr>
-      </w:pPr>
-    </w:p>
-    <w:p>
-      <w:pPr>
-        <w:rPr>
-          <w:rFonts w:ascii="Times New Roman" w:hAnsi="Times New Roman"/>
-          <w:b/>
-        </w:rPr>
-      </w:pPr>
-    </w:p>
-    <w:p>
-      <w:pPr>
-        <w:rPr>
-          <w:rFonts w:ascii="Times New Roman" w:hAnsi="Times New Roman"/>
-          <w:b/>
-        </w:rPr>
-      </w:pPr>
-    </w:p>
-    <w:p>
-      <w:pPr>
-        <w:rPr>
-          <w:rFonts w:ascii="Times New Roman" w:hAnsi="Times New Roman"/>
-          <w:b/>
-        </w:rPr>
-      </w:pPr>
-    </w:p>
-    <w:p>
-      <w:pPr>
-        <w:rPr>
-          <w:rFonts w:ascii="Times New Roman" w:hAnsi="Times New Roman"/>
-          <w:b/>
-        </w:rPr>
-      </w:pPr>
-    </w:p>
-    <w:p>
-      <w:pPr>
-        <w:rPr>
-          <w:rFonts w:ascii="Times New Roman" w:hAnsi="Times New Roman"/>
-          <w:b/>
-        </w:rPr>
-      </w:pPr>
-    </w:p>
-    <w:p>
-      <w:pPr>
-        <w:rPr>
-          <w:rFonts w:ascii="Times New Roman" w:hAnsi="Times New Roman"/>
-          <w:b/>
-        </w:rPr>
-      </w:pPr>
-    </w:p>
-    <w:p>
-      <w:pPr>
-        <w:rPr>
-          <w:rFonts w:ascii="Times New Roman" w:hAnsi="Times New Roman"/>
-          <w:b/>
-        </w:rPr>
-      </w:pPr>
-    </w:p>
-    <w:p>
-      <w:pPr>
-        <w:rPr>
-          <w:rFonts w:ascii="Times New Roman" w:hAnsi="Times New Roman"/>
-          <w:b/>
-        </w:rPr>
-      </w:pPr>
-    </w:p>
-    <w:p>
-      <w:pPr>
-        <w:rPr>
-          <w:rFonts w:ascii="Times New Roman" w:hAnsi="Times New Roman"/>
-          <w:b/>
-        </w:rPr>
-      </w:pPr>
-      <w:r>
-        <w:rPr>
-          <w:rFonts w:ascii="Times New Roman" w:hAnsi="Times New Roman"/>
-          <w:b/>
-        </w:rPr>
-        <w:t>Приложение 1. СПЕЦИФИКАЦИЯ №1 от</w:t>
-      </w:r>
-      <w:r>
-        <w:rPr>
-          <w:rFonts w:ascii="Times New Roman" w:hAnsi="Times New Roman"/>
-        </w:rPr>
-        <w:t xml:space="preserve"> </w:t>
-      </w:r>
-      <w:r>
-        <w:rPr>
-          <w:rFonts w:ascii="Times New Roman" w:hAnsi="Times New Roman"/>
-          <w:b/>
-        </w:rPr>
-        <w:t>06.05</w:t>
-      </w:r>
-      <w:r>
-        <w:rPr>
-          <w:rFonts w:ascii="Times New Roman" w:hAnsi="Times New Roman"/>
-          <w:b/>
-        </w:rPr>
-        <w:t>.04.2026</w:t>
+          <w:rFonts w:ascii="Times New Roman" w:hAnsi="Times New Roman"/>
+          <w:lang w:val="en-US"/>
+        </w:rPr>
+        <w:t xml:space="preserve"> }}</w:t>
       </w:r>
       <w:r>
         <w:rPr>
@@ -2702,6 +2867,7 @@
         <w:t>{{</w:t>
       </w:r>
       <w:proofErr w:type="spellStart"/>
+      <w:proofErr w:type="gramStart"/>
       <w:r>
         <w:rPr>
           <w:rFonts w:ascii="Times-Roman" w:hAnsi="Times-Roman" w:cs="Times-Roman"/>
@@ -2712,6 +2878,7 @@
         <w:t>specification.brand</w:t>
       </w:r>
       <w:proofErr w:type="spellEnd"/>
+      <w:proofErr w:type="gramEnd"/>
       <w:r>
         <w:rPr>
           <w:rFonts w:ascii="Times-Roman" w:hAnsi="Times-Roman" w:cs="Times-Roman"/>
@@ -2777,6 +2944,7 @@
         <w:t>{{</w:t>
       </w:r>
       <w:proofErr w:type="spellStart"/>
+      <w:proofErr w:type="gramStart"/>
       <w:r>
         <w:rPr>
           <w:rFonts w:ascii="Times-Roman" w:hAnsi="Times-Roman" w:cs="Times-Roman"/>
@@ -2787,6 +2955,7 @@
         <w:t>specification.model</w:t>
       </w:r>
       <w:proofErr w:type="spellEnd"/>
+      <w:proofErr w:type="gramEnd"/>
       <w:r>
         <w:rPr>
           <w:rFonts w:ascii="Times-Roman" w:hAnsi="Times-Roman" w:cs="Times-Roman"/>
@@ -2831,6 +3000,7 @@
         <w:t>{{</w:t>
       </w:r>
       <w:proofErr w:type="spellStart"/>
+      <w:proofErr w:type="gramStart"/>
       <w:r>
         <w:rPr>
           <w:rFonts w:ascii="Times-Roman" w:hAnsi="Times-Roman" w:cs="Times-Roman"/>
@@ -2841,6 +3011,7 @@
         <w:t>specification.year</w:t>
       </w:r>
       <w:proofErr w:type="spellEnd"/>
+      <w:proofErr w:type="gramEnd"/>
       <w:r>
         <w:rPr>
           <w:rFonts w:ascii="Times-Roman" w:hAnsi="Times-Roman" w:cs="Times-Roman"/>
@@ -2906,9 +3077,25 @@
       </w:r>
       <w:r>
         <w:rPr>
+          <w:rFonts w:ascii="Times-Roman" w:hAnsi="Times-Roman" w:cs="Times-Roman"/>
+          <w:color w:val="auto"/>
+          <w:szCs w:val="24"/>
+          <w:lang w:val="en-US"/>
+        </w:rPr>
+        <w:t xml:space="preserve"> </w:t>
+      </w:r>
+      <w:r>
+        <w:rPr>
           <w:rFonts w:ascii="Times New Roman" w:hAnsi="Times New Roman"/>
         </w:rPr>
         <w:t>л</w:t>
+      </w:r>
+      <w:r>
+        <w:rPr>
+          <w:rFonts w:ascii="Times New Roman" w:hAnsi="Times New Roman"/>
+          <w:lang w:val="en-US"/>
+        </w:rPr>
+        <w:t>.</w:t>
       </w:r>
     </w:p>
     <w:p>
@@ -3004,6 +3191,7 @@
         <w:t>{{</w:t>
       </w:r>
       <w:proofErr w:type="spellStart"/>
+      <w:proofErr w:type="gramStart"/>
       <w:r>
         <w:rPr>
           <w:rFonts w:ascii="Times-Roman" w:hAnsi="Times-Roman" w:cs="Times-Roman"/>
@@ -3014,6 +3202,7 @@
         <w:t>specification.drive</w:t>
       </w:r>
       <w:proofErr w:type="spellEnd"/>
+      <w:proofErr w:type="gramEnd"/>
       <w:r>
         <w:rPr>
           <w:rFonts w:ascii="Times-Roman" w:hAnsi="Times-Roman" w:cs="Times-Roman"/>
@@ -3050,6 +3239,7 @@
         <w:t>{{</w:t>
       </w:r>
       <w:proofErr w:type="spellStart"/>
+      <w:proofErr w:type="gramStart"/>
       <w:r>
         <w:rPr>
           <w:rFonts w:ascii="Times-Roman" w:hAnsi="Times-Roman" w:cs="Times-Roman"/>
@@ -3060,6 +3250,7 @@
         <w:t>specification.transmission</w:t>
       </w:r>
       <w:proofErr w:type="spellEnd"/>
+      <w:proofErr w:type="gramEnd"/>
       <w:r>
         <w:rPr>
           <w:rFonts w:ascii="Times-Roman" w:hAnsi="Times-Roman" w:cs="Times-Roman"/>
@@ -3096,6 +3287,7 @@
         <w:t>{{</w:t>
       </w:r>
       <w:proofErr w:type="spellStart"/>
+      <w:proofErr w:type="gramStart"/>
       <w:r>
         <w:rPr>
           <w:rFonts w:ascii="Times-Roman" w:hAnsi="Times-Roman" w:cs="Times-Roman"/>
@@ -3106,6 +3298,7 @@
         <w:t>specification.color</w:t>
       </w:r>
       <w:proofErr w:type="spellEnd"/>
+      <w:proofErr w:type="gramEnd"/>
       <w:r>
         <w:rPr>
           <w:rFonts w:ascii="Times-Roman" w:hAnsi="Times-Roman" w:cs="Times-Roman"/>
@@ -3157,6 +3350,7 @@
         <w:t>{{</w:t>
       </w:r>
       <w:proofErr w:type="spellStart"/>
+      <w:proofErr w:type="gramStart"/>
       <w:r>
         <w:rPr>
           <w:rFonts w:ascii="Times-Roman" w:hAnsi="Times-Roman" w:cs="Times-Roman"/>
@@ -3167,6 +3361,7 @@
         <w:t>specification.complectation</w:t>
       </w:r>
       <w:proofErr w:type="spellEnd"/>
+      <w:proofErr w:type="gramEnd"/>
       <w:r>
         <w:rPr>
           <w:rFonts w:ascii="Times-Roman" w:hAnsi="Times-Roman" w:cs="Times-Roman"/>
@@ -3209,6 +3404,7 @@
         <w:t>{{</w:t>
       </w:r>
       <w:proofErr w:type="spellStart"/>
+      <w:proofErr w:type="gramStart"/>
       <w:r>
         <w:rPr>
           <w:rFonts w:ascii="Times-Roman" w:hAnsi="Times-Roman" w:cs="Times-Roman"/>
@@ -3219,6 +3415,7 @@
         <w:t>specification.mileage</w:t>
       </w:r>
       <w:proofErr w:type="spellEnd"/>
+      <w:proofErr w:type="gramEnd"/>
       <w:r>
         <w:rPr>
           <w:rFonts w:ascii="Times-Roman" w:hAnsi="Times-Roman" w:cs="Times-Roman"/>
@@ -3277,6 +3474,7 @@
         <w:t>{{</w:t>
       </w:r>
       <w:proofErr w:type="spellStart"/>
+      <w:proofErr w:type="gramStart"/>
       <w:r>
         <w:rPr>
           <w:rFonts w:ascii="Times-Roman" w:hAnsi="Times-Roman" w:cs="Times-Roman"/>
@@ -3287,6 +3485,7 @@
         <w:t>specification.price</w:t>
       </w:r>
       <w:proofErr w:type="spellEnd"/>
+      <w:proofErr w:type="gramEnd"/>
       <w:r>
         <w:rPr>
           <w:rFonts w:ascii="Times-Roman" w:hAnsi="Times-Roman" w:cs="Times-Roman"/>
@@ -3307,8 +3506,9 @@
       </w:r>
       <w:r>
         <w:rPr>
-          <w:rFonts w:ascii="Avenir Book" w:hAnsi="Avenir Book"/>
-          <w:b/>
+          <w:rFonts w:ascii="Times New Roman" w:hAnsi="Times New Roman"/>
+          <w:color w:val="333333"/>
+          <w:highlight w:val="white"/>
           <w:lang w:val="en-US"/>
         </w:rPr>
         <w:t>¥</w:t>
@@ -3432,6 +3632,7 @@
         </w:rPr>
         <w:t>{{</w:t>
       </w:r>
+      <w:proofErr w:type="gramStart"/>
       <w:r>
         <w:rPr>
           <w:rFonts w:ascii="Times-Roman" w:hAnsi="Times-Roman" w:cs="Times-Roman"/>
@@ -3457,7 +3658,17 @@
           <w:szCs w:val="24"/>
           <w:lang w:val="en-US"/>
         </w:rPr>
-        <w:t>short_name</w:t>
+        <w:t>short</w:t>
+      </w:r>
+      <w:proofErr w:type="gramEnd"/>
+      <w:r>
+        <w:rPr>
+          <w:rFonts w:ascii="Times-Roman" w:hAnsi="Times-Roman" w:cs="Times-Roman"/>
+          <w:color w:val="auto"/>
+          <w:szCs w:val="24"/>
+          <w:lang w:val="en-US"/>
+        </w:rPr>
+        <w:t>_name</w:t>
       </w:r>
       <w:proofErr w:type="spellEnd"/>
       <w:r>
@@ -4973,7 +5184,6 @@
     </w:p>
     <w:p>
       <w:pPr>
-        <w:jc w:val="center"/>
         <w:rPr>
           <w:rFonts w:ascii="Times New Roman" w:hAnsi="Times New Roman"/>
         </w:rPr>
@@ -4996,7 +5206,6 @@
       <w:pPr>
         <w:rPr>
           <w:rFonts w:ascii="Times New Roman" w:hAnsi="Times New Roman"/>
-          <w:lang w:val="en-US"/>
         </w:rPr>
       </w:pPr>
       <w:r>
@@ -5010,7 +5219,7 @@
           <w:rFonts w:ascii="Times New Roman" w:hAnsi="Times New Roman"/>
           <w:b/>
         </w:rPr>
-        <w:t xml:space="preserve">                             Заказчик:</w:t>
+        <w:t>Заказчик:</w:t>
       </w:r>
       <w:r>
         <w:rPr>
@@ -5032,6 +5241,7 @@
         </w:rPr>
         <w:t>{{</w:t>
       </w:r>
+      <w:proofErr w:type="gramStart"/>
       <w:r>
         <w:rPr>
           <w:rFonts w:ascii="Times-Roman" w:hAnsi="Times-Roman" w:cs="Times-Roman"/>
@@ -5049,17 +5259,33 @@
         </w:rPr>
         <w:t>.</w:t>
       </w:r>
-      <w:proofErr w:type="spellStart"/>
-      <w:r>
-        <w:rPr>
-          <w:rFonts w:ascii="Times-Roman" w:hAnsi="Times-Roman" w:cs="Times-Roman"/>
-          <w:color w:val="auto"/>
-          <w:szCs w:val="24"/>
-          <w:lang w:val="en-US"/>
-        </w:rPr>
-        <w:t>short_name</w:t>
-      </w:r>
-      <w:proofErr w:type="spellEnd"/>
+      <w:r>
+        <w:rPr>
+          <w:rFonts w:ascii="Times-Roman" w:hAnsi="Times-Roman" w:cs="Times-Roman"/>
+          <w:color w:val="auto"/>
+          <w:szCs w:val="24"/>
+          <w:lang w:val="en-US"/>
+        </w:rPr>
+        <w:t>short</w:t>
+      </w:r>
+      <w:proofErr w:type="gramEnd"/>
+      <w:r>
+        <w:rPr>
+          <w:rFonts w:ascii="Times-Roman" w:hAnsi="Times-Roman" w:cs="Times-Roman"/>
+          <w:color w:val="auto"/>
+          <w:szCs w:val="24"/>
+        </w:rPr>
+        <w:t>_</w:t>
+      </w:r>
+      <w:r>
+        <w:rPr>
+          <w:rFonts w:ascii="Times-Roman" w:hAnsi="Times-Roman" w:cs="Times-Roman"/>
+          <w:color w:val="auto"/>
+          <w:szCs w:val="24"/>
+          <w:lang w:val="en-US"/>
+        </w:rPr>
+        <w:t>name</w:t>
+      </w:r>
       <w:r>
         <w:rPr>
           <w:rFonts w:ascii="Times-Roman" w:hAnsi="Times-Roman" w:cs="Times-Roman"/>
@@ -5073,7 +5299,6 @@
           <w:rFonts w:ascii="Times-Roman" w:hAnsi="Times-Roman" w:cs="Times-Roman"/>
           <w:color w:val="auto"/>
           <w:szCs w:val="24"/>
-          <w:lang w:val="en-US"/>
         </w:rPr>
         <w:t xml:space="preserve"> /</w:t>
       </w:r>
@@ -5142,8 +5367,9 @@
         <w:rPr>
           <w:rFonts w:ascii="Times New Roman" w:hAnsi="Times New Roman"/>
         </w:rPr>
-        <w:t xml:space="preserve">Для оплаты инвойса, выставленного китайской стороной  на приобретение автомобиля, Заказчику необходимо открыть дебетовую карту и установить приложение Банка ВТБ (в любом отделении РФ). Пополнить счет на сумму стоимости автомобиля в рублях согласно текущего курса покупки юаней </w:t>
-      </w:r>
+        <w:t xml:space="preserve">Для оплаты инвойса, выставленного китайской стороной на приобретение автомобиля, Заказчику необходимо открыть дебетовую карту и установить приложение Банка ВТБ (в любом отделении РФ). Пополнить счет на сумму стоимости автомобиля в рублях согласно текущего курса покупки юаней </w:t>
+      </w:r>
+      <w:bookmarkStart w:id="3" w:name="OLE_LINK1"/>
       <w:r>
         <w:rPr>
           <w:rFonts w:ascii="Times New Roman" w:hAnsi="Times New Roman"/>
@@ -5152,11 +5378,12 @@
         </w:rPr>
         <w:t>¥</w:t>
       </w:r>
-      <w:r>
-        <w:rPr>
-          <w:rFonts w:ascii="Times New Roman" w:hAnsi="Times New Roman"/>
-        </w:rPr>
-        <w:t xml:space="preserve">  Банка ВТБ. Через приложение осуществить покупку юаней </w:t>
+      <w:bookmarkEnd w:id="3"/>
+      <w:r>
+        <w:rPr>
+          <w:rFonts w:ascii="Times New Roman" w:hAnsi="Times New Roman"/>
+        </w:rPr>
+        <w:t xml:space="preserve"> Банка ВТБ. Через приложение осуществить покупку юаней </w:t>
       </w:r>
       <w:r>
         <w:rPr>
@@ -5373,12 +5600,191 @@
           <w:rFonts w:ascii="Times New Roman" w:hAnsi="Times New Roman"/>
           <w:sz w:val="22"/>
         </w:rPr>
-        <w:t xml:space="preserve">Настоящим я, </w:t>
-      </w:r>
-      <w:r>
-        <w:rPr>
-          <w:rFonts w:ascii="Times New Roman" w:hAnsi="Times New Roman"/>
-          <w:b/>
+        <w:t>Настоящим я</w:t>
+      </w:r>
+      <w:proofErr w:type="gramStart"/>
+      <w:r>
+        <w:rPr>
+          <w:rFonts w:ascii="Times New Roman" w:hAnsi="Times New Roman"/>
+          <w:sz w:val="22"/>
+        </w:rPr>
+        <w:t xml:space="preserve">, </w:t>
+      </w:r>
+      <w:r>
+        <w:rPr>
+          <w:rFonts w:ascii="Times New Roman" w:hAnsi="Times New Roman"/>
+          <w:b/>
+        </w:rPr>
+        <w:t>:</w:t>
+      </w:r>
+      <w:proofErr w:type="gramEnd"/>
+      <w:r>
+        <w:rPr>
+          <w:rFonts w:ascii="Times New Roman" w:hAnsi="Times New Roman"/>
+          <w:b/>
+        </w:rPr>
+        <w:t xml:space="preserve"> </w:t>
+      </w:r>
+      <w:r>
+        <w:rPr>
+          <w:rFonts w:ascii="Times-Roman" w:hAnsi="Times-Roman" w:cs="Times-Roman"/>
+          <w:color w:val="auto"/>
+          <w:szCs w:val="24"/>
+        </w:rPr>
+        <w:t>{{</w:t>
+      </w:r>
+      <w:r>
+        <w:rPr>
+          <w:rFonts w:ascii="Times-Roman" w:hAnsi="Times-Roman" w:cs="Times-Roman"/>
+          <w:color w:val="auto"/>
+          <w:szCs w:val="24"/>
+          <w:lang w:val="en-US"/>
+        </w:rPr>
+        <w:t>customer</w:t>
+      </w:r>
+      <w:r>
+        <w:rPr>
+          <w:rFonts w:ascii="Times-Roman" w:hAnsi="Times-Roman" w:cs="Times-Roman"/>
+          <w:color w:val="auto"/>
+          <w:szCs w:val="24"/>
+        </w:rPr>
+        <w:t>.</w:t>
+      </w:r>
+      <w:r>
+        <w:rPr>
+          <w:rFonts w:ascii="Times-Roman" w:hAnsi="Times-Roman" w:cs="Times-Roman"/>
+          <w:color w:val="auto"/>
+          <w:szCs w:val="24"/>
+          <w:lang w:val="en-US"/>
+        </w:rPr>
+        <w:t>last</w:t>
+      </w:r>
+      <w:r>
+        <w:rPr>
+          <w:rFonts w:ascii="Times-Roman" w:hAnsi="Times-Roman" w:cs="Times-Roman"/>
+          <w:color w:val="auto"/>
+          <w:szCs w:val="24"/>
+        </w:rPr>
+        <w:t>_</w:t>
+      </w:r>
+      <w:r>
+        <w:rPr>
+          <w:rFonts w:ascii="Times-Roman" w:hAnsi="Times-Roman" w:cs="Times-Roman"/>
+          <w:color w:val="auto"/>
+          <w:szCs w:val="24"/>
+          <w:lang w:val="en-US"/>
+        </w:rPr>
+        <w:t>name</w:t>
+      </w:r>
+      <w:r>
+        <w:rPr>
+          <w:rFonts w:ascii="Times-Roman" w:hAnsi="Times-Roman" w:cs="Times-Roman"/>
+          <w:color w:val="auto"/>
+          <w:szCs w:val="24"/>
+        </w:rPr>
+        <w:t>}} {{</w:t>
+      </w:r>
+      <w:r>
+        <w:rPr>
+          <w:rFonts w:ascii="Times-Roman" w:hAnsi="Times-Roman" w:cs="Times-Roman"/>
+          <w:color w:val="auto"/>
+          <w:szCs w:val="24"/>
+          <w:lang w:val="en-US"/>
+        </w:rPr>
+        <w:t>customer</w:t>
+      </w:r>
+      <w:r>
+        <w:rPr>
+          <w:rFonts w:ascii="Times-Roman" w:hAnsi="Times-Roman" w:cs="Times-Roman"/>
+          <w:color w:val="auto"/>
+          <w:szCs w:val="24"/>
+        </w:rPr>
+        <w:t>.</w:t>
+      </w:r>
+      <w:r>
+        <w:rPr>
+          <w:rFonts w:ascii="Times-Roman" w:hAnsi="Times-Roman" w:cs="Times-Roman"/>
+          <w:color w:val="auto"/>
+          <w:szCs w:val="24"/>
+          <w:lang w:val="en-US"/>
+        </w:rPr>
+        <w:t>first</w:t>
+      </w:r>
+      <w:r>
+        <w:rPr>
+          <w:rFonts w:ascii="Times-Roman" w:hAnsi="Times-Roman" w:cs="Times-Roman"/>
+          <w:color w:val="auto"/>
+          <w:szCs w:val="24"/>
+        </w:rPr>
+        <w:t>_</w:t>
+      </w:r>
+      <w:r>
+        <w:rPr>
+          <w:rFonts w:ascii="Times-Roman" w:hAnsi="Times-Roman" w:cs="Times-Roman"/>
+          <w:color w:val="auto"/>
+          <w:szCs w:val="24"/>
+          <w:lang w:val="en-US"/>
+        </w:rPr>
+        <w:t>name</w:t>
+      </w:r>
+      <w:r>
+        <w:rPr>
+          <w:rFonts w:ascii="Times-Roman" w:hAnsi="Times-Roman" w:cs="Times-Roman"/>
+          <w:color w:val="auto"/>
+          <w:szCs w:val="24"/>
+        </w:rPr>
+        <w:t>}} {{</w:t>
+      </w:r>
+      <w:r>
+        <w:rPr>
+          <w:rFonts w:ascii="Times-Roman" w:hAnsi="Times-Roman" w:cs="Times-Roman"/>
+          <w:color w:val="auto"/>
+          <w:szCs w:val="24"/>
+          <w:lang w:val="en-US"/>
+        </w:rPr>
+        <w:t>customer</w:t>
+      </w:r>
+      <w:r>
+        <w:rPr>
+          <w:rFonts w:ascii="Times-Roman" w:hAnsi="Times-Roman" w:cs="Times-Roman"/>
+          <w:color w:val="auto"/>
+          <w:szCs w:val="24"/>
+        </w:rPr>
+        <w:t>.</w:t>
+      </w:r>
+      <w:r>
+        <w:rPr>
+          <w:rFonts w:ascii="Times-Roman" w:hAnsi="Times-Roman" w:cs="Times-Roman"/>
+          <w:color w:val="auto"/>
+          <w:szCs w:val="24"/>
+          <w:lang w:val="en-US"/>
+        </w:rPr>
+        <w:t>surname</w:t>
+      </w:r>
+      <w:r>
+        <w:rPr>
+          <w:rFonts w:ascii="Times-Roman" w:hAnsi="Times-Roman" w:cs="Times-Roman"/>
+          <w:color w:val="auto"/>
+          <w:szCs w:val="24"/>
+        </w:rPr>
+        <w:t>}}</w:t>
+      </w:r>
+    </w:p>
+    <w:p>
+      <w:pPr>
+        <w:rPr>
+          <w:rFonts w:ascii="Times New Roman" w:hAnsi="Times New Roman"/>
+        </w:rPr>
+      </w:pPr>
+      <w:r>
+        <w:rPr>
+          <w:rFonts w:ascii="Times New Roman" w:hAnsi="Times New Roman"/>
+        </w:rPr>
+        <w:t>Паспорт</w:t>
+      </w:r>
+      <w:r>
+        <w:rPr>
+          <w:rFonts w:ascii="Times New Roman" w:hAnsi="Times New Roman"/>
         </w:rPr>
         <w:t xml:space="preserve">: </w:t>
       </w:r>
@@ -5390,6 +5796,7 @@
         </w:rPr>
         <w:t>{{</w:t>
       </w:r>
+      <w:proofErr w:type="gramStart"/>
       <w:r>
         <w:rPr>
           <w:rFonts w:ascii="Times-Roman" w:hAnsi="Times-Roman" w:cs="Times-Roman"/>
@@ -5414,7 +5821,68 @@
           <w:szCs w:val="24"/>
           <w:lang w:val="en-US"/>
         </w:rPr>
-        <w:t>last</w:t>
+        <w:t>passport</w:t>
+      </w:r>
+      <w:proofErr w:type="gramEnd"/>
+      <w:r>
+        <w:rPr>
+          <w:rFonts w:ascii="Times-Roman" w:hAnsi="Times-Roman" w:cs="Times-Roman"/>
+          <w:color w:val="auto"/>
+          <w:szCs w:val="24"/>
+        </w:rPr>
+        <w:t>}},</w:t>
+      </w:r>
+      <w:r>
+        <w:rPr>
+          <w:rFonts w:ascii="Times New Roman" w:hAnsi="Times New Roman"/>
+        </w:rPr>
+        <w:t xml:space="preserve"> </w:t>
+      </w:r>
+      <w:r>
+        <w:rPr>
+          <w:rFonts w:ascii="Times New Roman" w:hAnsi="Times New Roman"/>
+        </w:rPr>
+        <w:t>выдан</w:t>
+      </w:r>
+      <w:r>
+        <w:rPr>
+          <w:rFonts w:ascii="Times New Roman" w:hAnsi="Times New Roman"/>
+        </w:rPr>
+        <w:t xml:space="preserve"> </w:t>
+      </w:r>
+      <w:r>
+        <w:rPr>
+          <w:rFonts w:ascii="Times-Roman" w:hAnsi="Times-Roman" w:cs="Times-Roman"/>
+          <w:color w:val="auto"/>
+          <w:szCs w:val="24"/>
+        </w:rPr>
+        <w:t>{{</w:t>
+      </w:r>
+      <w:r>
+        <w:rPr>
+          <w:rFonts w:ascii="Times-Roman" w:hAnsi="Times-Roman" w:cs="Times-Roman"/>
+          <w:color w:val="auto"/>
+          <w:szCs w:val="24"/>
+          <w:lang w:val="en-US"/>
+        </w:rPr>
+        <w:t>customer</w:t>
+      </w:r>
+      <w:r>
+        <w:rPr>
+          <w:rFonts w:ascii="Times-Roman" w:hAnsi="Times-Roman" w:cs="Times-Roman"/>
+          <w:color w:val="auto"/>
+          <w:szCs w:val="24"/>
+        </w:rPr>
+        <w:t>.</w:t>
+      </w:r>
+      <w:r>
+        <w:rPr>
+          <w:rFonts w:ascii="Times-Roman" w:hAnsi="Times-Roman" w:cs="Times-Roman"/>
+          <w:color w:val="auto"/>
+          <w:szCs w:val="24"/>
+          <w:lang w:val="en-US"/>
+        </w:rPr>
+        <w:t>date</w:t>
       </w:r>
       <w:r>
         <w:rPr>
@@ -5431,15 +5899,29 @@
           <w:szCs w:val="24"/>
           <w:lang w:val="en-US"/>
         </w:rPr>
-        <w:t>name</w:t>
-      </w:r>
-      <w:r>
-        <w:rPr>
-          <w:rFonts w:ascii="Times-Roman" w:hAnsi="Times-Roman" w:cs="Times-Roman"/>
-          <w:color w:val="auto"/>
-          <w:szCs w:val="24"/>
-        </w:rPr>
-        <w:t>}} {{</w:t>
+        <w:t>issue</w:t>
+      </w:r>
+      <w:r>
+        <w:rPr>
+          <w:rFonts w:ascii="Times-Roman" w:hAnsi="Times-Roman" w:cs="Times-Roman"/>
+          <w:color w:val="auto"/>
+          <w:szCs w:val="24"/>
+        </w:rPr>
+        <w:t>}}</w:t>
+      </w:r>
+      <w:r>
+        <w:rPr>
+          <w:rFonts w:ascii="Times New Roman" w:hAnsi="Times New Roman"/>
+        </w:rPr>
+        <w:t xml:space="preserve"> </w:t>
+      </w:r>
+      <w:r>
+        <w:rPr>
+          <w:rFonts w:ascii="Times-Roman" w:hAnsi="Times-Roman" w:cs="Times-Roman"/>
+          <w:color w:val="auto"/>
+          <w:szCs w:val="24"/>
+        </w:rPr>
+        <w:t>{{</w:t>
       </w:r>
       <w:r>
         <w:rPr>
@@ -5465,7 +5947,7 @@
           <w:szCs w:val="24"/>
           <w:lang w:val="en-US"/>
         </w:rPr>
-        <w:t>first</w:t>
+        <w:t>by</w:t>
       </w:r>
       <w:r>
         <w:rPr>
@@ -5482,15 +5964,70 @@
           <w:szCs w:val="24"/>
           <w:lang w:val="en-US"/>
         </w:rPr>
-        <w:t>name</w:t>
-      </w:r>
-      <w:r>
-        <w:rPr>
-          <w:rFonts w:ascii="Times-Roman" w:hAnsi="Times-Roman" w:cs="Times-Roman"/>
-          <w:color w:val="auto"/>
-          <w:szCs w:val="24"/>
-        </w:rPr>
-        <w:t>}} {{</w:t>
+        <w:t>whom</w:t>
+      </w:r>
+      <w:r>
+        <w:rPr>
+          <w:rFonts w:ascii="Times-Roman" w:hAnsi="Times-Roman" w:cs="Times-Roman"/>
+          <w:color w:val="auto"/>
+          <w:szCs w:val="24"/>
+        </w:rPr>
+        <w:t>_</w:t>
+      </w:r>
+      <w:r>
+        <w:rPr>
+          <w:rFonts w:ascii="Times-Roman" w:hAnsi="Times-Roman" w:cs="Times-Roman"/>
+          <w:color w:val="auto"/>
+          <w:szCs w:val="24"/>
+          <w:lang w:val="en-US"/>
+        </w:rPr>
+        <w:t>issued</w:t>
+      </w:r>
+      <w:r>
+        <w:rPr>
+          <w:rFonts w:ascii="Times-Roman" w:hAnsi="Times-Roman" w:cs="Times-Roman"/>
+          <w:color w:val="auto"/>
+          <w:szCs w:val="24"/>
+        </w:rPr>
+        <w:t>}},</w:t>
+      </w:r>
+      <w:r>
+        <w:rPr>
+          <w:rFonts w:ascii="Times New Roman" w:hAnsi="Times New Roman"/>
+        </w:rPr>
+        <w:t xml:space="preserve"> </w:t>
+      </w:r>
+      <w:r>
+        <w:rPr>
+          <w:rFonts w:ascii="Times New Roman" w:hAnsi="Times New Roman"/>
+        </w:rPr>
+        <w:t>код</w:t>
+      </w:r>
+      <w:r>
+        <w:rPr>
+          <w:rFonts w:ascii="Times New Roman" w:hAnsi="Times New Roman"/>
+        </w:rPr>
+        <w:t xml:space="preserve"> </w:t>
+      </w:r>
+      <w:r>
+        <w:rPr>
+          <w:rFonts w:ascii="Times New Roman" w:hAnsi="Times New Roman"/>
+        </w:rPr>
+        <w:t>подразделения</w:t>
+      </w:r>
+      <w:r>
+        <w:rPr>
+          <w:rFonts w:ascii="Times New Roman" w:hAnsi="Times New Roman"/>
+        </w:rPr>
+        <w:t xml:space="preserve"> </w:t>
+      </w:r>
+      <w:r>
+        <w:rPr>
+          <w:rFonts w:ascii="Times-Roman" w:hAnsi="Times-Roman" w:cs="Times-Roman"/>
+          <w:color w:val="auto"/>
+          <w:szCs w:val="24"/>
+        </w:rPr>
+        <w:t>{{</w:t>
       </w:r>
       <w:r>
         <w:rPr>
@@ -5516,7 +6053,24 @@
           <w:szCs w:val="24"/>
           <w:lang w:val="en-US"/>
         </w:rPr>
-        <w:t>surname</w:t>
+        <w:t>department</w:t>
+      </w:r>
+      <w:r>
+        <w:rPr>
+          <w:rFonts w:ascii="Times-Roman" w:hAnsi="Times-Roman" w:cs="Times-Roman"/>
+          <w:color w:val="auto"/>
+          <w:szCs w:val="24"/>
+        </w:rPr>
+        <w:t>_</w:t>
+      </w:r>
+      <w:r>
+        <w:rPr>
+          <w:rFonts w:ascii="Times-Roman" w:hAnsi="Times-Roman" w:cs="Times-Roman"/>
+          <w:color w:val="auto"/>
+          <w:szCs w:val="24"/>
+          <w:lang w:val="en-US"/>
+        </w:rPr>
+        <w:t>code</w:t>
       </w:r>
       <w:r>
         <w:rPr>
@@ -5526,19 +6080,6 @@
         </w:rPr>
         <w:t>}}</w:t>
       </w:r>
-    </w:p>
-    <w:p>
-      <w:pPr>
-        <w:rPr>
-          <w:rFonts w:ascii="Times New Roman" w:hAnsi="Times New Roman"/>
-        </w:rPr>
-      </w:pPr>
-      <w:r>
-        <w:rPr>
-          <w:rFonts w:ascii="Times New Roman" w:hAnsi="Times New Roman"/>
-        </w:rPr>
-        <w:t>Паспорт</w:t>
-      </w:r>
       <w:r>
         <w:rPr>
           <w:rFonts w:ascii="Times New Roman" w:hAnsi="Times New Roman"/>
@@ -5547,6 +6088,32 @@
       </w:r>
       <w:r>
         <w:rPr>
+          <w:rFonts w:ascii="Times New Roman" w:hAnsi="Times New Roman"/>
+        </w:rPr>
+        <w:t>Адрес</w:t>
+      </w:r>
+      <w:r>
+        <w:rPr>
+          <w:rFonts w:ascii="Times New Roman" w:hAnsi="Times New Roman"/>
+        </w:rPr>
+        <w:t xml:space="preserve"> </w:t>
+      </w:r>
+      <w:r>
+        <w:rPr>
+          <w:rFonts w:ascii="Times New Roman" w:hAnsi="Times New Roman"/>
+          <w:color w:val="000000" w:themeColor="text1"/>
+        </w:rPr>
+        <w:t>регистрации</w:t>
+      </w:r>
+      <w:r>
+        <w:rPr>
+          <w:rFonts w:ascii="Times New Roman" w:hAnsi="Times New Roman"/>
+          <w:color w:val="000000" w:themeColor="text1"/>
+        </w:rPr>
+        <w:t xml:space="preserve">: </w:t>
+      </w:r>
+      <w:r>
+        <w:rPr>
           <w:rFonts w:ascii="Times-Roman" w:hAnsi="Times-Roman" w:cs="Times-Roman"/>
           <w:color w:val="auto"/>
           <w:szCs w:val="24"/>
@@ -5577,67 +6144,7 @@
           <w:szCs w:val="24"/>
           <w:lang w:val="en-US"/>
         </w:rPr>
-        <w:t>passport</w:t>
-      </w:r>
-      <w:r>
-        <w:rPr>
-          <w:rFonts w:ascii="Times-Roman" w:hAnsi="Times-Roman" w:cs="Times-Roman"/>
-          <w:color w:val="auto"/>
-          <w:szCs w:val="24"/>
-        </w:rPr>
-        <w:t>}},</w:t>
-      </w:r>
-      <w:r>
-        <w:rPr>
-          <w:rFonts w:ascii="Times New Roman" w:hAnsi="Times New Roman"/>
-        </w:rPr>
-        <w:t xml:space="preserve">  </w:t>
-      </w:r>
-      <w:r>
-        <w:rPr>
-          <w:rFonts w:ascii="Times New Roman" w:hAnsi="Times New Roman"/>
-        </w:rPr>
-        <w:t>выдан</w:t>
-      </w:r>
-      <w:r>
-        <w:rPr>
-          <w:rFonts w:ascii="Times New Roman" w:hAnsi="Times New Roman"/>
-        </w:rPr>
-        <w:t xml:space="preserve"> </w:t>
-      </w:r>
-      <w:r>
-        <w:rPr>
-          <w:rFonts w:ascii="Times-Roman" w:hAnsi="Times-Roman" w:cs="Times-Roman"/>
-          <w:color w:val="auto"/>
-          <w:szCs w:val="24"/>
-        </w:rPr>
-        <w:t>{{</w:t>
-      </w:r>
-      <w:r>
-        <w:rPr>
-          <w:rFonts w:ascii="Times-Roman" w:hAnsi="Times-Roman" w:cs="Times-Roman"/>
-          <w:color w:val="auto"/>
-          <w:szCs w:val="24"/>
-          <w:lang w:val="en-US"/>
-        </w:rPr>
-        <w:t>customer</w:t>
-      </w:r>
-      <w:r>
-        <w:rPr>
-          <w:rFonts w:ascii="Times-Roman" w:hAnsi="Times-Roman" w:cs="Times-Roman"/>
-          <w:color w:val="auto"/>
-          <w:szCs w:val="24"/>
-        </w:rPr>
-        <w:t>.</w:t>
-      </w:r>
-      <w:r>
-        <w:rPr>
-          <w:rFonts w:ascii="Times-Roman" w:hAnsi="Times-Roman" w:cs="Times-Roman"/>
-          <w:color w:val="auto"/>
-          <w:szCs w:val="24"/>
-          <w:lang w:val="en-US"/>
-        </w:rPr>
-        <w:t>date</w:t>
+        <w:t>registration</w:t>
       </w:r>
       <w:r>
         <w:rPr>
@@ -5654,7 +6161,7 @@
           <w:szCs w:val="24"/>
           <w:lang w:val="en-US"/>
         </w:rPr>
-        <w:t>issue</w:t>
+        <w:t>address</w:t>
       </w:r>
       <w:r>
         <w:rPr>
@@ -5664,268 +6171,6 @@
         </w:rPr>
         <w:t>}}</w:t>
       </w:r>
-      <w:r>
-        <w:rPr>
-          <w:rFonts w:ascii="Times New Roman" w:hAnsi="Times New Roman"/>
-        </w:rPr>
-        <w:t xml:space="preserve"> </w:t>
-      </w:r>
-      <w:r>
-        <w:rPr>
-          <w:rFonts w:ascii="Times-Roman" w:hAnsi="Times-Roman" w:cs="Times-Roman"/>
-          <w:color w:val="auto"/>
-          <w:szCs w:val="24"/>
-        </w:rPr>
-        <w:t>{{</w:t>
-      </w:r>
-      <w:r>
-        <w:rPr>
-          <w:rFonts w:ascii="Times-Roman" w:hAnsi="Times-Roman" w:cs="Times-Roman"/>
-          <w:color w:val="auto"/>
-          <w:szCs w:val="24"/>
-          <w:lang w:val="en-US"/>
-        </w:rPr>
-        <w:t>customer</w:t>
-      </w:r>
-      <w:r>
-        <w:rPr>
-          <w:rFonts w:ascii="Times-Roman" w:hAnsi="Times-Roman" w:cs="Times-Roman"/>
-          <w:color w:val="auto"/>
-          <w:szCs w:val="24"/>
-        </w:rPr>
-        <w:t>.</w:t>
-      </w:r>
-      <w:r>
-        <w:rPr>
-          <w:rFonts w:ascii="Times-Roman" w:hAnsi="Times-Roman" w:cs="Times-Roman"/>
-          <w:color w:val="auto"/>
-          <w:szCs w:val="24"/>
-          <w:lang w:val="en-US"/>
-        </w:rPr>
-        <w:t>by</w:t>
-      </w:r>
-      <w:r>
-        <w:rPr>
-          <w:rFonts w:ascii="Times-Roman" w:hAnsi="Times-Roman" w:cs="Times-Roman"/>
-          <w:color w:val="auto"/>
-          <w:szCs w:val="24"/>
-        </w:rPr>
-        <w:t>_</w:t>
-      </w:r>
-      <w:r>
-        <w:rPr>
-          <w:rFonts w:ascii="Times-Roman" w:hAnsi="Times-Roman" w:cs="Times-Roman"/>
-          <w:color w:val="auto"/>
-          <w:szCs w:val="24"/>
-          <w:lang w:val="en-US"/>
-        </w:rPr>
-        <w:t>whom</w:t>
-      </w:r>
-      <w:r>
-        <w:rPr>
-          <w:rFonts w:ascii="Times-Roman" w:hAnsi="Times-Roman" w:cs="Times-Roman"/>
-          <w:color w:val="auto"/>
-          <w:szCs w:val="24"/>
-        </w:rPr>
-        <w:t>_</w:t>
-      </w:r>
-      <w:r>
-        <w:rPr>
-          <w:rFonts w:ascii="Times-Roman" w:hAnsi="Times-Roman" w:cs="Times-Roman"/>
-          <w:color w:val="auto"/>
-          <w:szCs w:val="24"/>
-          <w:lang w:val="en-US"/>
-        </w:rPr>
-        <w:t>issued</w:t>
-      </w:r>
-      <w:r>
-        <w:rPr>
-          <w:rFonts w:ascii="Times-Roman" w:hAnsi="Times-Roman" w:cs="Times-Roman"/>
-          <w:color w:val="auto"/>
-          <w:szCs w:val="24"/>
-        </w:rPr>
-        <w:t>}},</w:t>
-      </w:r>
-      <w:r>
-        <w:rPr>
-          <w:rFonts w:ascii="Times New Roman" w:hAnsi="Times New Roman"/>
-        </w:rPr>
-        <w:t xml:space="preserve"> </w:t>
-      </w:r>
-      <w:r>
-        <w:rPr>
-          <w:rFonts w:ascii="Times New Roman" w:hAnsi="Times New Roman"/>
-        </w:rPr>
-        <w:t>код</w:t>
-      </w:r>
-      <w:r>
-        <w:rPr>
-          <w:rFonts w:ascii="Times New Roman" w:hAnsi="Times New Roman"/>
-        </w:rPr>
-        <w:t xml:space="preserve"> </w:t>
-      </w:r>
-      <w:r>
-        <w:rPr>
-          <w:rFonts w:ascii="Times New Roman" w:hAnsi="Times New Roman"/>
-        </w:rPr>
-        <w:t>подразделения</w:t>
-      </w:r>
-      <w:r>
-        <w:rPr>
-          <w:rFonts w:ascii="Times New Roman" w:hAnsi="Times New Roman"/>
-        </w:rPr>
-        <w:t xml:space="preserve"> </w:t>
-      </w:r>
-      <w:r>
-        <w:rPr>
-          <w:rFonts w:ascii="Times-Roman" w:hAnsi="Times-Roman" w:cs="Times-Roman"/>
-          <w:color w:val="auto"/>
-          <w:szCs w:val="24"/>
-        </w:rPr>
-        <w:t>{{</w:t>
-      </w:r>
-      <w:r>
-        <w:rPr>
-          <w:rFonts w:ascii="Times-Roman" w:hAnsi="Times-Roman" w:cs="Times-Roman"/>
-          <w:color w:val="auto"/>
-          <w:szCs w:val="24"/>
-          <w:lang w:val="en-US"/>
-        </w:rPr>
-        <w:t>customer</w:t>
-      </w:r>
-      <w:r>
-        <w:rPr>
-          <w:rFonts w:ascii="Times-Roman" w:hAnsi="Times-Roman" w:cs="Times-Roman"/>
-          <w:color w:val="auto"/>
-          <w:szCs w:val="24"/>
-        </w:rPr>
-        <w:t>.</w:t>
-      </w:r>
-      <w:r>
-        <w:rPr>
-          <w:rFonts w:ascii="Times-Roman" w:hAnsi="Times-Roman" w:cs="Times-Roman"/>
-          <w:color w:val="auto"/>
-          <w:szCs w:val="24"/>
-          <w:lang w:val="en-US"/>
-        </w:rPr>
-        <w:t>department</w:t>
-      </w:r>
-      <w:r>
-        <w:rPr>
-          <w:rFonts w:ascii="Times-Roman" w:hAnsi="Times-Roman" w:cs="Times-Roman"/>
-          <w:color w:val="auto"/>
-          <w:szCs w:val="24"/>
-        </w:rPr>
-        <w:t>_</w:t>
-      </w:r>
-      <w:r>
-        <w:rPr>
-          <w:rFonts w:ascii="Times-Roman" w:hAnsi="Times-Roman" w:cs="Times-Roman"/>
-          <w:color w:val="auto"/>
-          <w:szCs w:val="24"/>
-          <w:lang w:val="en-US"/>
-        </w:rPr>
-        <w:t>code</w:t>
-      </w:r>
-      <w:r>
-        <w:rPr>
-          <w:rFonts w:ascii="Times-Roman" w:hAnsi="Times-Roman" w:cs="Times-Roman"/>
-          <w:color w:val="auto"/>
-          <w:szCs w:val="24"/>
-        </w:rPr>
-        <w:t>}}</w:t>
-      </w:r>
-      <w:r>
-        <w:rPr>
-          <w:rFonts w:ascii="Times New Roman" w:hAnsi="Times New Roman"/>
-        </w:rPr>
-        <w:t xml:space="preserve">:  </w:t>
-      </w:r>
-      <w:r>
-        <w:rPr>
-          <w:rFonts w:ascii="Times New Roman" w:hAnsi="Times New Roman"/>
-        </w:rPr>
-        <w:t>Адрес</w:t>
-      </w:r>
-      <w:r>
-        <w:rPr>
-          <w:rFonts w:ascii="Times New Roman" w:hAnsi="Times New Roman"/>
-        </w:rPr>
-        <w:t xml:space="preserve"> </w:t>
-      </w:r>
-      <w:r>
-        <w:rPr>
-          <w:rFonts w:ascii="Times New Roman" w:hAnsi="Times New Roman"/>
-          <w:color w:val="000000" w:themeColor="text1"/>
-        </w:rPr>
-        <w:t>регистрации</w:t>
-      </w:r>
-      <w:r>
-        <w:rPr>
-          <w:rFonts w:ascii="Times New Roman" w:hAnsi="Times New Roman"/>
-          <w:color w:val="000000" w:themeColor="text1"/>
-        </w:rPr>
-        <w:t xml:space="preserve">: </w:t>
-      </w:r>
-      <w:r>
-        <w:rPr>
-          <w:rFonts w:ascii="Times-Roman" w:hAnsi="Times-Roman" w:cs="Times-Roman"/>
-          <w:color w:val="auto"/>
-          <w:szCs w:val="24"/>
-        </w:rPr>
-        <w:t>{{</w:t>
-      </w:r>
-      <w:r>
-        <w:rPr>
-          <w:rFonts w:ascii="Times-Roman" w:hAnsi="Times-Roman" w:cs="Times-Roman"/>
-          <w:color w:val="auto"/>
-          <w:szCs w:val="24"/>
-          <w:lang w:val="en-US"/>
-        </w:rPr>
-        <w:t>customer</w:t>
-      </w:r>
-      <w:r>
-        <w:rPr>
-          <w:rFonts w:ascii="Times-Roman" w:hAnsi="Times-Roman" w:cs="Times-Roman"/>
-          <w:color w:val="auto"/>
-          <w:szCs w:val="24"/>
-        </w:rPr>
-        <w:t>.</w:t>
-      </w:r>
-      <w:r>
-        <w:rPr>
-          <w:rFonts w:ascii="Times-Roman" w:hAnsi="Times-Roman" w:cs="Times-Roman"/>
-          <w:color w:val="auto"/>
-          <w:szCs w:val="24"/>
-          <w:lang w:val="en-US"/>
-        </w:rPr>
-        <w:t>registration</w:t>
-      </w:r>
-      <w:r>
-        <w:rPr>
-          <w:rFonts w:ascii="Times-Roman" w:hAnsi="Times-Roman" w:cs="Times-Roman"/>
-          <w:color w:val="auto"/>
-          <w:szCs w:val="24"/>
-        </w:rPr>
-        <w:t>_</w:t>
-      </w:r>
-      <w:r>
-        <w:rPr>
-          <w:rFonts w:ascii="Times-Roman" w:hAnsi="Times-Roman" w:cs="Times-Roman"/>
-          <w:color w:val="auto"/>
-          <w:szCs w:val="24"/>
-          <w:lang w:val="en-US"/>
-        </w:rPr>
-        <w:t>address</w:t>
-      </w:r>
-      <w:r>
-        <w:rPr>
-          <w:rFonts w:ascii="Times-Roman" w:hAnsi="Times-Roman" w:cs="Times-Roman"/>
-          <w:color w:val="auto"/>
-          <w:szCs w:val="24"/>
-        </w:rPr>
-        <w:t>}}</w:t>
-      </w:r>
     </w:p>
     <w:p>
       <w:pPr>
@@ -5954,7 +6199,7 @@
           <w:rFonts w:ascii="Times New Roman" w:hAnsi="Times New Roman"/>
           <w:sz w:val="22"/>
         </w:rPr>
-        <w:t>Я выражаю свое согласие на осуществление Исполнителем  автоматизированной, а также без использования средств автоматизации обработки персональных данных, включая сбор, запись, систематизацию, накопление, хранение, уточнение (обновление, изменение), извлечение, использование, блокирование, удаление, уничтожение персональных данных.</w:t>
+        <w:t>Я выражаю свое согласие на осуществление Исполнителем автоматизированной, а также без использования средств автоматизации обработки персональных данных, включая сбор, запись, систематизацию, накопление, хранение, уточнение (обновление, изменение), извлечение, использование, блокирование, удаление, уничтожение персональных данных.</w:t>
       </w:r>
     </w:p>
     <w:p>
@@ -6319,7 +6564,7 @@
           <w:rFonts w:ascii="Times New Roman" w:hAnsi="Times New Roman"/>
           <w:sz w:val="22"/>
         </w:rPr>
-        <w:t> публикация на официальных каналах  в сетях</w:t>
+        <w:t> публикация на официальных каналах в сетях</w:t>
       </w:r>
     </w:p>
     <w:p>
@@ -6738,7 +6983,7 @@
     <w:p>
       <w:pPr>
         <w:spacing w:beforeAutospacing="1" w:afterAutospacing="1" w:line="240" w:lineRule="auto"/>
-        <w:ind w:left="780" w:right="180" w:hanging="780"/>
+        <w:ind w:right="180"/>
         <w:contextualSpacing/>
         <w:rPr>
           <w:rFonts w:ascii="Times New Roman" w:hAnsi="Times New Roman"/>

</xml_diff>

<commit_message>
Add estimate variables to contract Word template
Co-authored-by: Cursor <cursoragent@cursor.com>
</commit_message>
<xml_diff>
--- a/templates/customer_contract_template.docx
+++ b/templates/customer_contract_template.docx
@@ -834,19 +834,89 @@
         </w:rPr>
         <w:t>1.2. Заказчик обязуется оплатить услуги в размере </w:t>
       </w:r>
-      <w:r>
-        <w:rPr>
-          <w:rFonts w:ascii="Times New Roman" w:hAnsi="Times New Roman"/>
-          <w:b/>
-        </w:rPr>
-        <w:t>200</w:t>
-      </w:r>
-      <w:r>
-        <w:rPr>
-          <w:rFonts w:ascii="Times New Roman" w:hAnsi="Times New Roman"/>
-          <w:b/>
-        </w:rPr>
-        <w:t xml:space="preserve"> 000 рублей</w:t>
+      <w:proofErr w:type="gramStart"/>
+      <w:r>
+        <w:rPr>
+          <w:rFonts w:ascii="Times New Roman" w:hAnsi="Times New Roman"/>
+          <w:b/>
+          <w:bCs/>
+          <w:szCs w:val="24"/>
+        </w:rPr>
+        <w:t xml:space="preserve">{{ </w:t>
+      </w:r>
+      <w:r>
+        <w:rPr>
+          <w:rFonts w:ascii="Times New Roman" w:hAnsi="Times New Roman"/>
+          <w:b/>
+          <w:bCs/>
+          <w:szCs w:val="24"/>
+          <w:lang w:val="en-US"/>
+        </w:rPr>
+        <w:t>estimates</w:t>
+      </w:r>
+      <w:proofErr w:type="gramEnd"/>
+      <w:r>
+        <w:rPr>
+          <w:rFonts w:ascii="Times New Roman" w:hAnsi="Times New Roman"/>
+          <w:b/>
+          <w:bCs/>
+          <w:szCs w:val="24"/>
+        </w:rPr>
+        <w:t>.</w:t>
+      </w:r>
+      <w:r>
+        <w:rPr>
+          <w:rFonts w:ascii="Times New Roman" w:hAnsi="Times New Roman"/>
+          <w:b/>
+          <w:bCs/>
+          <w:szCs w:val="24"/>
+          <w:lang w:val="en-US"/>
+        </w:rPr>
+        <w:t>contractor</w:t>
+      </w:r>
+      <w:r>
+        <w:rPr>
+          <w:rFonts w:ascii="Times New Roman" w:hAnsi="Times New Roman"/>
+          <w:b/>
+          <w:bCs/>
+          <w:szCs w:val="24"/>
+        </w:rPr>
+        <w:t>_</w:t>
+      </w:r>
+      <w:proofErr w:type="spellStart"/>
+      <w:r>
+        <w:rPr>
+          <w:rFonts w:ascii="Times New Roman" w:hAnsi="Times New Roman"/>
+          <w:b/>
+          <w:bCs/>
+          <w:szCs w:val="24"/>
+          <w:lang w:val="en-US"/>
+        </w:rPr>
+        <w:t>comission</w:t>
+      </w:r>
+      <w:proofErr w:type="spellEnd"/>
+      <w:r>
+        <w:rPr>
+          <w:rFonts w:ascii="Times New Roman" w:hAnsi="Times New Roman"/>
+          <w:b/>
+          <w:bCs/>
+          <w:szCs w:val="24"/>
+        </w:rPr>
+        <w:t xml:space="preserve"> }}</w:t>
+      </w:r>
+      <w:r>
+        <w:rPr>
+          <w:rFonts w:ascii="Helvetica" w:hAnsi="Helvetica" w:cs="Helvetica"/>
+          <w:szCs w:val="24"/>
+        </w:rPr>
+        <w:t xml:space="preserve"> </w:t>
+      </w:r>
+      <w:r>
+        <w:rPr>
+          <w:rFonts w:ascii="Times New Roman" w:hAnsi="Times New Roman"/>
+          <w:b/>
+        </w:rPr>
+        <w:t>рублей</w:t>
       </w:r>
       <w:r>
         <w:rPr>
@@ -1636,32 +1706,120 @@
           <w:rFonts w:ascii="Times New Roman" w:hAnsi="Times New Roman"/>
         </w:rPr>
       </w:pPr>
-      <w:r>
-        <w:rPr>
-          <w:rFonts w:ascii="Times New Roman" w:hAnsi="Times New Roman"/>
-          <w:b/>
-        </w:rPr>
-        <w:t>75 000 рублей (</w:t>
-      </w:r>
-      <w:r>
-        <w:rPr>
-          <w:rFonts w:ascii="Times New Roman" w:hAnsi="Times New Roman"/>
-          <w:b/>
-        </w:rPr>
-        <w:t>5</w:t>
-      </w:r>
-      <w:r>
-        <w:rPr>
-          <w:rFonts w:ascii="Times New Roman" w:hAnsi="Times New Roman"/>
-          <w:b/>
-        </w:rPr>
-        <w:t>0%)</w:t>
-      </w:r>
-      <w:r>
-        <w:rPr>
-          <w:rFonts w:ascii="Times New Roman" w:hAnsi="Times New Roman"/>
-        </w:rPr>
-        <w:t> — предоплата в день подписания договора;</w:t>
+      <w:proofErr w:type="gramStart"/>
+      <w:r>
+        <w:rPr>
+          <w:rFonts w:ascii="Times New Roman" w:hAnsi="Times New Roman"/>
+          <w:b/>
+          <w:bCs/>
+          <w:szCs w:val="24"/>
+        </w:rPr>
+        <w:t xml:space="preserve">{{ </w:t>
+      </w:r>
+      <w:r>
+        <w:rPr>
+          <w:rFonts w:ascii="Times New Roman" w:hAnsi="Times New Roman"/>
+          <w:b/>
+          <w:bCs/>
+          <w:szCs w:val="24"/>
+          <w:lang w:val="en-US"/>
+        </w:rPr>
+        <w:t>estimates</w:t>
+      </w:r>
+      <w:proofErr w:type="gramEnd"/>
+      <w:r>
+        <w:rPr>
+          <w:rFonts w:ascii="Times New Roman" w:hAnsi="Times New Roman"/>
+          <w:b/>
+          <w:bCs/>
+          <w:szCs w:val="24"/>
+        </w:rPr>
+        <w:t>.</w:t>
+      </w:r>
+      <w:r>
+        <w:rPr>
+          <w:rFonts w:ascii="Times New Roman" w:hAnsi="Times New Roman"/>
+          <w:b/>
+          <w:bCs/>
+          <w:szCs w:val="24"/>
+          <w:lang w:val="en-US"/>
+        </w:rPr>
+        <w:t>contractor</w:t>
+      </w:r>
+      <w:r>
+        <w:rPr>
+          <w:rFonts w:ascii="Times New Roman" w:hAnsi="Times New Roman"/>
+          <w:b/>
+          <w:bCs/>
+          <w:szCs w:val="24"/>
+        </w:rPr>
+        <w:t>_</w:t>
+      </w:r>
+      <w:proofErr w:type="spellStart"/>
+      <w:r>
+        <w:rPr>
+          <w:rFonts w:ascii="Times New Roman" w:hAnsi="Times New Roman"/>
+          <w:b/>
+          <w:bCs/>
+          <w:szCs w:val="24"/>
+          <w:lang w:val="en-US"/>
+        </w:rPr>
+        <w:t>comission</w:t>
+      </w:r>
+      <w:proofErr w:type="spellEnd"/>
+      <w:r>
+        <w:rPr>
+          <w:rFonts w:ascii="Times New Roman" w:hAnsi="Times New Roman"/>
+          <w:b/>
+          <w:bCs/>
+          <w:szCs w:val="24"/>
+        </w:rPr>
+        <w:t>_</w:t>
+      </w:r>
+      <w:r>
+        <w:rPr>
+          <w:rFonts w:ascii="Times New Roman" w:hAnsi="Times New Roman"/>
+          <w:b/>
+          <w:bCs/>
+          <w:szCs w:val="24"/>
+          <w:lang w:val="en-US"/>
+        </w:rPr>
+        <w:t>prepayment</w:t>
+      </w:r>
+      <w:r>
+        <w:rPr>
+          <w:rFonts w:ascii="Times New Roman" w:hAnsi="Times New Roman"/>
+          <w:b/>
+          <w:bCs/>
+          <w:szCs w:val="24"/>
+        </w:rPr>
+        <w:t xml:space="preserve"> }}</w:t>
+      </w:r>
+      <w:r>
+        <w:rPr>
+          <w:rFonts w:ascii="Times New Roman" w:hAnsi="Times New Roman"/>
+          <w:b/>
+        </w:rPr>
+        <w:t xml:space="preserve"> </w:t>
+      </w:r>
+      <w:r>
+        <w:rPr>
+          <w:rFonts w:ascii="Times New Roman" w:hAnsi="Times New Roman"/>
+          <w:b/>
+        </w:rPr>
+        <w:t>рублей</w:t>
+      </w:r>
+      <w:r>
+        <w:rPr>
+          <w:rFonts w:ascii="Times New Roman" w:hAnsi="Times New Roman"/>
+        </w:rPr>
+        <w:t> </w:t>
+      </w:r>
+      <w:r>
+        <w:rPr>
+          <w:rFonts w:ascii="Times New Roman" w:hAnsi="Times New Roman"/>
+        </w:rPr>
+        <w:t>— предоплата в день подписания договора;</w:t>
       </w:r>
     </w:p>
     <w:p>
@@ -1674,33 +1832,103 @@
           <w:rFonts w:ascii="Times New Roman" w:hAnsi="Times New Roman"/>
         </w:rPr>
       </w:pPr>
-      <w:r>
-        <w:rPr>
-          <w:rFonts w:ascii="Times New Roman" w:hAnsi="Times New Roman"/>
-          <w:b/>
-        </w:rPr>
-        <w:t>12</w:t>
-      </w:r>
-      <w:r>
-        <w:rPr>
-          <w:rFonts w:ascii="Times New Roman" w:hAnsi="Times New Roman"/>
-          <w:b/>
-        </w:rPr>
-        <w:t>5 000 рублей (</w:t>
-      </w:r>
-      <w:r>
-        <w:rPr>
-          <w:rFonts w:ascii="Times New Roman" w:hAnsi="Times New Roman"/>
-          <w:b/>
-        </w:rPr>
-        <w:t>5</w:t>
-      </w:r>
-      <w:r>
-        <w:rPr>
-          <w:rFonts w:ascii="Times New Roman" w:hAnsi="Times New Roman"/>
-          <w:b/>
-        </w:rPr>
-        <w:t>0%)</w:t>
+      <w:proofErr w:type="gramStart"/>
+      <w:r>
+        <w:rPr>
+          <w:rFonts w:ascii="Times New Roman" w:hAnsi="Times New Roman"/>
+          <w:b/>
+          <w:bCs/>
+          <w:szCs w:val="24"/>
+        </w:rPr>
+        <w:t xml:space="preserve">{{ </w:t>
+      </w:r>
+      <w:r>
+        <w:rPr>
+          <w:rFonts w:ascii="Times New Roman" w:hAnsi="Times New Roman"/>
+          <w:b/>
+          <w:bCs/>
+          <w:szCs w:val="24"/>
+          <w:lang w:val="en-US"/>
+        </w:rPr>
+        <w:t>estimates</w:t>
+      </w:r>
+      <w:proofErr w:type="gramEnd"/>
+      <w:r>
+        <w:rPr>
+          <w:rFonts w:ascii="Times New Roman" w:hAnsi="Times New Roman"/>
+          <w:b/>
+          <w:bCs/>
+          <w:szCs w:val="24"/>
+        </w:rPr>
+        <w:t>.</w:t>
+      </w:r>
+      <w:r>
+        <w:rPr>
+          <w:rFonts w:ascii="Times New Roman" w:hAnsi="Times New Roman"/>
+          <w:b/>
+          <w:bCs/>
+          <w:szCs w:val="24"/>
+          <w:lang w:val="en-US"/>
+        </w:rPr>
+        <w:t>contractor</w:t>
+      </w:r>
+      <w:r>
+        <w:rPr>
+          <w:rFonts w:ascii="Times New Roman" w:hAnsi="Times New Roman"/>
+          <w:b/>
+          <w:bCs/>
+          <w:szCs w:val="24"/>
+        </w:rPr>
+        <w:t>_</w:t>
+      </w:r>
+      <w:proofErr w:type="spellStart"/>
+      <w:r>
+        <w:rPr>
+          <w:rFonts w:ascii="Times New Roman" w:hAnsi="Times New Roman"/>
+          <w:b/>
+          <w:bCs/>
+          <w:szCs w:val="24"/>
+          <w:lang w:val="en-US"/>
+        </w:rPr>
+        <w:t>comission</w:t>
+      </w:r>
+      <w:proofErr w:type="spellEnd"/>
+      <w:r>
+        <w:rPr>
+          <w:rFonts w:ascii="Times New Roman" w:hAnsi="Times New Roman"/>
+          <w:b/>
+          <w:bCs/>
+          <w:szCs w:val="24"/>
+        </w:rPr>
+        <w:t>_</w:t>
+      </w:r>
+      <w:proofErr w:type="spellStart"/>
+      <w:r>
+        <w:rPr>
+          <w:rFonts w:ascii="Times New Roman" w:hAnsi="Times New Roman"/>
+          <w:b/>
+          <w:bCs/>
+          <w:szCs w:val="24"/>
+          <w:lang w:val="en-US"/>
+        </w:rPr>
+        <w:t>postpayment</w:t>
+      </w:r>
+      <w:proofErr w:type="spellEnd"/>
+      <w:r>
+        <w:rPr>
+          <w:rFonts w:ascii="Times New Roman" w:hAnsi="Times New Roman"/>
+          <w:b/>
+          <w:bCs/>
+          <w:szCs w:val="24"/>
+        </w:rPr>
+        <w:t xml:space="preserve"> }}</w:t>
+      </w:r>
+      <w:r>
+        <w:rPr>
+          <w:rFonts w:ascii="Times New Roman" w:hAnsi="Times New Roman"/>
+          <w:b/>
+        </w:rPr>
+        <w:t xml:space="preserve"> рублей</w:t>
       </w:r>
       <w:r>
         <w:rPr>
@@ -1955,12 +2183,107 @@
         <w:br/>
         <w:t>5.2. При расторжении договора после оплаты первого этапа (</w:t>
       </w:r>
-      <w:r>
-        <w:rPr>
-          <w:rFonts w:ascii="Times New Roman" w:hAnsi="Times New Roman"/>
-          <w:b/>
-        </w:rPr>
-        <w:t>75 000 руб.</w:t>
+      <w:proofErr w:type="gramStart"/>
+      <w:r>
+        <w:rPr>
+          <w:rFonts w:ascii="Times New Roman" w:hAnsi="Times New Roman"/>
+          <w:b/>
+          <w:bCs/>
+          <w:szCs w:val="24"/>
+        </w:rPr>
+        <w:t xml:space="preserve">{{ </w:t>
+      </w:r>
+      <w:proofErr w:type="spellStart"/>
+      <w:r>
+        <w:rPr>
+          <w:rFonts w:ascii="Times New Roman" w:hAnsi="Times New Roman"/>
+          <w:b/>
+          <w:bCs/>
+          <w:szCs w:val="24"/>
+          <w:lang w:val="en-US"/>
+        </w:rPr>
+        <w:t>estimates</w:t>
+      </w:r>
+      <w:proofErr w:type="spellEnd"/>
+      <w:proofErr w:type="gramEnd"/>
+      <w:r>
+        <w:rPr>
+          <w:rFonts w:ascii="Times New Roman" w:hAnsi="Times New Roman"/>
+          <w:b/>
+          <w:bCs/>
+          <w:szCs w:val="24"/>
+        </w:rPr>
+        <w:t>.</w:t>
+      </w:r>
+      <w:proofErr w:type="spellStart"/>
+      <w:r>
+        <w:rPr>
+          <w:rFonts w:ascii="Times New Roman" w:hAnsi="Times New Roman"/>
+          <w:b/>
+          <w:bCs/>
+          <w:szCs w:val="24"/>
+          <w:lang w:val="en-US"/>
+        </w:rPr>
+        <w:t>contractor</w:t>
+      </w:r>
+      <w:proofErr w:type="spellEnd"/>
+      <w:r>
+        <w:rPr>
+          <w:rFonts w:ascii="Times New Roman" w:hAnsi="Times New Roman"/>
+          <w:b/>
+          <w:bCs/>
+          <w:szCs w:val="24"/>
+        </w:rPr>
+        <w:t>_</w:t>
+      </w:r>
+      <w:proofErr w:type="spellStart"/>
+      <w:r>
+        <w:rPr>
+          <w:rFonts w:ascii="Times New Roman" w:hAnsi="Times New Roman"/>
+          <w:b/>
+          <w:bCs/>
+          <w:szCs w:val="24"/>
+          <w:lang w:val="en-US"/>
+        </w:rPr>
+        <w:t>comission</w:t>
+      </w:r>
+      <w:proofErr w:type="spellEnd"/>
+      <w:r>
+        <w:rPr>
+          <w:rFonts w:ascii="Times New Roman" w:hAnsi="Times New Roman"/>
+          <w:b/>
+          <w:bCs/>
+          <w:szCs w:val="24"/>
+        </w:rPr>
+        <w:t>_</w:t>
+      </w:r>
+      <w:proofErr w:type="spellStart"/>
+      <w:r>
+        <w:rPr>
+          <w:rFonts w:ascii="Times New Roman" w:hAnsi="Times New Roman"/>
+          <w:b/>
+          <w:bCs/>
+          <w:szCs w:val="24"/>
+          <w:lang w:val="en-US"/>
+        </w:rPr>
+        <w:t>prepayment</w:t>
+      </w:r>
+      <w:proofErr w:type="spellEnd"/>
+      <w:r>
+        <w:rPr>
+          <w:rFonts w:ascii="Times New Roman" w:hAnsi="Times New Roman"/>
+          <w:b/>
+          <w:bCs/>
+          <w:szCs w:val="24"/>
+        </w:rPr>
+        <w:t xml:space="preserve"> }}</w:t>
+      </w:r>
+      <w:r>
+        <w:rPr>
+          <w:rFonts w:ascii="Times New Roman" w:hAnsi="Times New Roman"/>
+          <w:b/>
+        </w:rPr>
+        <w:t xml:space="preserve"> руб.</w:t>
       </w:r>
       <w:r>
         <w:rPr>
@@ -2182,6 +2505,7 @@
         <w:rPr>
           <w:rFonts w:ascii="Times New Roman" w:hAnsi="Times New Roman"/>
         </w:rPr>
+        <w:lastRenderedPageBreak/>
         <w:t>7.1. Стороны освобождаются от ответственности при наступлении обстоятельств непреодолимой силы.</w:t>
       </w:r>
     </w:p>
@@ -2196,7 +2520,6 @@
           <w:rFonts w:ascii="Times New Roman" w:hAnsi="Times New Roman"/>
           <w:noProof/>
         </w:rPr>
-        <w:lastRenderedPageBreak/>
         <mc:AlternateContent>
           <mc:Choice Requires="wps">
             <w:drawing>
@@ -2743,18 +3066,35 @@
         <w:rPr>
           <w:rFonts w:ascii="Times New Roman" w:hAnsi="Times New Roman"/>
           <w:b/>
-        </w:rPr>
-      </w:pPr>
-      <w:r>
-        <w:rPr>
-          <w:rFonts w:ascii="Times New Roman" w:hAnsi="Times New Roman"/>
-          <w:b/>
-        </w:rPr>
-        <w:t>Приложение 1. СПЕЦИФИКАЦИЯ №1 от</w:t>
-      </w:r>
-      <w:r>
-        <w:rPr>
-          <w:rFonts w:ascii="Times New Roman" w:hAnsi="Times New Roman"/>
+          <w:lang w:val="en-US"/>
+        </w:rPr>
+      </w:pPr>
+      <w:r>
+        <w:rPr>
+          <w:rFonts w:ascii="Times New Roman" w:hAnsi="Times New Roman"/>
+          <w:b/>
+        </w:rPr>
+        <w:t>Приложение 1. СПЕЦИФИКАЦИЯ</w:t>
+      </w:r>
+      <w:r>
+        <w:rPr>
+          <w:rFonts w:ascii="Times New Roman" w:hAnsi="Times New Roman"/>
+          <w:b/>
+          <w:lang w:val="en-US"/>
+        </w:rPr>
+        <w:t xml:space="preserve"> №1 </w:t>
+      </w:r>
+      <w:r>
+        <w:rPr>
+          <w:rFonts w:ascii="Times New Roman" w:hAnsi="Times New Roman"/>
+          <w:b/>
+        </w:rPr>
+        <w:t>от</w:t>
+      </w:r>
+      <w:r>
+        <w:rPr>
+          <w:rFonts w:ascii="Times New Roman" w:hAnsi="Times New Roman"/>
+          <w:lang w:val="en-US"/>
         </w:rPr>
         <w:t xml:space="preserve"> </w:t>
       </w:r>
@@ -2762,9 +3102,11 @@
       <w:r>
         <w:rPr>
           <w:rFonts w:ascii="Times New Roman" w:hAnsi="Times New Roman"/>
+          <w:lang w:val="en-US"/>
         </w:rPr>
         <w:t xml:space="preserve">{{ </w:t>
       </w:r>
+      <w:proofErr w:type="spellStart"/>
       <w:r>
         <w:rPr>
           <w:rFonts w:ascii="Times New Roman" w:hAnsi="Times New Roman"/>
@@ -2776,6 +3118,7 @@
       <w:r>
         <w:rPr>
           <w:rFonts w:ascii="Times New Roman" w:hAnsi="Times New Roman"/>
+          <w:lang w:val="en-US"/>
         </w:rPr>
         <w:t>.</w:t>
       </w:r>
@@ -2789,10 +3132,10 @@
       <w:r>
         <w:rPr>
           <w:rFonts w:ascii="Times New Roman" w:hAnsi="Times New Roman"/>
+          <w:lang w:val="en-US"/>
         </w:rPr>
         <w:t>_</w:t>
       </w:r>
-      <w:proofErr w:type="spellStart"/>
       <w:r>
         <w:rPr>
           <w:rFonts w:ascii="Times New Roman" w:hAnsi="Times New Roman"/>
@@ -2819,6 +3162,7 @@
         <w:rPr>
           <w:rFonts w:ascii="Times New Roman" w:hAnsi="Times New Roman"/>
           <w:b/>
+          <w:lang w:val="en-US"/>
         </w:rPr>
         <w:t>.</w:t>
       </w:r>
@@ -3592,7 +3936,6 @@
         <w:rPr>
           <w:rFonts w:ascii="Times New Roman" w:hAnsi="Times New Roman"/>
           <w:b/>
-          <w:lang w:val="en-US"/>
         </w:rPr>
       </w:pPr>
       <w:r>
@@ -3606,7 +3949,6 @@
         <w:rPr>
           <w:rFonts w:ascii="Times New Roman" w:hAnsi="Times New Roman"/>
           <w:b/>
-          <w:lang w:val="en-US"/>
         </w:rPr>
         <w:t>:</w:t>
       </w:r>
@@ -3615,12 +3957,17 @@
           <w:rFonts w:ascii="Times New Roman" w:hAnsi="Times New Roman"/>
           <w:lang w:val="en-US"/>
         </w:rPr>
-        <w:t> ________/</w:t>
-      </w:r>
-      <w:r>
-        <w:rPr>
-          <w:rFonts w:ascii="Times New Roman" w:hAnsi="Times New Roman"/>
-          <w:lang w:val="en-US"/>
+        <w:t> </w:t>
+      </w:r>
+      <w:r>
+        <w:rPr>
+          <w:rFonts w:ascii="Times New Roman" w:hAnsi="Times New Roman"/>
+        </w:rPr>
+        <w:t>________/</w:t>
+      </w:r>
+      <w:r>
+        <w:rPr>
+          <w:rFonts w:ascii="Times New Roman" w:hAnsi="Times New Roman"/>
         </w:rPr>
         <w:t xml:space="preserve"> </w:t>
       </w:r>
@@ -3650,7 +3997,6 @@
         </w:rPr>
         <w:t>.</w:t>
       </w:r>
-      <w:proofErr w:type="spellStart"/>
       <w:r>
         <w:rPr>
           <w:rFonts w:ascii="Times-Roman" w:hAnsi="Times-Roman" w:cs="Times-Roman"/>
@@ -3666,16 +4012,23 @@
           <w:rFonts w:ascii="Times-Roman" w:hAnsi="Times-Roman" w:cs="Times-Roman"/>
           <w:color w:val="auto"/>
           <w:szCs w:val="24"/>
-          <w:lang w:val="en-US"/>
-        </w:rPr>
-        <w:t>_name</w:t>
-      </w:r>
-      <w:proofErr w:type="spellEnd"/>
+        </w:rPr>
+        <w:t>_</w:t>
+      </w:r>
       <w:r>
         <w:rPr>
           <w:rFonts w:ascii="Times-Roman" w:hAnsi="Times-Roman" w:cs="Times-Roman"/>
           <w:color w:val="auto"/>
           <w:szCs w:val="24"/>
+          <w:lang w:val="en-US"/>
+        </w:rPr>
+        <w:t>name</w:t>
+      </w:r>
+      <w:r>
+        <w:rPr>
+          <w:rFonts w:ascii="Times-Roman" w:hAnsi="Times-Roman" w:cs="Times-Roman"/>
+          <w:color w:val="auto"/>
+          <w:szCs w:val="24"/>
         </w:rPr>
         <w:t xml:space="preserve"> }}</w:t>
       </w:r>
@@ -3684,14 +4037,12 @@
           <w:rFonts w:ascii="Times-Roman" w:hAnsi="Times-Roman" w:cs="Times-Roman"/>
           <w:color w:val="auto"/>
           <w:szCs w:val="24"/>
-          <w:lang w:val="en-US"/>
         </w:rPr>
         <w:t xml:space="preserve"> </w:t>
       </w:r>
       <w:r>
         <w:rPr>
           <w:rFonts w:ascii="Times New Roman" w:hAnsi="Times New Roman"/>
-          <w:lang w:val="en-US"/>
         </w:rPr>
         <w:t>/</w:t>
       </w:r>
@@ -3701,7 +4052,6 @@
         <w:ind w:left="1440"/>
         <w:rPr>
           <w:rFonts w:ascii="Times New Roman" w:hAnsi="Times New Roman"/>
-          <w:lang w:val="en-US"/>
         </w:rPr>
       </w:pPr>
     </w:p>
@@ -3710,7 +4060,6 @@
         <w:ind w:left="1440"/>
         <w:rPr>
           <w:rFonts w:ascii="Times New Roman" w:hAnsi="Times New Roman"/>
-          <w:lang w:val="en-US"/>
         </w:rPr>
       </w:pPr>
     </w:p>
@@ -3719,7 +4068,6 @@
         <w:ind w:left="1440"/>
         <w:rPr>
           <w:rFonts w:ascii="Times New Roman" w:hAnsi="Times New Roman"/>
-          <w:lang w:val="en-US"/>
         </w:rPr>
       </w:pPr>
     </w:p>
@@ -3728,7 +4076,6 @@
         <w:ind w:left="1440"/>
         <w:rPr>
           <w:rFonts w:ascii="Times New Roman" w:hAnsi="Times New Roman"/>
-          <w:lang w:val="en-US"/>
         </w:rPr>
       </w:pPr>
     </w:p>
@@ -3737,7 +4084,6 @@
         <w:ind w:left="1440"/>
         <w:rPr>
           <w:rFonts w:ascii="Times New Roman" w:hAnsi="Times New Roman"/>
-          <w:lang w:val="en-US"/>
         </w:rPr>
       </w:pPr>
     </w:p>
@@ -3746,7 +4092,6 @@
         <w:ind w:left="1440"/>
         <w:rPr>
           <w:rFonts w:ascii="Times New Roman" w:hAnsi="Times New Roman"/>
-          <w:lang w:val="en-US"/>
         </w:rPr>
       </w:pPr>
     </w:p>
@@ -3755,7 +4100,6 @@
         <w:ind w:left="1440"/>
         <w:rPr>
           <w:rFonts w:ascii="Times New Roman" w:hAnsi="Times New Roman"/>
-          <w:lang w:val="en-US"/>
         </w:rPr>
       </w:pPr>
     </w:p>
@@ -3764,7 +4108,6 @@
         <w:ind w:left="1440"/>
         <w:rPr>
           <w:rFonts w:ascii="Times New Roman" w:hAnsi="Times New Roman"/>
-          <w:lang w:val="en-US"/>
         </w:rPr>
       </w:pPr>
     </w:p>
@@ -3773,7 +4116,6 @@
         <w:ind w:left="1440"/>
         <w:rPr>
           <w:rFonts w:ascii="Times New Roman" w:hAnsi="Times New Roman"/>
-          <w:lang w:val="en-US"/>
         </w:rPr>
       </w:pPr>
     </w:p>
@@ -3782,7 +4124,6 @@
         <w:ind w:left="1440"/>
         <w:rPr>
           <w:rFonts w:ascii="Times New Roman" w:hAnsi="Times New Roman"/>
-          <w:lang w:val="en-US"/>
         </w:rPr>
       </w:pPr>
     </w:p>
@@ -3791,16 +4132,14 @@
         <w:ind w:left="1440"/>
         <w:rPr>
           <w:rFonts w:ascii="Times New Roman" w:hAnsi="Times New Roman"/>
-          <w:lang w:val="en-US"/>
-        </w:rPr>
-      </w:pPr>
-    </w:p>
-    <w:p>
-      <w:pPr>
-        <w:rPr>
-          <w:rFonts w:ascii="Times New Roman" w:hAnsi="Times New Roman"/>
-          <w:b/>
-          <w:lang w:val="en-US"/>
+        </w:rPr>
+      </w:pPr>
+    </w:p>
+    <w:p>
+      <w:pPr>
+        <w:rPr>
+          <w:rFonts w:ascii="Times New Roman" w:hAnsi="Times New Roman"/>
+          <w:b/>
         </w:rPr>
       </w:pPr>
     </w:p>
@@ -4117,8 +4456,50 @@
             <w:pPr>
               <w:rPr>
                 <w:rFonts w:ascii="Times New Roman" w:hAnsi="Times New Roman"/>
+                <w:sz w:val="22"/>
+                <w:szCs w:val="22"/>
               </w:rPr>
             </w:pPr>
+            <w:proofErr w:type="gramStart"/>
+            <w:r>
+              <w:rPr>
+                <w:rFonts w:ascii="Helvetica" w:hAnsi="Helvetica" w:cs="Helvetica"/>
+                <w:sz w:val="22"/>
+                <w:szCs w:val="22"/>
+                <w:lang w:val="en-US"/>
+              </w:rPr>
+              <w:t xml:space="preserve">{{ </w:t>
+            </w:r>
+            <w:proofErr w:type="spellStart"/>
+            <w:r>
+              <w:rPr>
+                <w:rFonts w:ascii="Helvetica" w:hAnsi="Helvetica" w:cs="Helvetica"/>
+                <w:sz w:val="22"/>
+                <w:szCs w:val="22"/>
+                <w:lang w:val="en-US"/>
+              </w:rPr>
+              <w:t>estimates</w:t>
+            </w:r>
+            <w:proofErr w:type="gramEnd"/>
+            <w:r>
+              <w:rPr>
+                <w:rFonts w:ascii="Helvetica" w:hAnsi="Helvetica" w:cs="Helvetica"/>
+                <w:sz w:val="22"/>
+                <w:szCs w:val="22"/>
+                <w:lang w:val="en-US"/>
+              </w:rPr>
+              <w:t>.price_abroad</w:t>
+            </w:r>
+            <w:proofErr w:type="spellEnd"/>
+            <w:r>
+              <w:rPr>
+                <w:rFonts w:ascii="Helvetica" w:hAnsi="Helvetica" w:cs="Helvetica"/>
+                <w:sz w:val="22"/>
+                <w:szCs w:val="22"/>
+                <w:lang w:val="en-US"/>
+              </w:rPr>
+              <w:t xml:space="preserve"> }}</w:t>
+            </w:r>
           </w:p>
         </w:tc>
         <w:tc>
@@ -4142,8 +4523,143 @@
             <w:pPr>
               <w:rPr>
                 <w:rFonts w:ascii="Times New Roman" w:hAnsi="Times New Roman"/>
+                <w:sz w:val="22"/>
+                <w:szCs w:val="22"/>
+                <w:lang w:val="en-US"/>
               </w:rPr>
             </w:pPr>
+            <w:r>
+              <w:rPr>
+                <w:rFonts w:ascii="Helvetica" w:hAnsi="Helvetica" w:cs="Helvetica"/>
+                <w:sz w:val="22"/>
+                <w:szCs w:val="22"/>
+                <w:lang w:val="en-US"/>
+              </w:rPr>
+              <w:t xml:space="preserve">1 </w:t>
+            </w:r>
+            <w:proofErr w:type="gramStart"/>
+            <w:r>
+              <w:rPr>
+                <w:rFonts w:ascii="Helvetica" w:hAnsi="Helvetica" w:cs="Helvetica"/>
+                <w:sz w:val="22"/>
+                <w:szCs w:val="22"/>
+                <w:lang w:val="en-US"/>
+              </w:rPr>
+              <w:t xml:space="preserve">{{ </w:t>
+            </w:r>
+            <w:proofErr w:type="spellStart"/>
+            <w:r>
+              <w:rPr>
+                <w:rFonts w:ascii="Helvetica" w:hAnsi="Helvetica" w:cs="Helvetica"/>
+                <w:sz w:val="22"/>
+                <w:szCs w:val="22"/>
+                <w:lang w:val="en-US"/>
+              </w:rPr>
+              <w:t>estimates</w:t>
+            </w:r>
+            <w:proofErr w:type="gramEnd"/>
+            <w:r>
+              <w:rPr>
+                <w:rFonts w:ascii="Helvetica" w:hAnsi="Helvetica" w:cs="Helvetica"/>
+                <w:sz w:val="22"/>
+                <w:szCs w:val="22"/>
+                <w:lang w:val="en-US"/>
+              </w:rPr>
+              <w:t>.price_</w:t>
+            </w:r>
+            <w:r>
+              <w:rPr>
+                <w:rFonts w:ascii="Helvetica" w:hAnsi="Helvetica" w:cs="Helvetica"/>
+                <w:sz w:val="22"/>
+                <w:szCs w:val="22"/>
+                <w:lang w:val="en-US"/>
+              </w:rPr>
+              <w:t>currency</w:t>
+            </w:r>
+            <w:proofErr w:type="spellEnd"/>
+            <w:r>
+              <w:rPr>
+                <w:rFonts w:ascii="Helvetica" w:hAnsi="Helvetica" w:cs="Helvetica"/>
+                <w:sz w:val="22"/>
+                <w:szCs w:val="22"/>
+                <w:lang w:val="en-US"/>
+              </w:rPr>
+              <w:t xml:space="preserve"> }}</w:t>
+            </w:r>
+            <w:r>
+              <w:rPr>
+                <w:rFonts w:ascii="Helvetica" w:hAnsi="Helvetica" w:cs="Helvetica"/>
+                <w:sz w:val="22"/>
+                <w:szCs w:val="22"/>
+                <w:lang w:val="en-US"/>
+              </w:rPr>
+              <w:t xml:space="preserve"> </w:t>
+            </w:r>
+            <w:r>
+              <w:rPr>
+                <w:rFonts w:ascii="Helvetica" w:hAnsi="Helvetica" w:cs="Helvetica"/>
+                <w:sz w:val="22"/>
+                <w:szCs w:val="22"/>
+                <w:lang w:val="en-US"/>
+              </w:rPr>
+              <w:t xml:space="preserve">/ </w:t>
+            </w:r>
+            <w:r>
+              <w:rPr>
+                <w:rFonts w:ascii="Helvetica" w:hAnsi="Helvetica" w:cs="Helvetica"/>
+                <w:sz w:val="22"/>
+                <w:szCs w:val="22"/>
+                <w:lang w:val="en-US"/>
+              </w:rPr>
+              <w:t xml:space="preserve">{{ </w:t>
+            </w:r>
+            <w:proofErr w:type="spellStart"/>
+            <w:r>
+              <w:rPr>
+                <w:rFonts w:ascii="Helvetica" w:hAnsi="Helvetica" w:cs="Helvetica"/>
+                <w:sz w:val="22"/>
+                <w:szCs w:val="22"/>
+                <w:lang w:val="en-US"/>
+              </w:rPr>
+              <w:t>estimates.</w:t>
+            </w:r>
+            <w:r>
+              <w:rPr>
+                <w:rFonts w:ascii="Helvetica" w:hAnsi="Helvetica" w:cs="Helvetica"/>
+                <w:sz w:val="22"/>
+                <w:szCs w:val="22"/>
+                <w:lang w:val="en-US"/>
+              </w:rPr>
+              <w:t>exchange_rate</w:t>
+            </w:r>
+            <w:proofErr w:type="spellEnd"/>
+            <w:r>
+              <w:rPr>
+                <w:rFonts w:ascii="Helvetica" w:hAnsi="Helvetica" w:cs="Helvetica"/>
+                <w:sz w:val="22"/>
+                <w:szCs w:val="22"/>
+                <w:lang w:val="en-US"/>
+              </w:rPr>
+              <w:t xml:space="preserve"> }}</w:t>
+            </w:r>
+            <w:r>
+              <w:rPr>
+                <w:rFonts w:ascii="Helvetica" w:hAnsi="Helvetica" w:cs="Helvetica"/>
+                <w:sz w:val="21"/>
+                <w:szCs w:val="21"/>
+                <w:lang w:val="en-US"/>
+              </w:rPr>
+              <w:t xml:space="preserve"> </w:t>
+            </w:r>
+            <w:r>
+              <w:rPr>
+                <w:rFonts w:ascii="Helvetica" w:hAnsi="Helvetica" w:cs="Helvetica"/>
+                <w:sz w:val="21"/>
+                <w:szCs w:val="21"/>
+                <w:lang w:val="en-US"/>
+              </w:rPr>
+              <w:t>RUB</w:t>
+            </w:r>
           </w:p>
         </w:tc>
         <w:tc>
@@ -4169,8 +4685,59 @@
               <w:rPr>
                 <w:rFonts w:ascii="Roboto Black" w:hAnsi="Roboto Black" w:cs="Calibri"/>
                 <w:b/>
+                <w:sz w:val="22"/>
+                <w:szCs w:val="22"/>
               </w:rPr>
             </w:pPr>
+            <w:proofErr w:type="gramStart"/>
+            <w:r>
+              <w:rPr>
+                <w:rFonts w:ascii="Helvetica" w:hAnsi="Helvetica" w:cs="Helvetica"/>
+                <w:sz w:val="22"/>
+                <w:szCs w:val="22"/>
+                <w:lang w:val="en-US"/>
+              </w:rPr>
+              <w:t xml:space="preserve">{{ </w:t>
+            </w:r>
+            <w:proofErr w:type="spellStart"/>
+            <w:r>
+              <w:rPr>
+                <w:rFonts w:ascii="Helvetica" w:hAnsi="Helvetica" w:cs="Helvetica"/>
+                <w:sz w:val="22"/>
+                <w:szCs w:val="22"/>
+                <w:lang w:val="en-US"/>
+              </w:rPr>
+              <w:t>estimates</w:t>
+            </w:r>
+            <w:proofErr w:type="gramEnd"/>
+            <w:r>
+              <w:rPr>
+                <w:rFonts w:ascii="Helvetica" w:hAnsi="Helvetica" w:cs="Helvetica"/>
+                <w:sz w:val="22"/>
+                <w:szCs w:val="22"/>
+                <w:lang w:val="en-US"/>
+              </w:rPr>
+              <w:t>.price_</w:t>
+            </w:r>
+            <w:r>
+              <w:rPr>
+                <w:rFonts w:ascii="Helvetica" w:hAnsi="Helvetica" w:cs="Helvetica"/>
+                <w:sz w:val="22"/>
+                <w:szCs w:val="22"/>
+                <w:lang w:val="en-US"/>
+              </w:rPr>
+              <w:t>rub</w:t>
+            </w:r>
+            <w:proofErr w:type="spellEnd"/>
+            <w:r>
+              <w:rPr>
+                <w:rFonts w:ascii="Helvetica" w:hAnsi="Helvetica" w:cs="Helvetica"/>
+                <w:sz w:val="22"/>
+                <w:szCs w:val="22"/>
+                <w:lang w:val="en-US"/>
+              </w:rPr>
+              <w:t xml:space="preserve"> }}</w:t>
+            </w:r>
           </w:p>
         </w:tc>
       </w:tr>
@@ -4258,11 +4825,15 @@
             <w:pPr>
               <w:rPr>
                 <w:rFonts w:ascii="Times New Roman" w:hAnsi="Times New Roman"/>
+                <w:sz w:val="22"/>
+                <w:szCs w:val="22"/>
               </w:rPr>
             </w:pPr>
             <w:r>
               <w:rPr>
                 <w:rFonts w:ascii="Times New Roman" w:hAnsi="Times New Roman"/>
+                <w:sz w:val="22"/>
+                <w:szCs w:val="22"/>
               </w:rPr>
               <w:t>-</w:t>
             </w:r>
@@ -4289,11 +4860,15 @@
             <w:pPr>
               <w:rPr>
                 <w:rFonts w:ascii="Times New Roman" w:hAnsi="Times New Roman"/>
+                <w:sz w:val="22"/>
+                <w:szCs w:val="22"/>
               </w:rPr>
             </w:pPr>
             <w:r>
               <w:rPr>
                 <w:rFonts w:ascii="Times New Roman" w:hAnsi="Times New Roman"/>
+                <w:sz w:val="22"/>
+                <w:szCs w:val="22"/>
               </w:rPr>
               <w:t>-</w:t>
             </w:r>
@@ -4322,8 +4897,50 @@
               <w:rPr>
                 <w:rFonts w:ascii="Roboto Black" w:hAnsi="Roboto Black" w:cs="Calibri"/>
                 <w:b/>
+                <w:sz w:val="22"/>
+                <w:szCs w:val="22"/>
               </w:rPr>
             </w:pPr>
+            <w:proofErr w:type="gramStart"/>
+            <w:r>
+              <w:rPr>
+                <w:rFonts w:ascii="Helvetica" w:hAnsi="Helvetica" w:cs="Helvetica"/>
+                <w:sz w:val="22"/>
+                <w:szCs w:val="22"/>
+                <w:lang w:val="en-US"/>
+              </w:rPr>
+              <w:t xml:space="preserve">{{ </w:t>
+            </w:r>
+            <w:proofErr w:type="spellStart"/>
+            <w:r>
+              <w:rPr>
+                <w:rFonts w:ascii="Helvetica" w:hAnsi="Helvetica" w:cs="Helvetica"/>
+                <w:sz w:val="22"/>
+                <w:szCs w:val="22"/>
+                <w:lang w:val="en-US"/>
+              </w:rPr>
+              <w:t>estimates</w:t>
+            </w:r>
+            <w:proofErr w:type="gramEnd"/>
+            <w:r>
+              <w:rPr>
+                <w:rFonts w:ascii="Helvetica" w:hAnsi="Helvetica" w:cs="Helvetica"/>
+                <w:sz w:val="22"/>
+                <w:szCs w:val="22"/>
+                <w:lang w:val="en-US"/>
+              </w:rPr>
+              <w:t>.bank_commission</w:t>
+            </w:r>
+            <w:proofErr w:type="spellEnd"/>
+            <w:r>
+              <w:rPr>
+                <w:rFonts w:ascii="Helvetica" w:hAnsi="Helvetica" w:cs="Helvetica"/>
+                <w:sz w:val="22"/>
+                <w:szCs w:val="22"/>
+                <w:lang w:val="en-US"/>
+              </w:rPr>
+              <w:t xml:space="preserve"> }}</w:t>
+            </w:r>
           </w:p>
         </w:tc>
       </w:tr>
@@ -4411,11 +5028,15 @@
             <w:pPr>
               <w:rPr>
                 <w:rFonts w:ascii="Times New Roman" w:hAnsi="Times New Roman"/>
+                <w:sz w:val="22"/>
+                <w:szCs w:val="22"/>
               </w:rPr>
             </w:pPr>
             <w:r>
               <w:rPr>
                 <w:rFonts w:ascii="Times New Roman" w:hAnsi="Times New Roman"/>
+                <w:sz w:val="22"/>
+                <w:szCs w:val="22"/>
               </w:rPr>
               <w:t>-</w:t>
             </w:r>
@@ -4442,11 +5063,15 @@
             <w:pPr>
               <w:rPr>
                 <w:rFonts w:ascii="Times New Roman" w:hAnsi="Times New Roman"/>
+                <w:sz w:val="22"/>
+                <w:szCs w:val="22"/>
               </w:rPr>
             </w:pPr>
             <w:r>
               <w:rPr>
                 <w:rFonts w:ascii="Times New Roman" w:hAnsi="Times New Roman"/>
+                <w:sz w:val="22"/>
+                <w:szCs w:val="22"/>
               </w:rPr>
               <w:t>-</w:t>
             </w:r>
@@ -4475,8 +5100,50 @@
               <w:rPr>
                 <w:rFonts w:ascii="Times New Roman" w:hAnsi="Times New Roman"/>
                 <w:b/>
+                <w:sz w:val="22"/>
+                <w:szCs w:val="22"/>
               </w:rPr>
             </w:pPr>
+            <w:proofErr w:type="gramStart"/>
+            <w:r>
+              <w:rPr>
+                <w:rFonts w:ascii="Helvetica" w:hAnsi="Helvetica" w:cs="Helvetica"/>
+                <w:sz w:val="22"/>
+                <w:szCs w:val="22"/>
+                <w:lang w:val="en-US"/>
+              </w:rPr>
+              <w:t xml:space="preserve">{{ </w:t>
+            </w:r>
+            <w:proofErr w:type="spellStart"/>
+            <w:r>
+              <w:rPr>
+                <w:rFonts w:ascii="Helvetica" w:hAnsi="Helvetica" w:cs="Helvetica"/>
+                <w:sz w:val="22"/>
+                <w:szCs w:val="22"/>
+                <w:lang w:val="en-US"/>
+              </w:rPr>
+              <w:t>estimates</w:t>
+            </w:r>
+            <w:proofErr w:type="gramEnd"/>
+            <w:r>
+              <w:rPr>
+                <w:rFonts w:ascii="Helvetica" w:hAnsi="Helvetica" w:cs="Helvetica"/>
+                <w:sz w:val="22"/>
+                <w:szCs w:val="22"/>
+                <w:lang w:val="en-US"/>
+              </w:rPr>
+              <w:t>.transit_declaration_price</w:t>
+            </w:r>
+            <w:proofErr w:type="spellEnd"/>
+            <w:r>
+              <w:rPr>
+                <w:rFonts w:ascii="Helvetica" w:hAnsi="Helvetica" w:cs="Helvetica"/>
+                <w:sz w:val="22"/>
+                <w:szCs w:val="22"/>
+                <w:lang w:val="en-US"/>
+              </w:rPr>
+              <w:t xml:space="preserve"> }}</w:t>
+            </w:r>
           </w:p>
         </w:tc>
       </w:tr>
@@ -4567,11 +5234,15 @@
             <w:pPr>
               <w:rPr>
                 <w:rFonts w:ascii="Times New Roman" w:hAnsi="Times New Roman"/>
+                <w:sz w:val="22"/>
+                <w:szCs w:val="22"/>
               </w:rPr>
             </w:pPr>
             <w:r>
               <w:rPr>
                 <w:rFonts w:ascii="Times New Roman" w:hAnsi="Times New Roman"/>
+                <w:sz w:val="22"/>
+                <w:szCs w:val="22"/>
               </w:rPr>
               <w:t>-</w:t>
             </w:r>
@@ -4598,11 +5269,15 @@
             <w:pPr>
               <w:rPr>
                 <w:rFonts w:ascii="Times New Roman" w:hAnsi="Times New Roman"/>
+                <w:sz w:val="22"/>
+                <w:szCs w:val="22"/>
               </w:rPr>
             </w:pPr>
             <w:r>
               <w:rPr>
                 <w:rFonts w:ascii="Times New Roman" w:hAnsi="Times New Roman"/>
+                <w:sz w:val="22"/>
+                <w:szCs w:val="22"/>
               </w:rPr>
               <w:t>-</w:t>
             </w:r>
@@ -4630,8 +5305,50 @@
               <w:jc w:val="center"/>
               <w:rPr>
                 <w:rFonts w:ascii="Times New Roman" w:hAnsi="Times New Roman"/>
+                <w:sz w:val="22"/>
+                <w:szCs w:val="22"/>
               </w:rPr>
             </w:pPr>
+            <w:proofErr w:type="gramStart"/>
+            <w:r>
+              <w:rPr>
+                <w:rFonts w:ascii="Helvetica" w:hAnsi="Helvetica" w:cs="Helvetica"/>
+                <w:sz w:val="22"/>
+                <w:szCs w:val="22"/>
+                <w:lang w:val="en-US"/>
+              </w:rPr>
+              <w:t xml:space="preserve">{{ </w:t>
+            </w:r>
+            <w:proofErr w:type="spellStart"/>
+            <w:r>
+              <w:rPr>
+                <w:rFonts w:ascii="Helvetica" w:hAnsi="Helvetica" w:cs="Helvetica"/>
+                <w:sz w:val="22"/>
+                <w:szCs w:val="22"/>
+                <w:lang w:val="en-US"/>
+              </w:rPr>
+              <w:t>estimates</w:t>
+            </w:r>
+            <w:proofErr w:type="gramEnd"/>
+            <w:r>
+              <w:rPr>
+                <w:rFonts w:ascii="Helvetica" w:hAnsi="Helvetica" w:cs="Helvetica"/>
+                <w:sz w:val="22"/>
+                <w:szCs w:val="22"/>
+                <w:lang w:val="en-US"/>
+              </w:rPr>
+              <w:t>.insurance_shipment</w:t>
+            </w:r>
+            <w:proofErr w:type="spellEnd"/>
+            <w:r>
+              <w:rPr>
+                <w:rFonts w:ascii="Helvetica" w:hAnsi="Helvetica" w:cs="Helvetica"/>
+                <w:sz w:val="22"/>
+                <w:szCs w:val="22"/>
+                <w:lang w:val="en-US"/>
+              </w:rPr>
+              <w:t xml:space="preserve"> }}</w:t>
+            </w:r>
           </w:p>
         </w:tc>
       </w:tr>
@@ -4688,13 +5405,100 @@
             <w:pPr>
               <w:rPr>
                 <w:rFonts w:ascii="Times New Roman" w:hAnsi="Times New Roman"/>
+                <w:lang w:val="en-US"/>
               </w:rPr>
             </w:pPr>
             <w:r>
               <w:rPr>
                 <w:rFonts w:ascii="Times New Roman" w:hAnsi="Times New Roman"/>
               </w:rPr>
-              <w:t>Таможенные платежи на</w:t>
+              <w:t>Таможенные</w:t>
+            </w:r>
+            <w:r>
+              <w:rPr>
+                <w:rFonts w:ascii="Times New Roman" w:hAnsi="Times New Roman"/>
+                <w:lang w:val="en-US"/>
+              </w:rPr>
+              <w:t xml:space="preserve"> </w:t>
+            </w:r>
+            <w:r>
+              <w:rPr>
+                <w:rFonts w:ascii="Times New Roman" w:hAnsi="Times New Roman"/>
+              </w:rPr>
+              <w:t>платежи</w:t>
+            </w:r>
+            <w:r>
+              <w:rPr>
+                <w:rFonts w:ascii="Times New Roman" w:hAnsi="Times New Roman"/>
+                <w:lang w:val="en-US"/>
+              </w:rPr>
+              <w:t xml:space="preserve"> </w:t>
+            </w:r>
+            <w:r>
+              <w:rPr>
+                <w:rFonts w:ascii="Times New Roman" w:hAnsi="Times New Roman"/>
+              </w:rPr>
+              <w:t>на</w:t>
+            </w:r>
+            <w:r>
+              <w:rPr>
+                <w:rFonts w:ascii="Times New Roman" w:hAnsi="Times New Roman"/>
+                <w:lang w:val="en-US"/>
+              </w:rPr>
+              <w:t xml:space="preserve"> </w:t>
+            </w:r>
+            <w:proofErr w:type="gramStart"/>
+            <w:r>
+              <w:rPr>
+                <w:rFonts w:ascii="Times New Roman" w:hAnsi="Times New Roman"/>
+                <w:lang w:val="en-US"/>
+              </w:rPr>
+              <w:t xml:space="preserve">{{ </w:t>
+            </w:r>
+            <w:proofErr w:type="spellStart"/>
+            <w:r>
+              <w:rPr>
+                <w:rFonts w:ascii="Times New Roman" w:hAnsi="Times New Roman"/>
+                <w:lang w:val="en-US"/>
+              </w:rPr>
+              <w:t>contract</w:t>
+            </w:r>
+            <w:proofErr w:type="gramEnd"/>
+            <w:r>
+              <w:rPr>
+                <w:rFonts w:ascii="Times New Roman" w:hAnsi="Times New Roman"/>
+                <w:lang w:val="en-US"/>
+              </w:rPr>
+              <w:t>.</w:t>
+            </w:r>
+            <w:r>
+              <w:rPr>
+                <w:rFonts w:ascii="Times New Roman" w:hAnsi="Times New Roman"/>
+                <w:lang w:val="en-US"/>
+              </w:rPr>
+              <w:t>current</w:t>
+            </w:r>
+            <w:r>
+              <w:rPr>
+                <w:rFonts w:ascii="Times New Roman" w:hAnsi="Times New Roman"/>
+                <w:lang w:val="en-US"/>
+              </w:rPr>
+              <w:t>_</w:t>
+            </w:r>
+            <w:r>
+              <w:rPr>
+                <w:rFonts w:ascii="Times New Roman" w:hAnsi="Times New Roman"/>
+                <w:lang w:val="en-US"/>
+              </w:rPr>
+              <w:t>date_numeric</w:t>
+            </w:r>
+            <w:proofErr w:type="spellEnd"/>
+            <w:r>
+              <w:rPr>
+                <w:rFonts w:ascii="Times New Roman" w:hAnsi="Times New Roman"/>
+                <w:lang w:val="en-US"/>
+              </w:rPr>
+              <w:t xml:space="preserve"> }}</w:t>
             </w:r>
           </w:p>
         </w:tc>
@@ -4716,7 +5520,17 @@
             <w:vAlign w:val="center"/>
           </w:tcPr>
           <w:p>
+            <w:pPr>
+              <w:rPr>
+                <w:sz w:val="22"/>
+                <w:szCs w:val="22"/>
+              </w:rPr>
+            </w:pPr>
             <w:r>
+              <w:rPr>
+                <w:sz w:val="22"/>
+                <w:szCs w:val="22"/>
+              </w:rPr>
               <w:t>-</w:t>
             </w:r>
           </w:p>
@@ -4739,7 +5553,17 @@
             <w:vAlign w:val="center"/>
           </w:tcPr>
           <w:p>
+            <w:pPr>
+              <w:rPr>
+                <w:sz w:val="22"/>
+                <w:szCs w:val="22"/>
+              </w:rPr>
+            </w:pPr>
             <w:r>
+              <w:rPr>
+                <w:sz w:val="22"/>
+                <w:szCs w:val="22"/>
+              </w:rPr>
               <w:t>-</w:t>
             </w:r>
           </w:p>
@@ -4766,8 +5590,50 @@
               <w:jc w:val="center"/>
               <w:rPr>
                 <w:rFonts w:ascii="Times New Roman" w:hAnsi="Times New Roman"/>
+                <w:sz w:val="22"/>
+                <w:szCs w:val="22"/>
               </w:rPr>
             </w:pPr>
+            <w:proofErr w:type="gramStart"/>
+            <w:r>
+              <w:rPr>
+                <w:rFonts w:ascii="Helvetica" w:hAnsi="Helvetica" w:cs="Helvetica"/>
+                <w:sz w:val="22"/>
+                <w:szCs w:val="22"/>
+                <w:lang w:val="en-US"/>
+              </w:rPr>
+              <w:t xml:space="preserve">{{ </w:t>
+            </w:r>
+            <w:proofErr w:type="spellStart"/>
+            <w:r>
+              <w:rPr>
+                <w:rFonts w:ascii="Helvetica" w:hAnsi="Helvetica" w:cs="Helvetica"/>
+                <w:sz w:val="22"/>
+                <w:szCs w:val="22"/>
+                <w:lang w:val="en-US"/>
+              </w:rPr>
+              <w:t>estimates</w:t>
+            </w:r>
+            <w:proofErr w:type="gramEnd"/>
+            <w:r>
+              <w:rPr>
+                <w:rFonts w:ascii="Helvetica" w:hAnsi="Helvetica" w:cs="Helvetica"/>
+                <w:sz w:val="22"/>
+                <w:szCs w:val="22"/>
+                <w:lang w:val="en-US"/>
+              </w:rPr>
+              <w:t>.customs_total</w:t>
+            </w:r>
+            <w:proofErr w:type="spellEnd"/>
+            <w:r>
+              <w:rPr>
+                <w:rFonts w:ascii="Helvetica" w:hAnsi="Helvetica" w:cs="Helvetica"/>
+                <w:sz w:val="22"/>
+                <w:szCs w:val="22"/>
+                <w:lang w:val="en-US"/>
+              </w:rPr>
+              <w:t xml:space="preserve"> }}</w:t>
+            </w:r>
           </w:p>
         </w:tc>
       </w:tr>
@@ -4855,11 +5721,15 @@
             <w:pPr>
               <w:rPr>
                 <w:rFonts w:ascii="Times New Roman" w:hAnsi="Times New Roman"/>
+                <w:sz w:val="22"/>
+                <w:szCs w:val="22"/>
               </w:rPr>
             </w:pPr>
             <w:r>
               <w:rPr>
                 <w:rFonts w:ascii="Times New Roman" w:hAnsi="Times New Roman"/>
+                <w:sz w:val="22"/>
+                <w:szCs w:val="22"/>
               </w:rPr>
               <w:t>-</w:t>
             </w:r>
@@ -4886,11 +5756,15 @@
             <w:pPr>
               <w:rPr>
                 <w:rFonts w:ascii="Times New Roman" w:hAnsi="Times New Roman"/>
+                <w:sz w:val="22"/>
+                <w:szCs w:val="22"/>
               </w:rPr>
             </w:pPr>
             <w:r>
               <w:rPr>
                 <w:rFonts w:ascii="Times New Roman" w:hAnsi="Times New Roman"/>
+                <w:sz w:val="22"/>
+                <w:szCs w:val="22"/>
               </w:rPr>
               <w:t>-</w:t>
             </w:r>
@@ -4918,8 +5792,50 @@
               <w:jc w:val="center"/>
               <w:rPr>
                 <w:rFonts w:ascii="Times New Roman" w:hAnsi="Times New Roman"/>
+                <w:sz w:val="22"/>
+                <w:szCs w:val="22"/>
               </w:rPr>
             </w:pPr>
+            <w:proofErr w:type="gramStart"/>
+            <w:r>
+              <w:rPr>
+                <w:rFonts w:ascii="Helvetica" w:hAnsi="Helvetica" w:cs="Helvetica"/>
+                <w:sz w:val="22"/>
+                <w:szCs w:val="22"/>
+                <w:lang w:val="en-US"/>
+              </w:rPr>
+              <w:t xml:space="preserve">{{ </w:t>
+            </w:r>
+            <w:proofErr w:type="spellStart"/>
+            <w:r>
+              <w:rPr>
+                <w:rFonts w:ascii="Helvetica" w:hAnsi="Helvetica" w:cs="Helvetica"/>
+                <w:sz w:val="22"/>
+                <w:szCs w:val="22"/>
+                <w:lang w:val="en-US"/>
+              </w:rPr>
+              <w:t>estimates</w:t>
+            </w:r>
+            <w:proofErr w:type="gramEnd"/>
+            <w:r>
+              <w:rPr>
+                <w:rFonts w:ascii="Helvetica" w:hAnsi="Helvetica" w:cs="Helvetica"/>
+                <w:sz w:val="22"/>
+                <w:szCs w:val="22"/>
+                <w:lang w:val="en-US"/>
+              </w:rPr>
+              <w:t>.custom_clearing</w:t>
+            </w:r>
+            <w:proofErr w:type="spellEnd"/>
+            <w:r>
+              <w:rPr>
+                <w:rFonts w:ascii="Helvetica" w:hAnsi="Helvetica" w:cs="Helvetica"/>
+                <w:sz w:val="22"/>
+                <w:szCs w:val="22"/>
+                <w:lang w:val="en-US"/>
+              </w:rPr>
+              <w:t xml:space="preserve"> }}</w:t>
+            </w:r>
           </w:p>
         </w:tc>
       </w:tr>
@@ -5010,11 +5926,15 @@
             <w:pPr>
               <w:rPr>
                 <w:rFonts w:ascii="Times New Roman" w:hAnsi="Times New Roman"/>
+                <w:sz w:val="22"/>
+                <w:szCs w:val="22"/>
               </w:rPr>
             </w:pPr>
             <w:r>
               <w:rPr>
                 <w:rFonts w:ascii="Times New Roman" w:hAnsi="Times New Roman"/>
+                <w:sz w:val="22"/>
+                <w:szCs w:val="22"/>
               </w:rPr>
               <w:t>-</w:t>
             </w:r>
@@ -5041,11 +5961,15 @@
             <w:pPr>
               <w:rPr>
                 <w:rFonts w:ascii="Times New Roman" w:hAnsi="Times New Roman"/>
+                <w:sz w:val="22"/>
+                <w:szCs w:val="22"/>
               </w:rPr>
             </w:pPr>
             <w:r>
               <w:rPr>
                 <w:rFonts w:ascii="Times New Roman" w:hAnsi="Times New Roman"/>
+                <w:sz w:val="22"/>
+                <w:szCs w:val="22"/>
               </w:rPr>
               <w:t>-</w:t>
             </w:r>
@@ -5073,8 +5997,50 @@
               <w:jc w:val="center"/>
               <w:rPr>
                 <w:rFonts w:ascii="Times New Roman" w:hAnsi="Times New Roman"/>
+                <w:sz w:val="22"/>
+                <w:szCs w:val="22"/>
               </w:rPr>
             </w:pPr>
+            <w:proofErr w:type="gramStart"/>
+            <w:r>
+              <w:rPr>
+                <w:rFonts w:ascii="Helvetica" w:hAnsi="Helvetica" w:cs="Helvetica"/>
+                <w:sz w:val="22"/>
+                <w:szCs w:val="22"/>
+                <w:lang w:val="en-US"/>
+              </w:rPr>
+              <w:t xml:space="preserve">{{ </w:t>
+            </w:r>
+            <w:proofErr w:type="spellStart"/>
+            <w:r>
+              <w:rPr>
+                <w:rFonts w:ascii="Helvetica" w:hAnsi="Helvetica" w:cs="Helvetica"/>
+                <w:sz w:val="22"/>
+                <w:szCs w:val="22"/>
+                <w:lang w:val="en-US"/>
+              </w:rPr>
+              <w:t>estimates</w:t>
+            </w:r>
+            <w:proofErr w:type="gramEnd"/>
+            <w:r>
+              <w:rPr>
+                <w:rFonts w:ascii="Helvetica" w:hAnsi="Helvetica" w:cs="Helvetica"/>
+                <w:sz w:val="22"/>
+                <w:szCs w:val="22"/>
+                <w:lang w:val="en-US"/>
+              </w:rPr>
+              <w:t>.contractor_comission</w:t>
+            </w:r>
+            <w:proofErr w:type="spellEnd"/>
+            <w:r>
+              <w:rPr>
+                <w:rFonts w:ascii="Helvetica" w:hAnsi="Helvetica" w:cs="Helvetica"/>
+                <w:sz w:val="22"/>
+                <w:szCs w:val="22"/>
+                <w:lang w:val="en-US"/>
+              </w:rPr>
+              <w:t xml:space="preserve"> }}</w:t>
+            </w:r>
           </w:p>
         </w:tc>
       </w:tr>
@@ -5155,6 +6121,7 @@
         <w:rPr>
           <w:rFonts w:ascii="Times New Roman" w:hAnsi="Times New Roman"/>
         </w:rPr>
+        <w:lastRenderedPageBreak/>
         <w:t>Смета может быть скорректирована при изменении курсов или таможенных тарифов.</w:t>
       </w:r>
     </w:p>
@@ -5504,6 +6471,7 @@
         <w:rPr>
           <w:rFonts w:ascii="Times New Roman" w:hAnsi="Times New Roman"/>
         </w:rPr>
+        <w:lastRenderedPageBreak/>
         <w:t>На всех этапах Заказчику оказываются консультационные услуги со стороны Исполнителя.</w:t>
       </w:r>
     </w:p>
@@ -5574,7 +6542,6 @@
           <w:rFonts w:ascii="Times New Roman" w:hAnsi="Times New Roman"/>
           <w:b/>
         </w:rPr>
-        <w:lastRenderedPageBreak/>
         <w:t>Приложение №4</w:t>
       </w:r>
     </w:p>
@@ -5583,6 +6550,8 @@
         <w:rPr>
           <w:rFonts w:ascii="Times New Roman" w:hAnsi="Times New Roman"/>
           <w:bCs/>
+          <w:sz w:val="22"/>
+          <w:szCs w:val="22"/>
         </w:rPr>
       </w:pPr>
       <w:r>
@@ -5599,6 +6568,7 @@
         <w:rPr>
           <w:rFonts w:ascii="Times New Roman" w:hAnsi="Times New Roman"/>
           <w:sz w:val="22"/>
+          <w:szCs w:val="22"/>
         </w:rPr>
         <w:t>Настоящим я</w:t>
       </w:r>
@@ -5607,6 +6577,7 @@
         <w:rPr>
           <w:rFonts w:ascii="Times New Roman" w:hAnsi="Times New Roman"/>
           <w:sz w:val="22"/>
+          <w:szCs w:val="22"/>
         </w:rPr>
         <w:t xml:space="preserve">, </w:t>
       </w:r>
@@ -5614,6 +6585,8 @@
         <w:rPr>
           <w:rFonts w:ascii="Times New Roman" w:hAnsi="Times New Roman"/>
           <w:b/>
+          <w:sz w:val="22"/>
+          <w:szCs w:val="22"/>
         </w:rPr>
         <w:t>:</w:t>
       </w:r>
@@ -5622,150 +6595,169 @@
         <w:rPr>
           <w:rFonts w:ascii="Times New Roman" w:hAnsi="Times New Roman"/>
           <w:b/>
+          <w:sz w:val="22"/>
+          <w:szCs w:val="22"/>
         </w:rPr>
         <w:t xml:space="preserve"> </w:t>
       </w:r>
       <w:r>
         <w:rPr>
-          <w:rFonts w:ascii="Times-Roman" w:hAnsi="Times-Roman" w:cs="Times-Roman"/>
-          <w:color w:val="auto"/>
-          <w:szCs w:val="24"/>
+          <w:rFonts w:ascii="Times New Roman" w:hAnsi="Times New Roman"/>
+          <w:color w:val="auto"/>
+          <w:sz w:val="22"/>
+          <w:szCs w:val="22"/>
         </w:rPr>
         <w:t>{{</w:t>
       </w:r>
       <w:r>
         <w:rPr>
-          <w:rFonts w:ascii="Times-Roman" w:hAnsi="Times-Roman" w:cs="Times-Roman"/>
-          <w:color w:val="auto"/>
-          <w:szCs w:val="24"/>
+          <w:rFonts w:ascii="Times New Roman" w:hAnsi="Times New Roman"/>
+          <w:color w:val="auto"/>
+          <w:sz w:val="22"/>
+          <w:szCs w:val="22"/>
           <w:lang w:val="en-US"/>
         </w:rPr>
         <w:t>customer</w:t>
       </w:r>
       <w:r>
         <w:rPr>
-          <w:rFonts w:ascii="Times-Roman" w:hAnsi="Times-Roman" w:cs="Times-Roman"/>
-          <w:color w:val="auto"/>
-          <w:szCs w:val="24"/>
+          <w:rFonts w:ascii="Times New Roman" w:hAnsi="Times New Roman"/>
+          <w:color w:val="auto"/>
+          <w:sz w:val="22"/>
+          <w:szCs w:val="22"/>
         </w:rPr>
         <w:t>.</w:t>
       </w:r>
       <w:r>
         <w:rPr>
-          <w:rFonts w:ascii="Times-Roman" w:hAnsi="Times-Roman" w:cs="Times-Roman"/>
-          <w:color w:val="auto"/>
-          <w:szCs w:val="24"/>
+          <w:rFonts w:ascii="Times New Roman" w:hAnsi="Times New Roman"/>
+          <w:color w:val="auto"/>
+          <w:sz w:val="22"/>
+          <w:szCs w:val="22"/>
           <w:lang w:val="en-US"/>
         </w:rPr>
         <w:t>last</w:t>
       </w:r>
       <w:r>
         <w:rPr>
-          <w:rFonts w:ascii="Times-Roman" w:hAnsi="Times-Roman" w:cs="Times-Roman"/>
-          <w:color w:val="auto"/>
-          <w:szCs w:val="24"/>
+          <w:rFonts w:ascii="Times New Roman" w:hAnsi="Times New Roman"/>
+          <w:color w:val="auto"/>
+          <w:sz w:val="22"/>
+          <w:szCs w:val="22"/>
         </w:rPr>
         <w:t>_</w:t>
       </w:r>
       <w:r>
         <w:rPr>
-          <w:rFonts w:ascii="Times-Roman" w:hAnsi="Times-Roman" w:cs="Times-Roman"/>
-          <w:color w:val="auto"/>
-          <w:szCs w:val="24"/>
+          <w:rFonts w:ascii="Times New Roman" w:hAnsi="Times New Roman"/>
+          <w:color w:val="auto"/>
+          <w:sz w:val="22"/>
+          <w:szCs w:val="22"/>
           <w:lang w:val="en-US"/>
         </w:rPr>
         <w:t>name</w:t>
       </w:r>
       <w:r>
         <w:rPr>
-          <w:rFonts w:ascii="Times-Roman" w:hAnsi="Times-Roman" w:cs="Times-Roman"/>
-          <w:color w:val="auto"/>
-          <w:szCs w:val="24"/>
+          <w:rFonts w:ascii="Times New Roman" w:hAnsi="Times New Roman"/>
+          <w:color w:val="auto"/>
+          <w:sz w:val="22"/>
+          <w:szCs w:val="22"/>
         </w:rPr>
         <w:t>}} {{</w:t>
       </w:r>
       <w:r>
         <w:rPr>
-          <w:rFonts w:ascii="Times-Roman" w:hAnsi="Times-Roman" w:cs="Times-Roman"/>
-          <w:color w:val="auto"/>
-          <w:szCs w:val="24"/>
+          <w:rFonts w:ascii="Times New Roman" w:hAnsi="Times New Roman"/>
+          <w:color w:val="auto"/>
+          <w:sz w:val="22"/>
+          <w:szCs w:val="22"/>
           <w:lang w:val="en-US"/>
         </w:rPr>
         <w:t>customer</w:t>
       </w:r>
       <w:r>
         <w:rPr>
-          <w:rFonts w:ascii="Times-Roman" w:hAnsi="Times-Roman" w:cs="Times-Roman"/>
-          <w:color w:val="auto"/>
-          <w:szCs w:val="24"/>
+          <w:rFonts w:ascii="Times New Roman" w:hAnsi="Times New Roman"/>
+          <w:color w:val="auto"/>
+          <w:sz w:val="22"/>
+          <w:szCs w:val="22"/>
         </w:rPr>
         <w:t>.</w:t>
       </w:r>
       <w:r>
         <w:rPr>
-          <w:rFonts w:ascii="Times-Roman" w:hAnsi="Times-Roman" w:cs="Times-Roman"/>
-          <w:color w:val="auto"/>
-          <w:szCs w:val="24"/>
+          <w:rFonts w:ascii="Times New Roman" w:hAnsi="Times New Roman"/>
+          <w:color w:val="auto"/>
+          <w:sz w:val="22"/>
+          <w:szCs w:val="22"/>
           <w:lang w:val="en-US"/>
         </w:rPr>
         <w:t>first</w:t>
       </w:r>
       <w:r>
         <w:rPr>
-          <w:rFonts w:ascii="Times-Roman" w:hAnsi="Times-Roman" w:cs="Times-Roman"/>
-          <w:color w:val="auto"/>
-          <w:szCs w:val="24"/>
+          <w:rFonts w:ascii="Times New Roman" w:hAnsi="Times New Roman"/>
+          <w:color w:val="auto"/>
+          <w:sz w:val="22"/>
+          <w:szCs w:val="22"/>
         </w:rPr>
         <w:t>_</w:t>
       </w:r>
       <w:r>
         <w:rPr>
-          <w:rFonts w:ascii="Times-Roman" w:hAnsi="Times-Roman" w:cs="Times-Roman"/>
-          <w:color w:val="auto"/>
-          <w:szCs w:val="24"/>
+          <w:rFonts w:ascii="Times New Roman" w:hAnsi="Times New Roman"/>
+          <w:color w:val="auto"/>
+          <w:sz w:val="22"/>
+          <w:szCs w:val="22"/>
           <w:lang w:val="en-US"/>
         </w:rPr>
         <w:t>name</w:t>
       </w:r>
       <w:r>
         <w:rPr>
-          <w:rFonts w:ascii="Times-Roman" w:hAnsi="Times-Roman" w:cs="Times-Roman"/>
-          <w:color w:val="auto"/>
-          <w:szCs w:val="24"/>
+          <w:rFonts w:ascii="Times New Roman" w:hAnsi="Times New Roman"/>
+          <w:color w:val="auto"/>
+          <w:sz w:val="22"/>
+          <w:szCs w:val="22"/>
         </w:rPr>
         <w:t>}} {{</w:t>
       </w:r>
       <w:r>
         <w:rPr>
-          <w:rFonts w:ascii="Times-Roman" w:hAnsi="Times-Roman" w:cs="Times-Roman"/>
-          <w:color w:val="auto"/>
-          <w:szCs w:val="24"/>
+          <w:rFonts w:ascii="Times New Roman" w:hAnsi="Times New Roman"/>
+          <w:color w:val="auto"/>
+          <w:sz w:val="22"/>
+          <w:szCs w:val="22"/>
           <w:lang w:val="en-US"/>
         </w:rPr>
         <w:t>customer</w:t>
       </w:r>
       <w:r>
         <w:rPr>
-          <w:rFonts w:ascii="Times-Roman" w:hAnsi="Times-Roman" w:cs="Times-Roman"/>
-          <w:color w:val="auto"/>
-          <w:szCs w:val="24"/>
+          <w:rFonts w:ascii="Times New Roman" w:hAnsi="Times New Roman"/>
+          <w:color w:val="auto"/>
+          <w:sz w:val="22"/>
+          <w:szCs w:val="22"/>
         </w:rPr>
         <w:t>.</w:t>
       </w:r>
       <w:r>
         <w:rPr>
-          <w:rFonts w:ascii="Times-Roman" w:hAnsi="Times-Roman" w:cs="Times-Roman"/>
-          <w:color w:val="auto"/>
-          <w:szCs w:val="24"/>
+          <w:rFonts w:ascii="Times New Roman" w:hAnsi="Times New Roman"/>
+          <w:color w:val="auto"/>
+          <w:sz w:val="22"/>
+          <w:szCs w:val="22"/>
           <w:lang w:val="en-US"/>
         </w:rPr>
         <w:t>surname</w:t>
       </w:r>
       <w:r>
         <w:rPr>
-          <w:rFonts w:ascii="Times-Roman" w:hAnsi="Times-Roman" w:cs="Times-Roman"/>
-          <w:color w:val="auto"/>
-          <w:szCs w:val="24"/>
+          <w:rFonts w:ascii="Times New Roman" w:hAnsi="Times New Roman"/>
+          <w:color w:val="auto"/>
+          <w:sz w:val="22"/>
+          <w:szCs w:val="22"/>
         </w:rPr>
         <w:t>}}</w:t>
       </w:r>
@@ -5774,51 +6766,53 @@
       <w:pPr>
         <w:rPr>
           <w:rFonts w:ascii="Times New Roman" w:hAnsi="Times New Roman"/>
-        </w:rPr>
-      </w:pPr>
-      <w:r>
-        <w:rPr>
-          <w:rFonts w:ascii="Times New Roman" w:hAnsi="Times New Roman"/>
-        </w:rPr>
-        <w:t>Паспорт</w:t>
-      </w:r>
-      <w:r>
-        <w:rPr>
-          <w:rFonts w:ascii="Times New Roman" w:hAnsi="Times New Roman"/>
-        </w:rPr>
-        <w:t xml:space="preserve">: </w:t>
-      </w:r>
-      <w:r>
-        <w:rPr>
-          <w:rFonts w:ascii="Times-Roman" w:hAnsi="Times-Roman" w:cs="Times-Roman"/>
-          <w:color w:val="auto"/>
-          <w:szCs w:val="24"/>
+          <w:sz w:val="22"/>
+          <w:szCs w:val="22"/>
+        </w:rPr>
+      </w:pPr>
+      <w:r>
+        <w:rPr>
+          <w:rFonts w:ascii="Times New Roman" w:hAnsi="Times New Roman"/>
+          <w:sz w:val="22"/>
+          <w:szCs w:val="22"/>
+        </w:rPr>
+        <w:t xml:space="preserve">Паспорт: </w:t>
+      </w:r>
+      <w:r>
+        <w:rPr>
+          <w:rFonts w:ascii="Times New Roman" w:hAnsi="Times New Roman"/>
+          <w:color w:val="auto"/>
+          <w:sz w:val="22"/>
+          <w:szCs w:val="22"/>
         </w:rPr>
         <w:t>{{</w:t>
       </w:r>
       <w:proofErr w:type="gramStart"/>
       <w:r>
         <w:rPr>
-          <w:rFonts w:ascii="Times-Roman" w:hAnsi="Times-Roman" w:cs="Times-Roman"/>
-          <w:color w:val="auto"/>
-          <w:szCs w:val="24"/>
+          <w:rFonts w:ascii="Times New Roman" w:hAnsi="Times New Roman"/>
+          <w:color w:val="auto"/>
+          <w:sz w:val="22"/>
+          <w:szCs w:val="22"/>
           <w:lang w:val="en-US"/>
         </w:rPr>
         <w:t>customer</w:t>
       </w:r>
       <w:r>
         <w:rPr>
-          <w:rFonts w:ascii="Times-Roman" w:hAnsi="Times-Roman" w:cs="Times-Roman"/>
-          <w:color w:val="auto"/>
-          <w:szCs w:val="24"/>
+          <w:rFonts w:ascii="Times New Roman" w:hAnsi="Times New Roman"/>
+          <w:color w:val="auto"/>
+          <w:sz w:val="22"/>
+          <w:szCs w:val="22"/>
         </w:rPr>
         <w:t>.</w:t>
       </w:r>
       <w:r>
         <w:rPr>
-          <w:rFonts w:ascii="Times-Roman" w:hAnsi="Times-Roman" w:cs="Times-Roman"/>
-          <w:color w:val="auto"/>
-          <w:szCs w:val="24"/>
+          <w:rFonts w:ascii="Times New Roman" w:hAnsi="Times New Roman"/>
+          <w:color w:val="auto"/>
+          <w:sz w:val="22"/>
+          <w:szCs w:val="22"/>
           <w:lang w:val="en-US"/>
         </w:rPr>
         <w:t>passport</w:t>
@@ -5826,362 +6820,351 @@
       <w:proofErr w:type="gramEnd"/>
       <w:r>
         <w:rPr>
-          <w:rFonts w:ascii="Times-Roman" w:hAnsi="Times-Roman" w:cs="Times-Roman"/>
-          <w:color w:val="auto"/>
-          <w:szCs w:val="24"/>
+          <w:rFonts w:ascii="Times New Roman" w:hAnsi="Times New Roman"/>
+          <w:color w:val="auto"/>
+          <w:sz w:val="22"/>
+          <w:szCs w:val="22"/>
         </w:rPr>
         <w:t>}},</w:t>
       </w:r>
       <w:r>
         <w:rPr>
           <w:rFonts w:ascii="Times New Roman" w:hAnsi="Times New Roman"/>
+          <w:sz w:val="22"/>
+          <w:szCs w:val="22"/>
+        </w:rPr>
+        <w:t xml:space="preserve"> выдан </w:t>
+      </w:r>
+      <w:r>
+        <w:rPr>
+          <w:rFonts w:ascii="Times New Roman" w:hAnsi="Times New Roman"/>
+          <w:color w:val="auto"/>
+          <w:sz w:val="22"/>
+          <w:szCs w:val="22"/>
+        </w:rPr>
+        <w:t>{{</w:t>
+      </w:r>
+      <w:r>
+        <w:rPr>
+          <w:rFonts w:ascii="Times New Roman" w:hAnsi="Times New Roman"/>
+          <w:color w:val="auto"/>
+          <w:sz w:val="22"/>
+          <w:szCs w:val="22"/>
+          <w:lang w:val="en-US"/>
+        </w:rPr>
+        <w:t>customer</w:t>
+      </w:r>
+      <w:r>
+        <w:rPr>
+          <w:rFonts w:ascii="Times New Roman" w:hAnsi="Times New Roman"/>
+          <w:color w:val="auto"/>
+          <w:sz w:val="22"/>
+          <w:szCs w:val="22"/>
+        </w:rPr>
+        <w:t>.</w:t>
+      </w:r>
+      <w:r>
+        <w:rPr>
+          <w:rFonts w:ascii="Times New Roman" w:hAnsi="Times New Roman"/>
+          <w:color w:val="auto"/>
+          <w:sz w:val="22"/>
+          <w:szCs w:val="22"/>
+          <w:lang w:val="en-US"/>
+        </w:rPr>
+        <w:t>date</w:t>
+      </w:r>
+      <w:r>
+        <w:rPr>
+          <w:rFonts w:ascii="Times New Roman" w:hAnsi="Times New Roman"/>
+          <w:color w:val="auto"/>
+          <w:sz w:val="22"/>
+          <w:szCs w:val="22"/>
+        </w:rPr>
+        <w:t>_</w:t>
+      </w:r>
+      <w:r>
+        <w:rPr>
+          <w:rFonts w:ascii="Times New Roman" w:hAnsi="Times New Roman"/>
+          <w:color w:val="auto"/>
+          <w:sz w:val="22"/>
+          <w:szCs w:val="22"/>
+          <w:lang w:val="en-US"/>
+        </w:rPr>
+        <w:t>issue</w:t>
+      </w:r>
+      <w:r>
+        <w:rPr>
+          <w:rFonts w:ascii="Times New Roman" w:hAnsi="Times New Roman"/>
+          <w:color w:val="auto"/>
+          <w:sz w:val="22"/>
+          <w:szCs w:val="22"/>
+        </w:rPr>
+        <w:t>}}</w:t>
+      </w:r>
+      <w:r>
+        <w:rPr>
+          <w:rFonts w:ascii="Times New Roman" w:hAnsi="Times New Roman"/>
+          <w:sz w:val="22"/>
+          <w:szCs w:val="22"/>
         </w:rPr>
         <w:t xml:space="preserve"> </w:t>
       </w:r>
       <w:r>
         <w:rPr>
           <w:rFonts w:ascii="Times New Roman" w:hAnsi="Times New Roman"/>
-        </w:rPr>
-        <w:t>выдан</w:t>
-      </w:r>
-      <w:r>
-        <w:rPr>
-          <w:rFonts w:ascii="Times New Roman" w:hAnsi="Times New Roman"/>
-        </w:rPr>
-        <w:t xml:space="preserve"> </w:t>
-      </w:r>
-      <w:r>
-        <w:rPr>
-          <w:rFonts w:ascii="Times-Roman" w:hAnsi="Times-Roman" w:cs="Times-Roman"/>
-          <w:color w:val="auto"/>
-          <w:szCs w:val="24"/>
+          <w:color w:val="auto"/>
+          <w:sz w:val="22"/>
+          <w:szCs w:val="22"/>
         </w:rPr>
         <w:t>{{</w:t>
       </w:r>
       <w:r>
         <w:rPr>
-          <w:rFonts w:ascii="Times-Roman" w:hAnsi="Times-Roman" w:cs="Times-Roman"/>
-          <w:color w:val="auto"/>
-          <w:szCs w:val="24"/>
+          <w:rFonts w:ascii="Times New Roman" w:hAnsi="Times New Roman"/>
+          <w:color w:val="auto"/>
+          <w:sz w:val="22"/>
+          <w:szCs w:val="22"/>
           <w:lang w:val="en-US"/>
         </w:rPr>
         <w:t>customer</w:t>
       </w:r>
       <w:r>
         <w:rPr>
-          <w:rFonts w:ascii="Times-Roman" w:hAnsi="Times-Roman" w:cs="Times-Roman"/>
-          <w:color w:val="auto"/>
-          <w:szCs w:val="24"/>
+          <w:rFonts w:ascii="Times New Roman" w:hAnsi="Times New Roman"/>
+          <w:color w:val="auto"/>
+          <w:sz w:val="22"/>
+          <w:szCs w:val="22"/>
         </w:rPr>
         <w:t>.</w:t>
       </w:r>
       <w:r>
         <w:rPr>
-          <w:rFonts w:ascii="Times-Roman" w:hAnsi="Times-Roman" w:cs="Times-Roman"/>
-          <w:color w:val="auto"/>
-          <w:szCs w:val="24"/>
-          <w:lang w:val="en-US"/>
-        </w:rPr>
-        <w:t>date</w:t>
-      </w:r>
-      <w:r>
-        <w:rPr>
-          <w:rFonts w:ascii="Times-Roman" w:hAnsi="Times-Roman" w:cs="Times-Roman"/>
-          <w:color w:val="auto"/>
-          <w:szCs w:val="24"/>
+          <w:rFonts w:ascii="Times New Roman" w:hAnsi="Times New Roman"/>
+          <w:color w:val="auto"/>
+          <w:sz w:val="22"/>
+          <w:szCs w:val="22"/>
+          <w:lang w:val="en-US"/>
+        </w:rPr>
+        <w:t>by</w:t>
+      </w:r>
+      <w:r>
+        <w:rPr>
+          <w:rFonts w:ascii="Times New Roman" w:hAnsi="Times New Roman"/>
+          <w:color w:val="auto"/>
+          <w:sz w:val="22"/>
+          <w:szCs w:val="22"/>
         </w:rPr>
         <w:t>_</w:t>
       </w:r>
       <w:r>
         <w:rPr>
-          <w:rFonts w:ascii="Times-Roman" w:hAnsi="Times-Roman" w:cs="Times-Roman"/>
-          <w:color w:val="auto"/>
-          <w:szCs w:val="24"/>
-          <w:lang w:val="en-US"/>
-        </w:rPr>
-        <w:t>issue</w:t>
-      </w:r>
-      <w:r>
-        <w:rPr>
-          <w:rFonts w:ascii="Times-Roman" w:hAnsi="Times-Roman" w:cs="Times-Roman"/>
-          <w:color w:val="auto"/>
-          <w:szCs w:val="24"/>
+          <w:rFonts w:ascii="Times New Roman" w:hAnsi="Times New Roman"/>
+          <w:color w:val="auto"/>
+          <w:sz w:val="22"/>
+          <w:szCs w:val="22"/>
+          <w:lang w:val="en-US"/>
+        </w:rPr>
+        <w:t>whom</w:t>
+      </w:r>
+      <w:r>
+        <w:rPr>
+          <w:rFonts w:ascii="Times New Roman" w:hAnsi="Times New Roman"/>
+          <w:color w:val="auto"/>
+          <w:sz w:val="22"/>
+          <w:szCs w:val="22"/>
+        </w:rPr>
+        <w:t>_</w:t>
+      </w:r>
+      <w:r>
+        <w:rPr>
+          <w:rFonts w:ascii="Times New Roman" w:hAnsi="Times New Roman"/>
+          <w:color w:val="auto"/>
+          <w:sz w:val="22"/>
+          <w:szCs w:val="22"/>
+          <w:lang w:val="en-US"/>
+        </w:rPr>
+        <w:t>issued</w:t>
+      </w:r>
+      <w:r>
+        <w:rPr>
+          <w:rFonts w:ascii="Times New Roman" w:hAnsi="Times New Roman"/>
+          <w:color w:val="auto"/>
+          <w:sz w:val="22"/>
+          <w:szCs w:val="22"/>
+        </w:rPr>
+        <w:t>}},</w:t>
+      </w:r>
+      <w:r>
+        <w:rPr>
+          <w:rFonts w:ascii="Times New Roman" w:hAnsi="Times New Roman"/>
+          <w:sz w:val="22"/>
+          <w:szCs w:val="22"/>
+        </w:rPr>
+        <w:t xml:space="preserve"> код подразделения </w:t>
+      </w:r>
+      <w:r>
+        <w:rPr>
+          <w:rFonts w:ascii="Times New Roman" w:hAnsi="Times New Roman"/>
+          <w:color w:val="auto"/>
+          <w:sz w:val="22"/>
+          <w:szCs w:val="22"/>
+        </w:rPr>
+        <w:t>{{</w:t>
+      </w:r>
+      <w:r>
+        <w:rPr>
+          <w:rFonts w:ascii="Times New Roman" w:hAnsi="Times New Roman"/>
+          <w:color w:val="auto"/>
+          <w:sz w:val="22"/>
+          <w:szCs w:val="22"/>
+          <w:lang w:val="en-US"/>
+        </w:rPr>
+        <w:t>customer</w:t>
+      </w:r>
+      <w:r>
+        <w:rPr>
+          <w:rFonts w:ascii="Times New Roman" w:hAnsi="Times New Roman"/>
+          <w:color w:val="auto"/>
+          <w:sz w:val="22"/>
+          <w:szCs w:val="22"/>
+        </w:rPr>
+        <w:t>.</w:t>
+      </w:r>
+      <w:r>
+        <w:rPr>
+          <w:rFonts w:ascii="Times New Roman" w:hAnsi="Times New Roman"/>
+          <w:color w:val="auto"/>
+          <w:sz w:val="22"/>
+          <w:szCs w:val="22"/>
+          <w:lang w:val="en-US"/>
+        </w:rPr>
+        <w:t>department</w:t>
+      </w:r>
+      <w:r>
+        <w:rPr>
+          <w:rFonts w:ascii="Times New Roman" w:hAnsi="Times New Roman"/>
+          <w:color w:val="auto"/>
+          <w:sz w:val="22"/>
+          <w:szCs w:val="22"/>
+        </w:rPr>
+        <w:t>_</w:t>
+      </w:r>
+      <w:r>
+        <w:rPr>
+          <w:rFonts w:ascii="Times New Roman" w:hAnsi="Times New Roman"/>
+          <w:color w:val="auto"/>
+          <w:sz w:val="22"/>
+          <w:szCs w:val="22"/>
+          <w:lang w:val="en-US"/>
+        </w:rPr>
+        <w:t>code</w:t>
+      </w:r>
+      <w:r>
+        <w:rPr>
+          <w:rFonts w:ascii="Times New Roman" w:hAnsi="Times New Roman"/>
+          <w:color w:val="auto"/>
+          <w:sz w:val="22"/>
+          <w:szCs w:val="22"/>
         </w:rPr>
         <w:t>}}</w:t>
       </w:r>
       <w:r>
         <w:rPr>
           <w:rFonts w:ascii="Times New Roman" w:hAnsi="Times New Roman"/>
-        </w:rPr>
-        <w:t xml:space="preserve"> </w:t>
-      </w:r>
-      <w:r>
-        <w:rPr>
-          <w:rFonts w:ascii="Times-Roman" w:hAnsi="Times-Roman" w:cs="Times-Roman"/>
-          <w:color w:val="auto"/>
-          <w:szCs w:val="24"/>
+          <w:sz w:val="22"/>
+          <w:szCs w:val="22"/>
+        </w:rPr>
+        <w:t xml:space="preserve">: Адрес </w:t>
+      </w:r>
+      <w:r>
+        <w:rPr>
+          <w:rFonts w:ascii="Times New Roman" w:hAnsi="Times New Roman"/>
+          <w:color w:val="000000" w:themeColor="text1"/>
+          <w:sz w:val="22"/>
+          <w:szCs w:val="22"/>
+        </w:rPr>
+        <w:t xml:space="preserve">регистрации: </w:t>
+      </w:r>
+      <w:r>
+        <w:rPr>
+          <w:rFonts w:ascii="Times New Roman" w:hAnsi="Times New Roman"/>
+          <w:color w:val="auto"/>
+          <w:sz w:val="22"/>
+          <w:szCs w:val="22"/>
         </w:rPr>
         <w:t>{{</w:t>
       </w:r>
       <w:r>
         <w:rPr>
-          <w:rFonts w:ascii="Times-Roman" w:hAnsi="Times-Roman" w:cs="Times-Roman"/>
-          <w:color w:val="auto"/>
-          <w:szCs w:val="24"/>
+          <w:rFonts w:ascii="Times New Roman" w:hAnsi="Times New Roman"/>
+          <w:color w:val="auto"/>
+          <w:sz w:val="22"/>
+          <w:szCs w:val="22"/>
           <w:lang w:val="en-US"/>
         </w:rPr>
         <w:t>customer</w:t>
       </w:r>
       <w:r>
         <w:rPr>
-          <w:rFonts w:ascii="Times-Roman" w:hAnsi="Times-Roman" w:cs="Times-Roman"/>
-          <w:color w:val="auto"/>
-          <w:szCs w:val="24"/>
+          <w:rFonts w:ascii="Times New Roman" w:hAnsi="Times New Roman"/>
+          <w:color w:val="auto"/>
+          <w:sz w:val="22"/>
+          <w:szCs w:val="22"/>
         </w:rPr>
         <w:t>.</w:t>
       </w:r>
       <w:r>
         <w:rPr>
-          <w:rFonts w:ascii="Times-Roman" w:hAnsi="Times-Roman" w:cs="Times-Roman"/>
-          <w:color w:val="auto"/>
-          <w:szCs w:val="24"/>
-          <w:lang w:val="en-US"/>
-        </w:rPr>
-        <w:t>by</w:t>
-      </w:r>
-      <w:r>
-        <w:rPr>
-          <w:rFonts w:ascii="Times-Roman" w:hAnsi="Times-Roman" w:cs="Times-Roman"/>
-          <w:color w:val="auto"/>
-          <w:szCs w:val="24"/>
+          <w:rFonts w:ascii="Times New Roman" w:hAnsi="Times New Roman"/>
+          <w:color w:val="auto"/>
+          <w:sz w:val="22"/>
+          <w:szCs w:val="22"/>
+          <w:lang w:val="en-US"/>
+        </w:rPr>
+        <w:t>registration</w:t>
+      </w:r>
+      <w:r>
+        <w:rPr>
+          <w:rFonts w:ascii="Times New Roman" w:hAnsi="Times New Roman"/>
+          <w:color w:val="auto"/>
+          <w:sz w:val="22"/>
+          <w:szCs w:val="22"/>
         </w:rPr>
         <w:t>_</w:t>
       </w:r>
       <w:r>
         <w:rPr>
-          <w:rFonts w:ascii="Times-Roman" w:hAnsi="Times-Roman" w:cs="Times-Roman"/>
-          <w:color w:val="auto"/>
-          <w:szCs w:val="24"/>
-          <w:lang w:val="en-US"/>
-        </w:rPr>
-        <w:t>whom</w:t>
-      </w:r>
-      <w:r>
-        <w:rPr>
-          <w:rFonts w:ascii="Times-Roman" w:hAnsi="Times-Roman" w:cs="Times-Roman"/>
-          <w:color w:val="auto"/>
-          <w:szCs w:val="24"/>
-        </w:rPr>
-        <w:t>_</w:t>
-      </w:r>
-      <w:r>
-        <w:rPr>
-          <w:rFonts w:ascii="Times-Roman" w:hAnsi="Times-Roman" w:cs="Times-Roman"/>
-          <w:color w:val="auto"/>
-          <w:szCs w:val="24"/>
-          <w:lang w:val="en-US"/>
-        </w:rPr>
-        <w:t>issued</w:t>
-      </w:r>
-      <w:r>
-        <w:rPr>
-          <w:rFonts w:ascii="Times-Roman" w:hAnsi="Times-Roman" w:cs="Times-Roman"/>
-          <w:color w:val="auto"/>
-          <w:szCs w:val="24"/>
-        </w:rPr>
-        <w:t>}},</w:t>
-      </w:r>
-      <w:r>
-        <w:rPr>
-          <w:rFonts w:ascii="Times New Roman" w:hAnsi="Times New Roman"/>
-        </w:rPr>
-        <w:t xml:space="preserve"> </w:t>
-      </w:r>
-      <w:r>
-        <w:rPr>
-          <w:rFonts w:ascii="Times New Roman" w:hAnsi="Times New Roman"/>
-        </w:rPr>
-        <w:t>код</w:t>
-      </w:r>
-      <w:r>
-        <w:rPr>
-          <w:rFonts w:ascii="Times New Roman" w:hAnsi="Times New Roman"/>
-        </w:rPr>
-        <w:t xml:space="preserve"> </w:t>
-      </w:r>
-      <w:r>
-        <w:rPr>
-          <w:rFonts w:ascii="Times New Roman" w:hAnsi="Times New Roman"/>
-        </w:rPr>
-        <w:t>подразделения</w:t>
-      </w:r>
-      <w:r>
-        <w:rPr>
-          <w:rFonts w:ascii="Times New Roman" w:hAnsi="Times New Roman"/>
-        </w:rPr>
-        <w:t xml:space="preserve"> </w:t>
-      </w:r>
-      <w:r>
-        <w:rPr>
-          <w:rFonts w:ascii="Times-Roman" w:hAnsi="Times-Roman" w:cs="Times-Roman"/>
-          <w:color w:val="auto"/>
-          <w:szCs w:val="24"/>
-        </w:rPr>
-        <w:t>{{</w:t>
-      </w:r>
-      <w:r>
-        <w:rPr>
-          <w:rFonts w:ascii="Times-Roman" w:hAnsi="Times-Roman" w:cs="Times-Roman"/>
-          <w:color w:val="auto"/>
-          <w:szCs w:val="24"/>
-          <w:lang w:val="en-US"/>
-        </w:rPr>
-        <w:t>customer</w:t>
-      </w:r>
-      <w:r>
-        <w:rPr>
-          <w:rFonts w:ascii="Times-Roman" w:hAnsi="Times-Roman" w:cs="Times-Roman"/>
-          <w:color w:val="auto"/>
-          <w:szCs w:val="24"/>
-        </w:rPr>
-        <w:t>.</w:t>
-      </w:r>
-      <w:r>
-        <w:rPr>
-          <w:rFonts w:ascii="Times-Roman" w:hAnsi="Times-Roman" w:cs="Times-Roman"/>
-          <w:color w:val="auto"/>
-          <w:szCs w:val="24"/>
-          <w:lang w:val="en-US"/>
-        </w:rPr>
-        <w:t>department</w:t>
-      </w:r>
-      <w:r>
-        <w:rPr>
-          <w:rFonts w:ascii="Times-Roman" w:hAnsi="Times-Roman" w:cs="Times-Roman"/>
-          <w:color w:val="auto"/>
-          <w:szCs w:val="24"/>
-        </w:rPr>
-        <w:t>_</w:t>
-      </w:r>
-      <w:r>
-        <w:rPr>
-          <w:rFonts w:ascii="Times-Roman" w:hAnsi="Times-Roman" w:cs="Times-Roman"/>
-          <w:color w:val="auto"/>
-          <w:szCs w:val="24"/>
-          <w:lang w:val="en-US"/>
-        </w:rPr>
-        <w:t>code</w:t>
-      </w:r>
-      <w:r>
-        <w:rPr>
-          <w:rFonts w:ascii="Times-Roman" w:hAnsi="Times-Roman" w:cs="Times-Roman"/>
-          <w:color w:val="auto"/>
-          <w:szCs w:val="24"/>
+          <w:rFonts w:ascii="Times New Roman" w:hAnsi="Times New Roman"/>
+          <w:color w:val="auto"/>
+          <w:sz w:val="22"/>
+          <w:szCs w:val="22"/>
+          <w:lang w:val="en-US"/>
+        </w:rPr>
+        <w:t>address</w:t>
+      </w:r>
+      <w:r>
+        <w:rPr>
+          <w:rFonts w:ascii="Times New Roman" w:hAnsi="Times New Roman"/>
+          <w:color w:val="auto"/>
+          <w:sz w:val="22"/>
+          <w:szCs w:val="22"/>
         </w:rPr>
         <w:t>}}</w:t>
       </w:r>
-      <w:r>
-        <w:rPr>
-          <w:rFonts w:ascii="Times New Roman" w:hAnsi="Times New Roman"/>
-        </w:rPr>
-        <w:t xml:space="preserve">: </w:t>
-      </w:r>
-      <w:r>
-        <w:rPr>
-          <w:rFonts w:ascii="Times New Roman" w:hAnsi="Times New Roman"/>
-        </w:rPr>
-        <w:t>Адрес</w:t>
-      </w:r>
-      <w:r>
-        <w:rPr>
-          <w:rFonts w:ascii="Times New Roman" w:hAnsi="Times New Roman"/>
-        </w:rPr>
-        <w:t xml:space="preserve"> </w:t>
-      </w:r>
-      <w:r>
-        <w:rPr>
-          <w:rFonts w:ascii="Times New Roman" w:hAnsi="Times New Roman"/>
-          <w:color w:val="000000" w:themeColor="text1"/>
-        </w:rPr>
-        <w:t>регистрации</w:t>
-      </w:r>
-      <w:r>
-        <w:rPr>
-          <w:rFonts w:ascii="Times New Roman" w:hAnsi="Times New Roman"/>
-          <w:color w:val="000000" w:themeColor="text1"/>
-        </w:rPr>
-        <w:t xml:space="preserve">: </w:t>
-      </w:r>
-      <w:r>
-        <w:rPr>
-          <w:rFonts w:ascii="Times-Roman" w:hAnsi="Times-Roman" w:cs="Times-Roman"/>
-          <w:color w:val="auto"/>
-          <w:szCs w:val="24"/>
-        </w:rPr>
-        <w:t>{{</w:t>
-      </w:r>
-      <w:r>
-        <w:rPr>
-          <w:rFonts w:ascii="Times-Roman" w:hAnsi="Times-Roman" w:cs="Times-Roman"/>
-          <w:color w:val="auto"/>
-          <w:szCs w:val="24"/>
-          <w:lang w:val="en-US"/>
-        </w:rPr>
-        <w:t>customer</w:t>
-      </w:r>
-      <w:r>
-        <w:rPr>
-          <w:rFonts w:ascii="Times-Roman" w:hAnsi="Times-Roman" w:cs="Times-Roman"/>
-          <w:color w:val="auto"/>
-          <w:szCs w:val="24"/>
-        </w:rPr>
-        <w:t>.</w:t>
-      </w:r>
-      <w:r>
-        <w:rPr>
-          <w:rFonts w:ascii="Times-Roman" w:hAnsi="Times-Roman" w:cs="Times-Roman"/>
-          <w:color w:val="auto"/>
-          <w:szCs w:val="24"/>
-          <w:lang w:val="en-US"/>
-        </w:rPr>
-        <w:t>registration</w:t>
-      </w:r>
-      <w:r>
-        <w:rPr>
-          <w:rFonts w:ascii="Times-Roman" w:hAnsi="Times-Roman" w:cs="Times-Roman"/>
-          <w:color w:val="auto"/>
-          <w:szCs w:val="24"/>
-        </w:rPr>
-        <w:t>_</w:t>
-      </w:r>
-      <w:r>
-        <w:rPr>
-          <w:rFonts w:ascii="Times-Roman" w:hAnsi="Times-Roman" w:cs="Times-Roman"/>
-          <w:color w:val="auto"/>
-          <w:szCs w:val="24"/>
-          <w:lang w:val="en-US"/>
-        </w:rPr>
-        <w:t>address</w:t>
-      </w:r>
-      <w:r>
-        <w:rPr>
-          <w:rFonts w:ascii="Times-Roman" w:hAnsi="Times-Roman" w:cs="Times-Roman"/>
-          <w:color w:val="auto"/>
-          <w:szCs w:val="24"/>
-        </w:rPr>
-        <w:t>}}</w:t>
-      </w:r>
-    </w:p>
-    <w:p>
-      <w:pPr>
-        <w:rPr>
-          <w:rFonts w:ascii="Times New Roman" w:hAnsi="Times New Roman"/>
-        </w:rPr>
-      </w:pPr>
-      <w:r>
-        <w:rPr>
-          <w:rFonts w:ascii="Times New Roman" w:hAnsi="Times New Roman"/>
-          <w:sz w:val="22"/>
+    </w:p>
+    <w:p>
+      <w:pPr>
+        <w:rPr>
+          <w:rFonts w:ascii="Times New Roman" w:hAnsi="Times New Roman"/>
+          <w:sz w:val="22"/>
+          <w:szCs w:val="22"/>
+        </w:rPr>
+      </w:pPr>
+      <w:r>
+        <w:rPr>
+          <w:rFonts w:ascii="Times New Roman" w:hAnsi="Times New Roman"/>
+          <w:sz w:val="22"/>
+          <w:szCs w:val="22"/>
         </w:rPr>
         <w:t xml:space="preserve">в соответствии со статьей 9 Федерального закона от 27.07.2006 № 152-ФЗ «О персональных данных», представляю Исполнителю </w:t>
       </w:r>
@@ -6192,12 +7175,14 @@
         <w:rPr>
           <w:rFonts w:ascii="Times New Roman" w:hAnsi="Times New Roman"/>
           <w:sz w:val="22"/>
-        </w:rPr>
-      </w:pPr>
-      <w:r>
-        <w:rPr>
-          <w:rFonts w:ascii="Times New Roman" w:hAnsi="Times New Roman"/>
-          <w:sz w:val="22"/>
+          <w:szCs w:val="22"/>
+        </w:rPr>
+      </w:pPr>
+      <w:r>
+        <w:rPr>
+          <w:rFonts w:ascii="Times New Roman" w:hAnsi="Times New Roman"/>
+          <w:sz w:val="22"/>
+          <w:szCs w:val="22"/>
         </w:rPr>
         <w:t>Я выражаю свое согласие на осуществление Исполнителем автоматизированной, а также без использования средств автоматизации обработки персональных данных, включая сбор, запись, систематизацию, накопление, хранение, уточнение (обновление, изменение), извлечение, использование, блокирование, удаление, уничтожение персональных данных.</w:t>
       </w:r>
@@ -6699,6 +7684,7 @@
           <w:rFonts w:ascii="Times New Roman" w:hAnsi="Times New Roman"/>
           <w:sz w:val="22"/>
         </w:rPr>
+        <w:lastRenderedPageBreak/>
         <w:t>следующих действий: обработку (включая сбор, систематизацию, накопление, хранение, уточнение,</w:t>
       </w:r>
     </w:p>
@@ -8600,7 +9586,6 @@
   <w:style w:type="character" w:default="1" w:styleId="DefaultParagraphFont">
     <w:name w:val="Default Paragraph Font"/>
     <w:uiPriority w:val="1"/>
-    <w:semiHidden/>
     <w:unhideWhenUsed/>
   </w:style>
   <w:style w:type="table" w:default="1" w:styleId="TableNormal">

</xml_diff>